<commit_message>
Expand lab 8 report
</commit_message>
<xml_diff>
--- a/docs/LR_8_key_value_report.docx
+++ b/docs/LR_8_key_value_report.docx
@@ -9,7 +9,7 @@
       <w:r>
         <w:drawing>
           <wp:inline xmlns:a="http://schemas.openxmlformats.org/drawingml/2006/main" xmlns:pic="http://schemas.openxmlformats.org/drawingml/2006/picture">
-            <wp:extent cx="2520000" cy="1149783"/>
+            <wp:extent cx="3060000" cy="884000"/>
             <wp:docPr id="1" name="Picture 1"/>
             <wp:cNvGraphicFramePr>
               <a:graphicFrameLocks noChangeAspect="1"/>
@@ -30,7 +30,7 @@
                   <pic:spPr>
                     <a:xfrm>
                       <a:off x="0" y="0"/>
-                      <a:ext cx="2520000" cy="1149783"/>
+                      <a:ext cx="3060000" cy="884000"/>
                     </a:xfrm>
                     <a:prstGeom prst="rect"/>
                   </pic:spPr>
@@ -43,6 +43,7 @@
     </w:p>
     <w:p>
       <w:pPr>
+        <w:spacing w:after="80"/>
         <w:jc w:val="center"/>
       </w:pPr>
       <w:r>
@@ -56,6 +57,7 @@
     </w:p>
     <w:p>
       <w:pPr>
+        <w:spacing w:after="80"/>
         <w:jc w:val="center"/>
       </w:pPr>
       <w:r>
@@ -69,6 +71,7 @@
     </w:p>
     <w:p>
       <w:pPr>
+        <w:spacing w:after="80"/>
         <w:jc w:val="center"/>
       </w:pPr>
       <w:r>
@@ -82,6 +85,7 @@
     </w:p>
     <w:p>
       <w:pPr>
+        <w:spacing w:after="80"/>
         <w:jc w:val="center"/>
       </w:pPr>
       <w:r>
@@ -96,32 +100,35 @@
     <w:p/>
     <w:p>
       <w:pPr>
+        <w:spacing w:after="80"/>
         <w:jc w:val="center"/>
       </w:pPr>
       <w:r>
         <w:rPr>
           <w:rFonts w:ascii="Times New Roman" w:hAnsi="Times New Roman"/>
           <w:b/>
-          <w:sz w:val="24"/>
+          <w:sz w:val="28"/>
         </w:rPr>
         <w:t>ОТЧЕТ</w:t>
       </w:r>
     </w:p>
     <w:p>
       <w:pPr>
+        <w:spacing w:after="80"/>
         <w:jc w:val="center"/>
       </w:pPr>
       <w:r>
         <w:rPr>
           <w:rFonts w:ascii="Times New Roman" w:hAnsi="Times New Roman"/>
           <w:b/>
-          <w:sz w:val="24"/>
+          <w:sz w:val="28"/>
         </w:rPr>
         <w:t>о выполнении лабораторной работы №8</w:t>
       </w:r>
     </w:p>
     <w:p>
       <w:pPr>
+        <w:spacing w:after="80"/>
         <w:jc w:val="center"/>
       </w:pPr>
       <w:r>
@@ -135,6 +142,7 @@
     </w:p>
     <w:p>
       <w:pPr>
+        <w:spacing w:after="80"/>
         <w:jc w:val="center"/>
       </w:pPr>
       <w:r>
@@ -149,6 +157,7 @@
     <w:p/>
     <w:p>
       <w:pPr>
+        <w:spacing w:after="80"/>
         <w:jc w:val="right"/>
       </w:pPr>
       <w:r>
@@ -162,6 +171,7 @@
     </w:p>
     <w:p>
       <w:pPr>
+        <w:spacing w:after="80"/>
         <w:jc w:val="right"/>
       </w:pPr>
       <w:r>
@@ -176,6 +186,7 @@
     <w:p/>
     <w:p>
       <w:pPr>
+        <w:spacing w:after="80"/>
         <w:jc w:val="center"/>
       </w:pPr>
       <w:r>
@@ -199,160 +210,862 @@
       <w:r>
         <w:rPr>
           <w:rFonts w:ascii="Times New Roman" w:hAnsi="Times New Roman"/>
+          <w:b/>
+          <w:sz w:val="28"/>
         </w:rPr>
-        <w:t>1. Цель и постановка задачи</w:t>
+        <w:t>Содержание выполненной работы</w:t>
       </w:r>
     </w:p>
     <w:p>
+      <w:pPr>
+        <w:pStyle w:val="ListBullet"/>
+        <w:spacing w:after="60"/>
+      </w:pPr>
       <w:r>
         <w:rPr>
           <w:rFonts w:ascii="Times New Roman" w:hAnsi="Times New Roman"/>
           <w:b w:val="0"/>
           <w:sz w:val="24"/>
         </w:rPr>
-        <w:t>Цель лабораторной работы — изучить принципы работы key-value хранилищ и реализовать небольшое веб-приложение на Flask, в котором данные хранятся в словаре data, автоматически загружаются из файла data.json при старте и сохраняются обратно в файл после каждой операции изменения.</w:t>
+        <w:t>поставлена задача и определены требования лабораторной работы;</w:t>
       </w:r>
     </w:p>
     <w:p>
+      <w:pPr>
+        <w:pStyle w:val="ListBullet"/>
+        <w:spacing w:after="60"/>
+      </w:pPr>
       <w:r>
         <w:rPr>
           <w:rFonts w:ascii="Times New Roman" w:hAnsi="Times New Roman"/>
           <w:b w:val="0"/>
           <w:sz w:val="24"/>
         </w:rPr>
-        <w:t>По заданию необходимо реализовать следующие функции:</w:t>
+        <w:t>разработано Flask-приложение с key-value хранилищем;</w:t>
       </w:r>
     </w:p>
     <w:p>
       <w:pPr>
         <w:pStyle w:val="ListBullet"/>
-      </w:pPr>
-      <w:r>
-        <w:rPr>
-          <w:rFonts w:ascii="Times New Roman" w:hAnsi="Times New Roman"/>
-          <w:sz w:val="24"/>
-        </w:rPr>
-        <w:t>POST /set — сохранение пары ключ-значение.</w:t>
-      </w:r>
-    </w:p>
-    <w:p>
-      <w:pPr>
-        <w:pStyle w:val="ListBullet"/>
-      </w:pPr>
-      <w:r>
-        <w:rPr>
-          <w:rFonts w:ascii="Times New Roman" w:hAnsi="Times New Roman"/>
-          <w:sz w:val="24"/>
-        </w:rPr>
-        <w:t>GET /get/&lt;key&gt; — получение значения по ключу.</w:t>
-      </w:r>
-    </w:p>
-    <w:p>
-      <w:pPr>
-        <w:pStyle w:val="ListBullet"/>
-      </w:pPr>
-      <w:r>
-        <w:rPr>
-          <w:rFonts w:ascii="Times New Roman" w:hAnsi="Times New Roman"/>
-          <w:sz w:val="24"/>
-        </w:rPr>
-        <w:t>DELETE /delete/&lt;key&gt; — удаление ключа.</w:t>
-      </w:r>
-    </w:p>
-    <w:p>
-      <w:pPr>
-        <w:pStyle w:val="ListBullet"/>
-      </w:pPr>
-      <w:r>
-        <w:rPr>
-          <w:rFonts w:ascii="Times New Roman" w:hAnsi="Times New Roman"/>
-          <w:sz w:val="24"/>
-        </w:rPr>
-        <w:t>GET /exists/&lt;key&gt; — проверка наличия ключа.</w:t>
-      </w:r>
-    </w:p>
-    <w:p>
-      <w:pPr>
-        <w:pStyle w:val="ListBullet"/>
-      </w:pPr>
-      <w:r>
-        <w:rPr>
-          <w:rFonts w:ascii="Times New Roman" w:hAnsi="Times New Roman"/>
-          <w:sz w:val="24"/>
-        </w:rPr>
-        <w:t>Ограничение частоты запросов через Flask-Limiter: общий лимит 100 запросов в сутки и отдельный лимит 10 запросов в минуту для /set и /delete.</w:t>
-      </w:r>
-    </w:p>
-    <w:p>
-      <w:pPr>
-        <w:pStyle w:val="Heading1"/>
-      </w:pPr>
-      <w:r>
-        <w:rPr>
-          <w:rFonts w:ascii="Times New Roman" w:hAnsi="Times New Roman"/>
-        </w:rPr>
-        <w:t>2. Теоретическая часть</w:t>
-      </w:r>
-    </w:p>
-    <w:p>
+        <w:spacing w:after="60"/>
+      </w:pPr>
       <w:r>
         <w:rPr>
           <w:rFonts w:ascii="Times New Roman" w:hAnsi="Times New Roman"/>
           <w:b w:val="0"/>
           <w:sz w:val="24"/>
         </w:rPr>
-        <w:t>Key-value хранилище — это способ организации данных, при котором каждая запись состоит из ключа и соответствующего ему значения. Ключ используется как уникальный идентификатор, по которому значение можно быстро сохранить, найти, проверить или удалить. В рамках лабораторной работы роль такого хранилища выполняет словарь Python data.</w:t>
+        <w:t>реализована автоматическая загрузка данных из data.json при старте;</w:t>
       </w:r>
     </w:p>
     <w:p>
+      <w:pPr>
+        <w:pStyle w:val="ListBullet"/>
+        <w:spacing w:after="60"/>
+      </w:pPr>
       <w:r>
         <w:rPr>
           <w:rFonts w:ascii="Times New Roman" w:hAnsi="Times New Roman"/>
           <w:b w:val="0"/>
           <w:sz w:val="24"/>
         </w:rPr>
-        <w:t>Flask выбран как легкий веб-фреймворк для создания HTTP API. В документации Flask маршрут связывается с функцией через декоратор route, а разные HTTP-методы используются для разных действий: GET — чтение, POST — создание/изменение, DELETE — удаление [1].</w:t>
+        <w:t>реализовано сохранение состояния после каждой изменяющей операции;</w:t>
       </w:r>
     </w:p>
     <w:p>
+      <w:pPr>
+        <w:pStyle w:val="ListBullet"/>
+        <w:spacing w:after="60"/>
+      </w:pPr>
       <w:r>
         <w:rPr>
           <w:rFonts w:ascii="Times New Roman" w:hAnsi="Times New Roman"/>
           <w:b w:val="0"/>
           <w:sz w:val="24"/>
         </w:rPr>
-        <w:t>Для постоянного хранения данных используется формат JSON. Модуль json стандартной библиотеки Python позволяет сериализовать объекты в строку или файл и десериализовать JSON обратно в объекты Python через json.dump/json.dumps и json.load/json.loads [3].</w:t>
+        <w:t>создано API для добавления, получения, удаления и проверки ключей;</w:t>
       </w:r>
     </w:p>
     <w:p>
+      <w:pPr>
+        <w:pStyle w:val="ListBullet"/>
+        <w:spacing w:after="60"/>
+      </w:pPr>
       <w:r>
         <w:rPr>
           <w:rFonts w:ascii="Times New Roman" w:hAnsi="Times New Roman"/>
           <w:b w:val="0"/>
           <w:sz w:val="24"/>
         </w:rPr>
-        <w:t>Flask-Limiter нужен для защиты API от слишком частых запросов. Расширение позволяет задавать общие лимиты для всего приложения и отдельные лимиты для маршрутов через декоратор limiter.limit. В работе это используется для ограничения изменяющих операций /set и /delete [2].</w:t>
+        <w:t>настроены ограничения запросов через Flask-Limiter;</w:t>
       </w:r>
     </w:p>
     <w:p>
+      <w:pPr>
+        <w:pStyle w:val="ListBullet"/>
+        <w:spacing w:after="60"/>
+      </w:pPr>
       <w:r>
         <w:rPr>
           <w:rFonts w:ascii="Times New Roman" w:hAnsi="Times New Roman"/>
           <w:b w:val="0"/>
           <w:sz w:val="24"/>
         </w:rPr>
-        <w:t>Библиотека requests используется в демонстрационном клиенте client_demo.py. Она позволяет отправлять HTTP-запросы к приложению из Python-кода и получать JSON-ответы сервера [4].</w:t>
+        <w:t>создана демонстрационная HTML-страница для наглядной проверки;</w:t>
       </w:r>
     </w:p>
     <w:p>
       <w:pPr>
-        <w:pStyle w:val="Heading1"/>
+        <w:pStyle w:val="ListBullet"/>
+        <w:spacing w:after="60"/>
       </w:pPr>
       <w:r>
         <w:rPr>
           <w:rFonts w:ascii="Times New Roman" w:hAnsi="Times New Roman"/>
+          <w:b w:val="0"/>
+          <w:sz w:val="24"/>
         </w:rPr>
-        <w:t>3. Структура проекта</w:t>
+        <w:t>создан отдельный клиент client_demo.py на библиотеке requests;</w:t>
+      </w:r>
+    </w:p>
+    <w:p>
+      <w:pPr>
+        <w:pStyle w:val="ListBullet"/>
+        <w:spacing w:after="60"/>
+      </w:pPr>
+      <w:r>
+        <w:rPr>
+          <w:rFonts w:ascii="Times New Roman" w:hAnsi="Times New Roman"/>
+          <w:b w:val="0"/>
+          <w:sz w:val="24"/>
+        </w:rPr>
+        <w:t>подготовлены скриншоты, описание работы и список источников.</w:t>
+      </w:r>
+    </w:p>
+    <w:p>
+      <w:pPr>
+        <w:pStyle w:val="Heading1"/>
+      </w:pPr>
+      <w:r>
+        <w:rPr>
+          <w:rFonts w:ascii="Times New Roman" w:hAnsi="Times New Roman"/>
+          <w:b/>
+          <w:sz w:val="28"/>
+        </w:rPr>
+        <w:t>1. Цель и постановка задачи</w:t>
+      </w:r>
+    </w:p>
+    <w:p>
+      <w:pPr>
+        <w:spacing w:after="80"/>
+        <w:ind w:firstLine="425"/>
+      </w:pPr>
+      <w:r>
+        <w:rPr>
+          <w:rFonts w:ascii="Times New Roman" w:hAnsi="Times New Roman"/>
+          <w:b w:val="0"/>
+          <w:sz w:val="24"/>
+        </w:rPr>
+        <w:t>Цель лабораторной работы — изучить принципы работы key-value хранилищ и закрепить навыки разработки простого API на Flask. В качестве результата требуется не просто написать отдельные функции, а собрать небольшое приложение, которое можно запустить, проверить через браузер, проверить через HTTP-клиент и передать преподавателю вместе с отчетом.</w:t>
+      </w:r>
+    </w:p>
+    <w:p>
+      <w:pPr>
+        <w:spacing w:after="80"/>
+        <w:ind w:firstLine="425"/>
+      </w:pPr>
+      <w:r>
+        <w:rPr>
+          <w:rFonts w:ascii="Times New Roman" w:hAnsi="Times New Roman"/>
+          <w:b w:val="0"/>
+          <w:sz w:val="24"/>
+        </w:rPr>
+        <w:t>В лабораторной работе реализовано key-value хранилище, где данные находятся в оперативной памяти в словаре Python data, а постоянное состояние хранится в файле data.json. Такой подход хорошо подходит для учебной задачи: он наглядно показывает связь между памятью приложения, файлом хранения и HTTP-запросами пользователя.</w:t>
+      </w:r>
+    </w:p>
+    <w:p>
+      <w:pPr>
+        <w:spacing w:after="80"/>
+        <w:ind w:firstLine="425"/>
+      </w:pPr>
+      <w:r>
+        <w:rPr>
+          <w:rFonts w:ascii="Times New Roman" w:hAnsi="Times New Roman"/>
+          <w:b w:val="0"/>
+          <w:sz w:val="24"/>
+        </w:rPr>
+        <w:t>Требования задания были интерпретированы следующим образом:</w:t>
+      </w:r>
+    </w:p>
+    <w:p>
+      <w:pPr>
+        <w:pStyle w:val="ListBullet"/>
+        <w:spacing w:after="60"/>
+      </w:pPr>
+      <w:r>
+        <w:rPr>
+          <w:rFonts w:ascii="Times New Roman" w:hAnsi="Times New Roman"/>
+          <w:b w:val="0"/>
+          <w:sz w:val="24"/>
+        </w:rPr>
+        <w:t>хранилище должно быть представлено словарем data;</w:t>
+      </w:r>
+    </w:p>
+    <w:p>
+      <w:pPr>
+        <w:pStyle w:val="ListBullet"/>
+        <w:spacing w:after="60"/>
+      </w:pPr>
+      <w:r>
+        <w:rPr>
+          <w:rFonts w:ascii="Times New Roman" w:hAnsi="Times New Roman"/>
+          <w:b w:val="0"/>
+          <w:sz w:val="24"/>
+        </w:rPr>
+        <w:t>при запуске приложения файл data.json автоматически читается и превращается в словарь;</w:t>
+      </w:r>
+    </w:p>
+    <w:p>
+      <w:pPr>
+        <w:pStyle w:val="ListBullet"/>
+        <w:spacing w:after="60"/>
+      </w:pPr>
+      <w:r>
+        <w:rPr>
+          <w:rFonts w:ascii="Times New Roman" w:hAnsi="Times New Roman"/>
+          <w:b w:val="0"/>
+          <w:sz w:val="24"/>
+        </w:rPr>
+        <w:t>если пользователь добавляет или удаляет ключ, файл data.json сразу обновляется;</w:t>
+      </w:r>
+    </w:p>
+    <w:p>
+      <w:pPr>
+        <w:pStyle w:val="ListBullet"/>
+        <w:spacing w:after="60"/>
+      </w:pPr>
+      <w:r>
+        <w:rPr>
+          <w:rFonts w:ascii="Times New Roman" w:hAnsi="Times New Roman"/>
+          <w:b w:val="0"/>
+          <w:sz w:val="24"/>
+        </w:rPr>
+        <w:t>API должно возвращать понятные JSON-ответы, а не только HTML-страницы;</w:t>
+      </w:r>
+    </w:p>
+    <w:p>
+      <w:pPr>
+        <w:pStyle w:val="ListBullet"/>
+        <w:spacing w:after="60"/>
+      </w:pPr>
+      <w:r>
+        <w:rPr>
+          <w:rFonts w:ascii="Times New Roman" w:hAnsi="Times New Roman"/>
+          <w:b w:val="0"/>
+          <w:sz w:val="24"/>
+        </w:rPr>
+        <w:t>ошибки должны возвращаться в едином формате, чтобы их удобно было читать в Postman или curl;</w:t>
+      </w:r>
+    </w:p>
+    <w:p>
+      <w:pPr>
+        <w:pStyle w:val="ListBullet"/>
+        <w:spacing w:after="60"/>
+      </w:pPr>
+      <w:r>
+        <w:rPr>
+          <w:rFonts w:ascii="Times New Roman" w:hAnsi="Times New Roman"/>
+          <w:b w:val="0"/>
+          <w:sz w:val="24"/>
+        </w:rPr>
+        <w:t>ограничение запросов должно защищать приложение от слишком частых операций изменения;</w:t>
+      </w:r>
+    </w:p>
+    <w:p>
+      <w:pPr>
+        <w:pStyle w:val="ListBullet"/>
+        <w:spacing w:after="60"/>
+      </w:pPr>
+      <w:r>
+        <w:rPr>
+          <w:rFonts w:ascii="Times New Roman" w:hAnsi="Times New Roman"/>
+          <w:b w:val="0"/>
+          <w:sz w:val="24"/>
+        </w:rPr>
+        <w:t>должна быть возможность продемонстрировать работу без написания дополнительных команд вручную.</w:t>
+      </w:r>
+    </w:p>
+    <w:p>
+      <w:pPr>
+        <w:pStyle w:val="Heading1"/>
+      </w:pPr>
+      <w:r>
+        <w:rPr>
+          <w:rFonts w:ascii="Times New Roman" w:hAnsi="Times New Roman"/>
+          <w:b/>
+          <w:sz w:val="28"/>
+        </w:rPr>
+        <w:t>2. Теоретическая часть</w:t>
+      </w:r>
+    </w:p>
+    <w:p>
+      <w:pPr>
+        <w:spacing w:after="80"/>
+        <w:ind w:firstLine="425"/>
+      </w:pPr>
+      <w:r>
+        <w:rPr>
+          <w:rFonts w:ascii="Times New Roman" w:hAnsi="Times New Roman"/>
+          <w:b w:val="0"/>
+          <w:sz w:val="24"/>
+        </w:rPr>
+        <w:t>Key-value хранилище — это модель хранения данных, в которой каждая запись представлена парой «ключ — значение». Ключ играет роль уникального идентификатора, а значение содержит полезные данные. В отличие от реляционной базы данных, где данные обычно распределены по таблицам, key-value подход делает акцент на простом и быстром доступе к объекту по его имени.</w:t>
+      </w:r>
+    </w:p>
+    <w:p>
+      <w:pPr>
+        <w:spacing w:after="80"/>
+        <w:ind w:firstLine="425"/>
+      </w:pPr>
+      <w:r>
+        <w:rPr>
+          <w:rFonts w:ascii="Times New Roman" w:hAnsi="Times New Roman"/>
+          <w:b w:val="0"/>
+          <w:sz w:val="24"/>
+        </w:rPr>
+        <w:t>В данной лабораторной работе ключом является строка, например student, course или storage_type. Значением может быть строка, число, список или объект JSON. Так как итоговое состояние сохраняется в data.json, значение дополнительно проверяется на JSON-сериализуемость. Это означает, что приложение не позволит сохранить объект, который невозможно записать в JSON-файл.</w:t>
+      </w:r>
+    </w:p>
+    <w:p>
+      <w:pPr>
+        <w:spacing w:after="80"/>
+        <w:ind w:firstLine="425"/>
+      </w:pPr>
+      <w:r>
+        <w:rPr>
+          <w:rFonts w:ascii="Times New Roman" w:hAnsi="Times New Roman"/>
+          <w:b w:val="0"/>
+          <w:sz w:val="24"/>
+        </w:rPr>
+        <w:t>Файл data.json выбран как простой вариант постоянного хранения. Когда приложение работает, словарь data находится в оперативной памяти. Если приложение остановить, оперативная память очистится, поэтому после каждой операции изменения вызывается сохранение в файл. При новом запуске load_data() снова читает data.json и восстанавливает хранилище.</w:t>
+      </w:r>
+    </w:p>
+    <w:p>
+      <w:pPr>
+        <w:spacing w:after="80"/>
+        <w:ind w:firstLine="425"/>
+      </w:pPr>
+      <w:r>
+        <w:rPr>
+          <w:rFonts w:ascii="Times New Roman" w:hAnsi="Times New Roman"/>
+          <w:b w:val="0"/>
+          <w:sz w:val="24"/>
+        </w:rPr>
+        <w:t>Для организации API применяются разные HTTP-методы. Метод GET используется для чтения данных, POST — для создания или изменения записи, DELETE — для удаления записи. Такое разделение соответствует обычной практике проектирования REST-подобных интерфейсов и делает приложение понятным для проверки.</w:t>
+      </w:r>
+    </w:p>
+    <w:p>
+      <w:pPr>
+        <w:spacing w:after="80"/>
+        <w:ind w:firstLine="425"/>
+      </w:pPr>
+      <w:r>
+        <w:rPr>
+          <w:rFonts w:ascii="Times New Roman" w:hAnsi="Times New Roman"/>
+          <w:b w:val="0"/>
+          <w:sz w:val="24"/>
+        </w:rPr>
+        <w:t>Ограничение запросов является важной частью веб-приложений. Даже учебное приложение может получить слишком много запросов подряд: случайно, из-за ошибки клиента или намеренно. Flask-Limiter позволяет ограничить количество запросов без написания собственной системы подсчета. В работе общий лимит задан для всего приложения, а операции /set и /delete дополнительно ограничены, потому что именно они изменяют состояние файла.</w:t>
+      </w:r>
+    </w:p>
+    <w:p>
+      <w:pPr>
+        <w:pStyle w:val="Heading1"/>
+      </w:pPr>
+      <w:r>
+        <w:rPr>
+          <w:rFonts w:ascii="Times New Roman" w:hAnsi="Times New Roman"/>
+          <w:b/>
+          <w:sz w:val="28"/>
+        </w:rPr>
+        <w:t>3. Использованные библиотеки</w:t>
+      </w:r>
+    </w:p>
+    <w:tbl>
+      <w:tblPr>
+        <w:tblStyle w:val="TableGrid"/>
+        <w:tblW w:type="auto" w:w="0"/>
+        <w:tblLook w:firstColumn="1" w:firstRow="1" w:lastColumn="0" w:lastRow="0" w:noHBand="0" w:noVBand="1" w:val="04A0"/>
+      </w:tblPr>
+      <w:tblGrid>
+        <w:gridCol w:w="3324"/>
+        <w:gridCol w:w="3324"/>
+        <w:gridCol w:w="3324"/>
+      </w:tblGrid>
+      <w:tr>
+        <w:tc>
+          <w:tcPr>
+            <w:tcW w:type="dxa" w:w="3324"/>
+          </w:tcPr>
+          <w:p>
+            <w:r>
+              <w:rPr>
+                <w:rFonts w:ascii="Times New Roman" w:hAnsi="Times New Roman"/>
+                <w:b/>
+                <w:sz w:val="24"/>
+              </w:rPr>
+              <w:t>Библиотека / модуль</w:t>
+            </w:r>
+          </w:p>
+        </w:tc>
+        <w:tc>
+          <w:tcPr>
+            <w:tcW w:type="dxa" w:w="3324"/>
+          </w:tcPr>
+          <w:p>
+            <w:r>
+              <w:rPr>
+                <w:rFonts w:ascii="Times New Roman" w:hAnsi="Times New Roman"/>
+                <w:b/>
+                <w:sz w:val="24"/>
+              </w:rPr>
+              <w:t>Где используется</w:t>
+            </w:r>
+          </w:p>
+        </w:tc>
+        <w:tc>
+          <w:tcPr>
+            <w:tcW w:type="dxa" w:w="3324"/>
+          </w:tcPr>
+          <w:p>
+            <w:r>
+              <w:rPr>
+                <w:rFonts w:ascii="Times New Roman" w:hAnsi="Times New Roman"/>
+                <w:b/>
+                <w:sz w:val="24"/>
+              </w:rPr>
+              <w:t>Зачем нужен</w:t>
+            </w:r>
+          </w:p>
+        </w:tc>
+      </w:tr>
+      <w:tr>
+        <w:tc>
+          <w:tcPr>
+            <w:tcW w:type="dxa" w:w="3324"/>
+          </w:tcPr>
+          <w:p>
+            <w:r>
+              <w:rPr>
+                <w:rFonts w:ascii="Times New Roman" w:hAnsi="Times New Roman"/>
+                <w:b w:val="0"/>
+                <w:sz w:val="24"/>
+              </w:rPr>
+              <w:t>Flask</w:t>
+            </w:r>
+          </w:p>
+        </w:tc>
+        <w:tc>
+          <w:tcPr>
+            <w:tcW w:type="dxa" w:w="3324"/>
+          </w:tcPr>
+          <w:p>
+            <w:r>
+              <w:rPr>
+                <w:rFonts w:ascii="Times New Roman" w:hAnsi="Times New Roman"/>
+                <w:b w:val="0"/>
+                <w:sz w:val="24"/>
+              </w:rPr>
+              <w:t>app.py</w:t>
+            </w:r>
+          </w:p>
+        </w:tc>
+        <w:tc>
+          <w:tcPr>
+            <w:tcW w:type="dxa" w:w="3324"/>
+          </w:tcPr>
+          <w:p>
+            <w:r>
+              <w:rPr>
+                <w:rFonts w:ascii="Times New Roman" w:hAnsi="Times New Roman"/>
+                <w:b w:val="0"/>
+                <w:sz w:val="24"/>
+              </w:rPr>
+              <w:t>Создание веб-приложения, маршрутов, JSON-ответов и HTML-страницы.</w:t>
+            </w:r>
+          </w:p>
+        </w:tc>
+      </w:tr>
+      <w:tr>
+        <w:tc>
+          <w:tcPr>
+            <w:tcW w:type="dxa" w:w="3324"/>
+          </w:tcPr>
+          <w:p>
+            <w:r>
+              <w:rPr>
+                <w:rFonts w:ascii="Times New Roman" w:hAnsi="Times New Roman"/>
+                <w:b w:val="0"/>
+                <w:sz w:val="24"/>
+              </w:rPr>
+              <w:t>Flask-Limiter</w:t>
+            </w:r>
+          </w:p>
+        </w:tc>
+        <w:tc>
+          <w:tcPr>
+            <w:tcW w:type="dxa" w:w="3324"/>
+          </w:tcPr>
+          <w:p>
+            <w:r>
+              <w:rPr>
+                <w:rFonts w:ascii="Times New Roman" w:hAnsi="Times New Roman"/>
+                <w:b w:val="0"/>
+                <w:sz w:val="24"/>
+              </w:rPr>
+              <w:t>app.py</w:t>
+            </w:r>
+          </w:p>
+        </w:tc>
+        <w:tc>
+          <w:tcPr>
+            <w:tcW w:type="dxa" w:w="3324"/>
+          </w:tcPr>
+          <w:p>
+            <w:r>
+              <w:rPr>
+                <w:rFonts w:ascii="Times New Roman" w:hAnsi="Times New Roman"/>
+                <w:b w:val="0"/>
+                <w:sz w:val="24"/>
+              </w:rPr>
+              <w:t>Ограничение частоты запросов: общий лимит и отдельные лимиты для изменяющих маршрутов.</w:t>
+            </w:r>
+          </w:p>
+        </w:tc>
+      </w:tr>
+      <w:tr>
+        <w:tc>
+          <w:tcPr>
+            <w:tcW w:type="dxa" w:w="3324"/>
+          </w:tcPr>
+          <w:p>
+            <w:r>
+              <w:rPr>
+                <w:rFonts w:ascii="Times New Roman" w:hAnsi="Times New Roman"/>
+                <w:b w:val="0"/>
+                <w:sz w:val="24"/>
+              </w:rPr>
+              <w:t>json</w:t>
+            </w:r>
+          </w:p>
+        </w:tc>
+        <w:tc>
+          <w:tcPr>
+            <w:tcW w:type="dxa" w:w="3324"/>
+          </w:tcPr>
+          <w:p>
+            <w:r>
+              <w:rPr>
+                <w:rFonts w:ascii="Times New Roman" w:hAnsi="Times New Roman"/>
+                <w:b w:val="0"/>
+                <w:sz w:val="24"/>
+              </w:rPr>
+              <w:t>app.py</w:t>
+            </w:r>
+          </w:p>
+        </w:tc>
+        <w:tc>
+          <w:tcPr>
+            <w:tcW w:type="dxa" w:w="3324"/>
+          </w:tcPr>
+          <w:p>
+            <w:r>
+              <w:rPr>
+                <w:rFonts w:ascii="Times New Roman" w:hAnsi="Times New Roman"/>
+                <w:b w:val="0"/>
+                <w:sz w:val="24"/>
+              </w:rPr>
+              <w:t>Чтение data.json, запись data.json, проверка сериализуемости значений.</w:t>
+            </w:r>
+          </w:p>
+        </w:tc>
+      </w:tr>
+      <w:tr>
+        <w:tc>
+          <w:tcPr>
+            <w:tcW w:type="dxa" w:w="3324"/>
+          </w:tcPr>
+          <w:p>
+            <w:r>
+              <w:rPr>
+                <w:rFonts w:ascii="Times New Roman" w:hAnsi="Times New Roman"/>
+                <w:b w:val="0"/>
+                <w:sz w:val="24"/>
+              </w:rPr>
+              <w:t>pathlib.Path</w:t>
+            </w:r>
+          </w:p>
+        </w:tc>
+        <w:tc>
+          <w:tcPr>
+            <w:tcW w:type="dxa" w:w="3324"/>
+          </w:tcPr>
+          <w:p>
+            <w:r>
+              <w:rPr>
+                <w:rFonts w:ascii="Times New Roman" w:hAnsi="Times New Roman"/>
+                <w:b w:val="0"/>
+                <w:sz w:val="24"/>
+              </w:rPr>
+              <w:t>app.py</w:t>
+            </w:r>
+          </w:p>
+        </w:tc>
+        <w:tc>
+          <w:tcPr>
+            <w:tcW w:type="dxa" w:w="3324"/>
+          </w:tcPr>
+          <w:p>
+            <w:r>
+              <w:rPr>
+                <w:rFonts w:ascii="Times New Roman" w:hAnsi="Times New Roman"/>
+                <w:b w:val="0"/>
+                <w:sz w:val="24"/>
+              </w:rPr>
+              <w:t>Формирование безопасных путей к файлам проекта и data.json.</w:t>
+            </w:r>
+          </w:p>
+        </w:tc>
+      </w:tr>
+      <w:tr>
+        <w:tc>
+          <w:tcPr>
+            <w:tcW w:type="dxa" w:w="3324"/>
+          </w:tcPr>
+          <w:p>
+            <w:r>
+              <w:rPr>
+                <w:rFonts w:ascii="Times New Roman" w:hAnsi="Times New Roman"/>
+                <w:b w:val="0"/>
+                <w:sz w:val="24"/>
+              </w:rPr>
+              <w:t>threading.RLock</w:t>
+            </w:r>
+          </w:p>
+        </w:tc>
+        <w:tc>
+          <w:tcPr>
+            <w:tcW w:type="dxa" w:w="3324"/>
+          </w:tcPr>
+          <w:p>
+            <w:r>
+              <w:rPr>
+                <w:rFonts w:ascii="Times New Roman" w:hAnsi="Times New Roman"/>
+                <w:b w:val="0"/>
+                <w:sz w:val="24"/>
+              </w:rPr>
+              <w:t>app.py</w:t>
+            </w:r>
+          </w:p>
+        </w:tc>
+        <w:tc>
+          <w:tcPr>
+            <w:tcW w:type="dxa" w:w="3324"/>
+          </w:tcPr>
+          <w:p>
+            <w:r>
+              <w:rPr>
+                <w:rFonts w:ascii="Times New Roman" w:hAnsi="Times New Roman"/>
+                <w:b w:val="0"/>
+                <w:sz w:val="24"/>
+              </w:rPr>
+              <w:t>Защита словаря data и файла от одновременной записи несколькими запросами.</w:t>
+            </w:r>
+          </w:p>
+        </w:tc>
+      </w:tr>
+      <w:tr>
+        <w:tc>
+          <w:tcPr>
+            <w:tcW w:type="dxa" w:w="3324"/>
+          </w:tcPr>
+          <w:p>
+            <w:r>
+              <w:rPr>
+                <w:rFonts w:ascii="Times New Roman" w:hAnsi="Times New Roman"/>
+                <w:b w:val="0"/>
+                <w:sz w:val="24"/>
+              </w:rPr>
+              <w:t>typing.Any</w:t>
+            </w:r>
+          </w:p>
+        </w:tc>
+        <w:tc>
+          <w:tcPr>
+            <w:tcW w:type="dxa" w:w="3324"/>
+          </w:tcPr>
+          <w:p>
+            <w:r>
+              <w:rPr>
+                <w:rFonts w:ascii="Times New Roman" w:hAnsi="Times New Roman"/>
+                <w:b w:val="0"/>
+                <w:sz w:val="24"/>
+              </w:rPr>
+              <w:t>app.py</w:t>
+            </w:r>
+          </w:p>
+        </w:tc>
+        <w:tc>
+          <w:tcPr>
+            <w:tcW w:type="dxa" w:w="3324"/>
+          </w:tcPr>
+          <w:p>
+            <w:r>
+              <w:rPr>
+                <w:rFonts w:ascii="Times New Roman" w:hAnsi="Times New Roman"/>
+                <w:b w:val="0"/>
+                <w:sz w:val="24"/>
+              </w:rPr>
+              <w:t>Пояснение, что значение key-value хранилища может быть разных типов.</w:t>
+            </w:r>
+          </w:p>
+        </w:tc>
+      </w:tr>
+      <w:tr>
+        <w:tc>
+          <w:tcPr>
+            <w:tcW w:type="dxa" w:w="3324"/>
+          </w:tcPr>
+          <w:p>
+            <w:r>
+              <w:rPr>
+                <w:rFonts w:ascii="Times New Roman" w:hAnsi="Times New Roman"/>
+                <w:b w:val="0"/>
+                <w:sz w:val="24"/>
+              </w:rPr>
+              <w:t>requests</w:t>
+            </w:r>
+          </w:p>
+        </w:tc>
+        <w:tc>
+          <w:tcPr>
+            <w:tcW w:type="dxa" w:w="3324"/>
+          </w:tcPr>
+          <w:p>
+            <w:r>
+              <w:rPr>
+                <w:rFonts w:ascii="Times New Roman" w:hAnsi="Times New Roman"/>
+                <w:b w:val="0"/>
+                <w:sz w:val="24"/>
+              </w:rPr>
+              <w:t>client_demo.py</w:t>
+            </w:r>
+          </w:p>
+        </w:tc>
+        <w:tc>
+          <w:tcPr>
+            <w:tcW w:type="dxa" w:w="3324"/>
+          </w:tcPr>
+          <w:p>
+            <w:r>
+              <w:rPr>
+                <w:rFonts w:ascii="Times New Roman" w:hAnsi="Times New Roman"/>
+                <w:b w:val="0"/>
+                <w:sz w:val="24"/>
+              </w:rPr>
+              <w:t>Отправка HTTP-запросов к API из отдельного демонстрационного клиента.</w:t>
+            </w:r>
+          </w:p>
+        </w:tc>
+      </w:tr>
+      <w:tr>
+        <w:tc>
+          <w:tcPr>
+            <w:tcW w:type="dxa" w:w="3324"/>
+          </w:tcPr>
+          <w:p>
+            <w:r>
+              <w:rPr>
+                <w:rFonts w:ascii="Times New Roman" w:hAnsi="Times New Roman"/>
+                <w:b w:val="0"/>
+                <w:sz w:val="24"/>
+              </w:rPr>
+              <w:t>Werkzeug HTTPException</w:t>
+            </w:r>
+          </w:p>
+        </w:tc>
+        <w:tc>
+          <w:tcPr>
+            <w:tcW w:type="dxa" w:w="3324"/>
+          </w:tcPr>
+          <w:p>
+            <w:r>
+              <w:rPr>
+                <w:rFonts w:ascii="Times New Roman" w:hAnsi="Times New Roman"/>
+                <w:b w:val="0"/>
+                <w:sz w:val="24"/>
+              </w:rPr>
+              <w:t>app.py</w:t>
+            </w:r>
+          </w:p>
+        </w:tc>
+        <w:tc>
+          <w:tcPr>
+            <w:tcW w:type="dxa" w:w="3324"/>
+          </w:tcPr>
+          <w:p>
+            <w:r>
+              <w:rPr>
+                <w:rFonts w:ascii="Times New Roman" w:hAnsi="Times New Roman"/>
+                <w:b w:val="0"/>
+                <w:sz w:val="24"/>
+              </w:rPr>
+              <w:t>Единая обработка HTTP-ошибок и возврат их в JSON-формате.</w:t>
+            </w:r>
+          </w:p>
+        </w:tc>
+      </w:tr>
+    </w:tbl>
+    <w:p/>
+    <w:p>
+      <w:pPr>
+        <w:spacing w:after="80"/>
+        <w:ind w:firstLine="425"/>
+      </w:pPr>
+      <w:r>
+        <w:rPr>
+          <w:rFonts w:ascii="Times New Roman" w:hAnsi="Times New Roman"/>
+          <w:b w:val="0"/>
+          <w:sz w:val="24"/>
+        </w:rPr>
+        <w:t>Отдельно стоит отметить Flask-Limiter. В приложении используется storage_uri='memory://', то есть счетчики лимитов хранятся в памяти процесса. Для учебной лабораторной работы этого достаточно: лимит виден, его можно проверить, и не требуется поднимать Redis или другую внешнюю систему хранения счетчиков.</w:t>
+      </w:r>
+    </w:p>
+    <w:p>
+      <w:pPr>
+        <w:spacing w:after="80"/>
+        <w:ind w:firstLine="425"/>
+      </w:pPr>
+      <w:r>
+        <w:rPr>
+          <w:rFonts w:ascii="Times New Roman" w:hAnsi="Times New Roman"/>
+          <w:b w:val="0"/>
+          <w:sz w:val="24"/>
+        </w:rPr>
+        <w:t>Модуль json используется не только для записи файла, но и как часть проверки входных данных. Если значение не может быть сериализовано, приложение возвращает ошибку. Это предотвращает ситуацию, когда пользователь отправил данные, сервер принял их в память, но потом не смог сохранить в data.json.</w:t>
+      </w:r>
+    </w:p>
+    <w:p>
+      <w:pPr>
+        <w:pStyle w:val="Heading1"/>
+      </w:pPr>
+      <w:r>
+        <w:rPr>
+          <w:rFonts w:ascii="Times New Roman" w:hAnsi="Times New Roman"/>
+          <w:b/>
+          <w:sz w:val="28"/>
+        </w:rPr>
+        <w:t>4. Структура проекта</w:t>
       </w:r>
     </w:p>
     <w:tbl>
@@ -372,6 +1085,11 @@
           </w:tcPr>
           <w:p>
             <w:r>
+              <w:rPr>
+                <w:rFonts w:ascii="Times New Roman" w:hAnsi="Times New Roman"/>
+                <w:b/>
+                <w:sz w:val="24"/>
+              </w:rPr>
               <w:t>Файл</w:t>
             </w:r>
           </w:p>
@@ -382,7 +1100,12 @@
           </w:tcPr>
           <w:p>
             <w:r>
-              <w:t>Назначение</w:t>
+              <w:rPr>
+                <w:rFonts w:ascii="Times New Roman" w:hAnsi="Times New Roman"/>
+                <w:b/>
+                <w:sz w:val="24"/>
+              </w:rPr>
+              <w:t>Подробное назначение</w:t>
             </w:r>
           </w:p>
         </w:tc>
@@ -394,6 +1117,11 @@
           </w:tcPr>
           <w:p>
             <w:r>
+              <w:rPr>
+                <w:rFonts w:ascii="Times New Roman" w:hAnsi="Times New Roman"/>
+                <w:b w:val="0"/>
+                <w:sz w:val="24"/>
+              </w:rPr>
               <w:t>app.py</w:t>
             </w:r>
           </w:p>
@@ -404,7 +1132,12 @@
           </w:tcPr>
           <w:p>
             <w:r>
-              <w:t>Основное Flask-приложение: маршруты API, загрузка и сохранение data.json, лимиты Flask-Limiter.</w:t>
+              <w:rPr>
+                <w:rFonts w:ascii="Times New Roman" w:hAnsi="Times New Roman"/>
+                <w:b w:val="0"/>
+                <w:sz w:val="24"/>
+              </w:rPr>
+              <w:t>Основное приложение. Содержит настройки Flask, Limiter, словарь data, функции load_data/save_data, валидацию и маршруты API.</w:t>
             </w:r>
           </w:p>
         </w:tc>
@@ -416,6 +1149,11 @@
           </w:tcPr>
           <w:p>
             <w:r>
+              <w:rPr>
+                <w:rFonts w:ascii="Times New Roman" w:hAnsi="Times New Roman"/>
+                <w:b w:val="0"/>
+                <w:sz w:val="24"/>
+              </w:rPr>
               <w:t>data.json</w:t>
             </w:r>
           </w:p>
@@ -426,7 +1164,12 @@
           </w:tcPr>
           <w:p>
             <w:r>
-              <w:t>Файл постоянного хранения key-value данных.</w:t>
+              <w:rPr>
+                <w:rFonts w:ascii="Times New Roman" w:hAnsi="Times New Roman"/>
+                <w:b w:val="0"/>
+                <w:sz w:val="24"/>
+              </w:rPr>
+              <w:t>Файл начальных и текущих данных. При старте загружается в словарь data, после изменений перезаписывается.</w:t>
             </w:r>
           </w:p>
         </w:tc>
@@ -438,6 +1181,11 @@
           </w:tcPr>
           <w:p>
             <w:r>
+              <w:rPr>
+                <w:rFonts w:ascii="Times New Roman" w:hAnsi="Times New Roman"/>
+                <w:b w:val="0"/>
+                <w:sz w:val="24"/>
+              </w:rPr>
               <w:t>templates/index.html</w:t>
             </w:r>
           </w:p>
@@ -448,7 +1196,12 @@
           </w:tcPr>
           <w:p>
             <w:r>
-              <w:t>Демонстрационная HTML-страница для проверки API через браузер.</w:t>
+              <w:rPr>
+                <w:rFonts w:ascii="Times New Roman" w:hAnsi="Times New Roman"/>
+                <w:b w:val="0"/>
+                <w:sz w:val="24"/>
+              </w:rPr>
+              <w:t>Демонстрационный интерфейс: формы для /set, /get, /exists, /delete и область с JSON-ответом сервера.</w:t>
             </w:r>
           </w:p>
         </w:tc>
@@ -460,6 +1213,11 @@
           </w:tcPr>
           <w:p>
             <w:r>
+              <w:rPr>
+                <w:rFonts w:ascii="Times New Roman" w:hAnsi="Times New Roman"/>
+                <w:b w:val="0"/>
+                <w:sz w:val="24"/>
+              </w:rPr>
               <w:t>static/css/style.css</w:t>
             </w:r>
           </w:p>
@@ -470,7 +1228,12 @@
           </w:tcPr>
           <w:p>
             <w:r>
-              <w:t>Оформление страницы проверки.</w:t>
+              <w:rPr>
+                <w:rFonts w:ascii="Times New Roman" w:hAnsi="Times New Roman"/>
+                <w:b w:val="0"/>
+                <w:sz w:val="24"/>
+              </w:rPr>
+              <w:t>Внешний вид страницы: панели, таблица, кнопки, блок JSON-ответа, адаптивная верстка.</w:t>
             </w:r>
           </w:p>
         </w:tc>
@@ -482,6 +1245,11 @@
           </w:tcPr>
           <w:p>
             <w:r>
+              <w:rPr>
+                <w:rFonts w:ascii="Times New Roman" w:hAnsi="Times New Roman"/>
+                <w:b w:val="0"/>
+                <w:sz w:val="24"/>
+              </w:rPr>
               <w:t>client_demo.py</w:t>
             </w:r>
           </w:p>
@@ -492,7 +1260,12 @@
           </w:tcPr>
           <w:p>
             <w:r>
-              <w:t>Проверка API через библиотеку requests.</w:t>
+              <w:rPr>
+                <w:rFonts w:ascii="Times New Roman" w:hAnsi="Times New Roman"/>
+                <w:b w:val="0"/>
+                <w:sz w:val="24"/>
+              </w:rPr>
+              <w:t>Отдельный Python-клиент на requests, показывающий, что API можно использовать не только из браузера.</w:t>
             </w:r>
           </w:p>
         </w:tc>
@@ -504,6 +1277,11 @@
           </w:tcPr>
           <w:p>
             <w:r>
+              <w:rPr>
+                <w:rFonts w:ascii="Times New Roman" w:hAnsi="Times New Roman"/>
+                <w:b w:val="0"/>
+                <w:sz w:val="24"/>
+              </w:rPr>
               <w:t>requirements.txt</w:t>
             </w:r>
           </w:p>
@@ -514,7 +1292,12 @@
           </w:tcPr>
           <w:p>
             <w:r>
-              <w:t>Список зависимостей: Flask, Flask-Limiter, requests.</w:t>
+              <w:rPr>
+                <w:rFonts w:ascii="Times New Roman" w:hAnsi="Times New Roman"/>
+                <w:b w:val="0"/>
+                <w:sz w:val="24"/>
+              </w:rPr>
+              <w:t>Зависимости проекта: Flask, Flask-Limiter, requests.</w:t>
             </w:r>
           </w:p>
         </w:tc>
@@ -526,7 +1309,12 @@
           </w:tcPr>
           <w:p>
             <w:r>
-              <w:t>Dockerfile, docker-compose.yml</w:t>
+              <w:rPr>
+                <w:rFonts w:ascii="Times New Roman" w:hAnsi="Times New Roman"/>
+                <w:b w:val="0"/>
+                <w:sz w:val="24"/>
+              </w:rPr>
+              <w:t>Dockerfile</w:t>
             </w:r>
           </w:p>
         </w:tc>
@@ -536,7 +1324,12 @@
           </w:tcPr>
           <w:p>
             <w:r>
-              <w:t>Дополнительный способ запуска приложения в контейнере.</w:t>
+              <w:rPr>
+                <w:rFonts w:ascii="Times New Roman" w:hAnsi="Times New Roman"/>
+                <w:b w:val="0"/>
+                <w:sz w:val="24"/>
+              </w:rPr>
+              <w:t>Сборка контейнера с Python и зависимостями.</w:t>
             </w:r>
           </w:p>
         </w:tc>
@@ -548,7 +1341,12 @@
           </w:tcPr>
           <w:p>
             <w:r>
-              <w:t>README.md</w:t>
+              <w:rPr>
+                <w:rFonts w:ascii="Times New Roman" w:hAnsi="Times New Roman"/>
+                <w:b w:val="0"/>
+                <w:sz w:val="24"/>
+              </w:rPr>
+              <w:t>docker-compose.yml</w:t>
             </w:r>
           </w:p>
         </w:tc>
@@ -558,12 +1356,82 @@
           </w:tcPr>
           <w:p>
             <w:r>
-              <w:t>Краткая инструкция по запуску и проверке API.</w:t>
+              <w:rPr>
+                <w:rFonts w:ascii="Times New Roman" w:hAnsi="Times New Roman"/>
+                <w:b w:val="0"/>
+                <w:sz w:val="24"/>
+              </w:rPr>
+              <w:t>Удобный запуск приложения в Docker с пробросом порта и подключением файла data.json.</w:t>
+            </w:r>
+          </w:p>
+        </w:tc>
+      </w:tr>
+      <w:tr>
+        <w:tc>
+          <w:tcPr>
+            <w:tcW w:type="dxa" w:w="4986"/>
+          </w:tcPr>
+          <w:p>
+            <w:r>
+              <w:rPr>
+                <w:rFonts w:ascii="Times New Roman" w:hAnsi="Times New Roman"/>
+                <w:b w:val="0"/>
+                <w:sz w:val="24"/>
+              </w:rPr>
+              <w:t>docs/screenshots</w:t>
+            </w:r>
+          </w:p>
+        </w:tc>
+        <w:tc>
+          <w:tcPr>
+            <w:tcW w:type="dxa" w:w="4986"/>
+          </w:tcPr>
+          <w:p>
+            <w:r>
+              <w:rPr>
+                <w:rFonts w:ascii="Times New Roman" w:hAnsi="Times New Roman"/>
+                <w:b w:val="0"/>
+                <w:sz w:val="24"/>
+              </w:rPr>
+              <w:t>Скриншоты, вставленные в отчет.</w:t>
+            </w:r>
+          </w:p>
+        </w:tc>
+      </w:tr>
+      <w:tr>
+        <w:tc>
+          <w:tcPr>
+            <w:tcW w:type="dxa" w:w="4986"/>
+          </w:tcPr>
+          <w:p>
+            <w:r>
+              <w:rPr>
+                <w:rFonts w:ascii="Times New Roman" w:hAnsi="Times New Roman"/>
+                <w:b w:val="0"/>
+                <w:sz w:val="24"/>
+              </w:rPr>
+              <w:t>docs/LR_8_key_value_report.docx</w:t>
+            </w:r>
+          </w:p>
+        </w:tc>
+        <w:tc>
+          <w:tcPr>
+            <w:tcW w:type="dxa" w:w="4986"/>
+          </w:tcPr>
+          <w:p>
+            <w:r>
+              <w:rPr>
+                <w:rFonts w:ascii="Times New Roman" w:hAnsi="Times New Roman"/>
+                <w:b w:val="0"/>
+                <w:sz w:val="24"/>
+              </w:rPr>
+              <w:t>Итоговый отчет по лабораторной работе.</w:t>
             </w:r>
           </w:p>
         </w:tc>
       </w:tr>
     </w:tbl>
+    <w:p/>
     <w:p>
       <w:pPr>
         <w:pStyle w:val="Heading1"/>
@@ -571,455 +1439,877 @@
       <w:r>
         <w:rPr>
           <w:rFonts w:ascii="Times New Roman" w:hAnsi="Times New Roman"/>
+          <w:b/>
+          <w:sz w:val="28"/>
         </w:rPr>
-        <w:t>4. Реализация приложения</w:t>
+        <w:t>5. Архитектура и логика работы</w:t>
       </w:r>
     </w:p>
     <w:p>
+      <w:pPr>
+        <w:spacing w:after="80"/>
+        <w:ind w:firstLine="425"/>
+      </w:pPr>
       <w:r>
         <w:rPr>
           <w:rFonts w:ascii="Times New Roman" w:hAnsi="Times New Roman"/>
           <w:b w:val="0"/>
           <w:sz w:val="24"/>
         </w:rPr>
-        <w:t>В начале app.py расположен блок импортов с пояснением, для каких частей лабораторной работы нужны библиотеки. Это упрощает проверку кода и показывает, что каждая зависимость используется осознанно.</w:t>
+        <w:t>Архитектура приложения состоит из трех уровней: файловое хранение, серверная логика и пользовательский/клиентский уровень. Файловое хранение представлено data.json. Серверная логика находится в app.py и отвечает за обработку запросов. Пользовательский уровень представлен HTML-страницей и отдельным скриптом client_demo.py.</w:t>
       </w:r>
     </w:p>
     <w:p>
       <w:pPr>
-        <w:shd w:fill="F2F5F9"/>
-      </w:pPr>
-      <w:r>
-        <w:rPr>
-          <w:rFonts w:ascii="Courier New" w:hAnsi="Courier New"/>
-          <w:sz w:val="17"/>
-        </w:rPr>
-        <w:t># Импорты</w:t>
-        <w:br/>
-        <w:t># json — для раздела II: загрузки и сохранения key-value данных в файле data.json</w:t>
-        <w:br/>
-        <w:t># os — для общей части: чтения переменных окружения DATA_FILE и FLASK_PORT</w:t>
-        <w:br/>
-        <w:t># pathlib.Path — для общей части: безопасной работы с путями к файлам проекта</w:t>
-        <w:br/>
-        <w:t># threading.RLock — для раздела II: защиты словаря data и файла data.json от одновременной записи</w:t>
-        <w:br/>
-        <w:t># typing.Any — для раздела II: описания значений, которые могут храниться в key-value хранилище</w:t>
-        <w:br/>
-        <w:t># flask — для раздела II: создания API-маршрутов, HTML-страницы и JSON-ответов</w:t>
-        <w:br/>
-        <w:t># flask_limiter — для раздела II: ограничения частоты запросов к API</w:t>
-        <w:br/>
-        <w:t># werkzeug.exceptions.HTTPException — для общей части: аккуратной обработки HTTP-ошибок</w:t>
-        <w:br/>
-        <w:br/>
-        <w:t>import json</w:t>
-        <w:br/>
-        <w:t>import os</w:t>
-        <w:br/>
-        <w:t>from pathlib import Path</w:t>
-        <w:br/>
-        <w:t>from threading import RLock</w:t>
-        <w:br/>
-        <w:t>from typing import Any</w:t>
-        <w:br/>
-        <w:br/>
-        <w:t>from flask import Flask, jsonify, render_template, request</w:t>
-        <w:br/>
-        <w:t>from flask_limiter import Limiter</w:t>
-        <w:br/>
-        <w:t>from flask_limiter.errors import RateLimitExceeded</w:t>
-        <w:br/>
-        <w:t>from flask_limiter.util import get_remote_address</w:t>
-        <w:br/>
-        <w:t>from werkzeug.exceptions import HTTPException</w:t>
-      </w:r>
-    </w:p>
-    <w:p>
+        <w:spacing w:after="80"/>
+        <w:ind w:firstLine="425"/>
+      </w:pPr>
       <w:r>
         <w:rPr>
           <w:rFonts w:ascii="Times New Roman" w:hAnsi="Times New Roman"/>
           <w:b w:val="0"/>
           <w:sz w:val="24"/>
         </w:rPr>
-        <w:t>Основное хранилище представлено словарем data. При старте приложения вызывается load_data(), которая читает data.json. Если файл отсутствует, приложение создает его автоматически. Для записи используется save_data(), которая сохраняет словарь в JSON после каждой изменяющей операции.</w:t>
+        <w:t>Общий жизненный цикл данных выглядит так:</w:t>
       </w:r>
     </w:p>
     <w:p>
       <w:pPr>
-        <w:shd w:fill="F2F5F9"/>
-      </w:pPr>
-      <w:r>
-        <w:rPr>
-          <w:rFonts w:ascii="Courier New" w:hAnsi="Courier New"/>
-          <w:sz w:val="17"/>
-        </w:rPr>
-        <w:t>def save_data() -&gt; None:</w:t>
-        <w:br/>
-        <w:t xml:space="preserve">    # После каждой изменяющей операции записываем актуальное состояние словаря data в data.json.</w:t>
-        <w:br/>
-        <w:t xml:space="preserve">    with data_lock:</w:t>
-        <w:br/>
-        <w:t xml:space="preserve">        DATA_FILE.parent.mkdir(parents=True, exist_ok=True)</w:t>
-        <w:br/>
-        <w:t xml:space="preserve">        temp_file = DATA_FILE.with_suffix(DATA_FILE.suffix + ".tmp")</w:t>
-        <w:br/>
-        <w:t xml:space="preserve">        temp_file.write_text(</w:t>
-        <w:br/>
-        <w:t xml:space="preserve">            json.dumps(data, ensure_ascii=False, indent=4, sort_keys=True),</w:t>
-        <w:br/>
-        <w:t xml:space="preserve">            encoding="utf-8",</w:t>
-        <w:br/>
-        <w:t xml:space="preserve">        )</w:t>
-        <w:br/>
-        <w:t xml:space="preserve">        temp_file.replace(DATA_FILE)</w:t>
-        <w:br/>
-        <w:br/>
-        <w:br/>
-        <w:t>def load_data() -&gt; None:</w:t>
-        <w:br/>
-        <w:t xml:space="preserve">    # При старте приложения автоматически загружаем data.json в словарь data.</w:t>
-        <w:br/>
-        <w:t xml:space="preserve">    with data_lock:</w:t>
-        <w:br/>
-        <w:t xml:space="preserve">        if not DATA_FILE.exists():</w:t>
-        <w:br/>
-        <w:t xml:space="preserve">            save_data()</w:t>
-        <w:br/>
-        <w:t xml:space="preserve">            return</w:t>
-        <w:br/>
-        <w:br/>
-        <w:t xml:space="preserve">        loaded_data = json.loads(DATA_FILE.read_text(encoding="utf-8"))</w:t>
-        <w:br/>
-        <w:t xml:space="preserve">        if not isinstance(loaded_data, dict):</w:t>
-        <w:br/>
-        <w:t xml:space="preserve">            raise RuntimeError("Файл data.json должен содержать JSON-объект с парами ключ-значение.")</w:t>
-        <w:br/>
-        <w:br/>
-        <w:t xml:space="preserve">        data.clear()</w:t>
-        <w:br/>
-        <w:t xml:space="preserve">        data.update(loaded_data)</w:t>
-        <w:br/>
-        <w:br/>
-        <w:br/>
-        <w:t>def current_snapshot() -&gt; dict[str, Any]:</w:t>
-        <w:br/>
-        <w:t xml:space="preserve">    # Отдаем копию словаря, чтобы шаблон или API-ответ не меняли основное хранилище напрямую.</w:t>
-        <w:br/>
-        <w:t xml:space="preserve">    with data_lock:</w:t>
-        <w:br/>
-        <w:t xml:space="preserve">        return dict(data)</w:t>
-      </w:r>
-    </w:p>
-    <w:p>
+        <w:pStyle w:val="ListNumber"/>
+        <w:spacing w:after="60"/>
+      </w:pPr>
       <w:r>
         <w:rPr>
           <w:rFonts w:ascii="Times New Roman" w:hAnsi="Times New Roman"/>
           <w:b w:val="0"/>
           <w:sz w:val="24"/>
         </w:rPr>
-        <w:t>Валидация входных данных вынесена в отдельные функции. Ключ обязан быть непустой строкой, а значение должно сериализоваться в JSON. Это важно, потому что иначе данные невозможно надежно сохранить в data.json.</w:t>
+        <w:t>пользователь или клиент отправляет HTTP-запрос;</w:t>
       </w:r>
     </w:p>
     <w:p>
       <w:pPr>
-        <w:shd w:fill="F2F5F9"/>
-      </w:pPr>
-      <w:r>
-        <w:rPr>
-          <w:rFonts w:ascii="Courier New" w:hAnsi="Courier New"/>
-          <w:sz w:val="17"/>
-        </w:rPr>
-        <w:t>def request_payload() -&gt; dict[str, Any]:</w:t>
-        <w:br/>
-        <w:t xml:space="preserve">    # API принимает JSON-запросы, а демонстрационная HTML-страница отправляет обычную form-data форму.</w:t>
-        <w:br/>
-        <w:t xml:space="preserve">    payload = request.get_json(silent=True) if request.is_json else None</w:t>
-        <w:br/>
-        <w:t xml:space="preserve">    if payload is None:</w:t>
-        <w:br/>
-        <w:t xml:space="preserve">        payload = request.form.to_dict()</w:t>
-        <w:br/>
-        <w:br/>
-        <w:t xml:space="preserve">    if not isinstance(payload, dict):</w:t>
-        <w:br/>
-        <w:t xml:space="preserve">        raise ValueError("Тело запроса должно быть JSON-объектом или HTML-формой.")</w:t>
-        <w:br/>
-        <w:t xml:space="preserve">    return payload</w:t>
-        <w:br/>
-        <w:br/>
-        <w:br/>
-        <w:t>def normalize_key(raw_key: Any) -&gt; str:</w:t>
-        <w:br/>
-        <w:t xml:space="preserve">    # Ключ приводится к строке и обрезается по краям, чтобы ' user ' и 'user' не считались разными ключами.</w:t>
-        <w:br/>
-        <w:t xml:space="preserve">    key = str(raw_key or "").strip()</w:t>
-        <w:br/>
-        <w:t xml:space="preserve">    if not key:</w:t>
-        <w:br/>
-        <w:t xml:space="preserve">        raise ValueError("Ключ обязателен.")</w:t>
-        <w:br/>
-        <w:t xml:space="preserve">    if len(key) &gt; 100:</w:t>
-        <w:br/>
-        <w:t xml:space="preserve">        raise ValueError("Ключ не должен быть длиннее 100 символов.")</w:t>
-        <w:br/>
-        <w:t xml:space="preserve">    return key</w:t>
-        <w:br/>
-        <w:br/>
-        <w:br/>
-        <w:t>def validate_value(value: Any) -&gt; Any:</w:t>
-        <w:br/>
-        <w:t xml:space="preserve">    # Значение должно сериализоваться в JSON, иначе его невозможно надежно сохранить в data.json.</w:t>
-        <w:br/>
-        <w:t xml:space="preserve">    try:</w:t>
-        <w:br/>
-        <w:t xml:space="preserve">        json.dumps(value, ensure_ascii=False)</w:t>
-        <w:br/>
-        <w:t xml:space="preserve">    except TypeError as error:</w:t>
-        <w:br/>
-        <w:t xml:space="preserve">        raise ValueError("Значение должно быть JSON-сериализуемым.") from error</w:t>
-        <w:br/>
-        <w:t xml:space="preserve">    return value</w:t>
-        <w:br/>
-        <w:br/>
-        <w:br/>
-        <w:t>def error_response(message: str, status_code: int):</w:t>
-        <w:br/>
-        <w:t xml:space="preserve">    # Единый формат ошибок помогает одинаково читать ответы в браузере, curl и Postman.</w:t>
-        <w:br/>
-        <w:t xml:space="preserve">    response = jsonify({</w:t>
-        <w:br/>
-        <w:t xml:space="preserve">        "ok": False,</w:t>
-        <w:br/>
-        <w:t xml:space="preserve">        "message": message,</w:t>
-        <w:br/>
-        <w:t xml:space="preserve">    })</w:t>
-        <w:br/>
-        <w:t xml:space="preserve">    return response, status_code</w:t>
-      </w:r>
-    </w:p>
-    <w:p>
+        <w:pStyle w:val="ListNumber"/>
+        <w:spacing w:after="60"/>
+      </w:pPr>
       <w:r>
         <w:rPr>
           <w:rFonts w:ascii="Times New Roman" w:hAnsi="Times New Roman"/>
           <w:b w:val="0"/>
           <w:sz w:val="24"/>
         </w:rPr>
-        <w:t>Маршрут POST /set сохраняет значение по ключу, сразу вызывает save_data() и возвращает JSON-ответ со статусом 201. Для него задан отдельный лимит 10 запросов в минуту, при этом общий лимит 100 запросов в сутки не отключается.</w:t>
+        <w:t>Flask выбирает подходящий маршрут;</w:t>
       </w:r>
     </w:p>
     <w:p>
       <w:pPr>
-        <w:shd w:fill="F2F5F9"/>
-      </w:pPr>
-      <w:r>
-        <w:rPr>
-          <w:rFonts w:ascii="Courier New" w:hAnsi="Courier New"/>
-          <w:sz w:val="17"/>
-        </w:rPr>
-        <w:t>@app.post("/set")</w:t>
-        <w:br/>
-        <w:t>@limiter.limit("10 per minute", override_defaults=False)</w:t>
-        <w:br/>
-        <w:t>def set_value():</w:t>
-        <w:br/>
-        <w:t xml:space="preserve">    try:</w:t>
-        <w:br/>
-        <w:t xml:space="preserve">        payload = request_payload()</w:t>
-        <w:br/>
-        <w:t xml:space="preserve">        key = normalize_key(payload.get("key"))</w:t>
-        <w:br/>
-        <w:t xml:space="preserve">        if "value" not in payload:</w:t>
-        <w:br/>
-        <w:t xml:space="preserve">            raise ValueError("Значение обязательно.")</w:t>
-        <w:br/>
-        <w:br/>
-        <w:t xml:space="preserve">        value = validate_value(payload["value"])</w:t>
-        <w:br/>
-        <w:t xml:space="preserve">        with data_lock:</w:t>
-        <w:br/>
-        <w:t xml:space="preserve">            data[key] = value</w:t>
-        <w:br/>
-        <w:t xml:space="preserve">            save_data()</w:t>
-        <w:br/>
-        <w:br/>
-        <w:t xml:space="preserve">        return jsonify({</w:t>
-        <w:br/>
-        <w:t xml:space="preserve">            "ok": True,</w:t>
-        <w:br/>
-        <w:t xml:space="preserve">            "message": "Значение сохранено.",</w:t>
-        <w:br/>
-        <w:t xml:space="preserve">            "key": key,</w:t>
-        <w:br/>
-        <w:t xml:space="preserve">            "value": value,</w:t>
-        <w:br/>
-        <w:t xml:space="preserve">            "count": len(data),</w:t>
-        <w:br/>
-        <w:t xml:space="preserve">        }), 201</w:t>
-        <w:br/>
-        <w:t xml:space="preserve">    except ValueError as error:</w:t>
-        <w:br/>
-        <w:t xml:space="preserve">        return error_response(str(error), 400)</w:t>
-      </w:r>
-    </w:p>
-    <w:p>
+        <w:pStyle w:val="ListNumber"/>
+        <w:spacing w:after="60"/>
+      </w:pPr>
       <w:r>
         <w:rPr>
           <w:rFonts w:ascii="Times New Roman" w:hAnsi="Times New Roman"/>
           <w:b w:val="0"/>
           <w:sz w:val="24"/>
         </w:rPr>
-        <w:t>Маршруты GET /get/&lt;key&gt;, DELETE /delete/&lt;key&gt; и GET /exists/&lt;key&gt; реализуют чтение, удаление и проверку существования ключа. Удаление также сохраняет изменения в data.json.</w:t>
+        <w:t>приложение проверяет ключ и значение;</w:t>
       </w:r>
     </w:p>
     <w:p>
       <w:pPr>
-        <w:shd w:fill="F2F5F9"/>
-      </w:pPr>
-      <w:r>
-        <w:rPr>
-          <w:rFonts w:ascii="Courier New" w:hAnsi="Courier New"/>
-          <w:sz w:val="17"/>
-        </w:rPr>
-        <w:t>@app.get("/get/")</w:t>
-        <w:br/>
-        <w:t>def get_value_without_key():</w:t>
-        <w:br/>
-        <w:t xml:space="preserve">    return error_response("Передайте ключ в адресе: /get/&lt;key&gt;.", 400)</w:t>
-        <w:br/>
-        <w:br/>
-        <w:br/>
-        <w:t>@app.get("/get/&lt;path:key&gt;")</w:t>
-        <w:br/>
-        <w:t>def get_value(key: str):</w:t>
-        <w:br/>
-        <w:t xml:space="preserve">    key = normalize_key(key)</w:t>
-        <w:br/>
-        <w:t xml:space="preserve">    with data_lock:</w:t>
-        <w:br/>
-        <w:t xml:space="preserve">        if key not in data:</w:t>
-        <w:br/>
-        <w:t xml:space="preserve">            return error_response("Ключ не найден.", 404)</w:t>
-        <w:br/>
-        <w:t xml:space="preserve">        value = data[key]</w:t>
-        <w:br/>
-        <w:br/>
-        <w:t xml:space="preserve">    return jsonify({</w:t>
-        <w:br/>
-        <w:t xml:space="preserve">        "ok": True,</w:t>
-        <w:br/>
-        <w:t xml:space="preserve">        "key": key,</w:t>
-        <w:br/>
-        <w:t xml:space="preserve">        "value": value,</w:t>
-        <w:br/>
-        <w:t xml:space="preserve">    })</w:t>
-        <w:br/>
-        <w:br/>
-        <w:br/>
-        <w:t># ==============================</w:t>
-        <w:br/>
-        <w:t># Раздел II — API: DELETE /delete/&lt;key&gt; — удалить ключ</w:t>
-        <w:br/>
-        <w:t># ==============================</w:t>
-        <w:br/>
-        <w:br/>
-        <w:t>@app.delete("/delete/")</w:t>
-        <w:br/>
-        <w:t>def delete_value_without_key():</w:t>
-        <w:br/>
-        <w:t xml:space="preserve">    return error_response("Передайте ключ в адресе: /delete/&lt;key&gt;.", 400)</w:t>
-        <w:br/>
-        <w:br/>
-        <w:br/>
-        <w:t>@app.delete("/delete/&lt;path:key&gt;")</w:t>
-        <w:br/>
-        <w:t>@limiter.limit("10 per minute", override_defaults=False)</w:t>
-        <w:br/>
-        <w:t>def delete_value(key: str):</w:t>
-        <w:br/>
-        <w:t xml:space="preserve">    key = normalize_key(key)</w:t>
-        <w:br/>
-        <w:t xml:space="preserve">    with data_lock:</w:t>
-        <w:br/>
-        <w:t xml:space="preserve">        if key not in data:</w:t>
-        <w:br/>
-        <w:t xml:space="preserve">            return error_response("Ключ не найден.", 404)</w:t>
-        <w:br/>
-        <w:t xml:space="preserve">        removed_value = data.pop(key)</w:t>
-        <w:br/>
-        <w:t xml:space="preserve">        save_data()</w:t>
-        <w:br/>
-        <w:br/>
-        <w:t xml:space="preserve">    return jsonify({</w:t>
-        <w:br/>
-        <w:t xml:space="preserve">        "ok": True,</w:t>
-        <w:br/>
-        <w:t xml:space="preserve">        "message": "Ключ удален.",</w:t>
-        <w:br/>
-        <w:t xml:space="preserve">        "key": key,</w:t>
-        <w:br/>
-        <w:t xml:space="preserve">        "removed_value": removed_value,</w:t>
-        <w:br/>
-        <w:t xml:space="preserve">        "count": len(data),</w:t>
-        <w:br/>
-        <w:t xml:space="preserve">    })</w:t>
-        <w:br/>
-        <w:br/>
-        <w:br/>
-        <w:t># ==============================</w:t>
-        <w:br/>
-        <w:t># Раздел II — API: GET /exists/&lt;key&gt; — проверить наличие ключа</w:t>
-        <w:br/>
-        <w:t># ==============================</w:t>
-        <w:br/>
-        <w:br/>
-        <w:t>@app.get("/exists/")</w:t>
-        <w:br/>
-        <w:t>def exists_without_key():</w:t>
-        <w:br/>
-        <w:t xml:space="preserve">    return error_response("Передайте ключ в адресе: /exists/&lt;key&gt;.", 400)</w:t>
-        <w:br/>
-        <w:br/>
-        <w:br/>
-        <w:t>@app.get("/exists/&lt;path:key&gt;")</w:t>
-        <w:br/>
-        <w:t>def exists(key: str):</w:t>
-        <w:br/>
-        <w:t xml:space="preserve">    key = normalize_key(key)</w:t>
-        <w:br/>
-        <w:t xml:space="preserve">    with data_lock:</w:t>
-        <w:br/>
-        <w:t xml:space="preserve">        key_exists = key in data</w:t>
-        <w:br/>
-        <w:br/>
-        <w:t xml:space="preserve">    return jsonify({</w:t>
-        <w:br/>
-        <w:t xml:space="preserve">        "ok": True,</w:t>
-        <w:br/>
-        <w:t xml:space="preserve">        "key": key,</w:t>
-        <w:br/>
-        <w:t xml:space="preserve">        "exists": key_exists,</w:t>
-        <w:br/>
-        <w:t xml:space="preserve">    })</w:t>
-      </w:r>
-    </w:p>
-    <w:p>
+        <w:pStyle w:val="ListNumber"/>
+        <w:spacing w:after="60"/>
+      </w:pPr>
       <w:r>
         <w:rPr>
           <w:rFonts w:ascii="Times New Roman" w:hAnsi="Times New Roman"/>
           <w:b w:val="0"/>
           <w:sz w:val="24"/>
         </w:rPr>
-        <w:t>Для проверки через Python создан client_demo.py. Он выполняет последовательность запросов: сохранить, получить, проверить наличие, удалить и повторно проверить ключ.</w:t>
+        <w:t>если операция изменяющая, словарь data обновляется;</w:t>
       </w:r>
     </w:p>
     <w:p>
       <w:pPr>
+        <w:pStyle w:val="ListNumber"/>
+        <w:spacing w:after="60"/>
+      </w:pPr>
+      <w:r>
+        <w:rPr>
+          <w:rFonts w:ascii="Times New Roman" w:hAnsi="Times New Roman"/>
+          <w:b w:val="0"/>
+          <w:sz w:val="24"/>
+        </w:rPr>
+        <w:t>после изменения вызывается save_data(), и новое состояние попадает в data.json;</w:t>
+      </w:r>
+    </w:p>
+    <w:p>
+      <w:pPr>
+        <w:pStyle w:val="ListNumber"/>
+        <w:spacing w:after="60"/>
+      </w:pPr>
+      <w:r>
+        <w:rPr>
+          <w:rFonts w:ascii="Times New Roman" w:hAnsi="Times New Roman"/>
+          <w:b w:val="0"/>
+          <w:sz w:val="24"/>
+        </w:rPr>
+        <w:t>сервер возвращает JSON-ответ с признаком ok, сообщением и полезными данными.</w:t>
+      </w:r>
+    </w:p>
+    <w:p>
+      <w:pPr>
+        <w:spacing w:after="80"/>
+        <w:ind w:firstLine="425"/>
+      </w:pPr>
+      <w:r>
+        <w:rPr>
+          <w:rFonts w:ascii="Times New Roman" w:hAnsi="Times New Roman"/>
+          <w:b w:val="0"/>
+          <w:sz w:val="24"/>
+        </w:rPr>
+        <w:t>Для защиты от одновременной записи используется RLock. В обычной демонстрации это почти незаметно, но с точки зрения надежности важно: если два запроса почти одновременно изменят словарь, блокировка не даст им одновременно записывать файл.</w:t>
+      </w:r>
+    </w:p>
+    <w:p>
+      <w:pPr>
+        <w:pStyle w:val="Heading1"/>
+      </w:pPr>
+      <w:r>
+        <w:rPr>
+          <w:rFonts w:ascii="Times New Roman" w:hAnsi="Times New Roman"/>
+          <w:b/>
+          <w:sz w:val="28"/>
+        </w:rPr>
+        <w:t>6. Реализация кода</w:t>
+      </w:r>
+    </w:p>
+    <w:p>
+      <w:pPr>
+        <w:spacing w:after="80"/>
+        <w:ind w:firstLine="425"/>
+      </w:pPr>
+      <w:r>
+        <w:rPr>
+          <w:rFonts w:ascii="Times New Roman" w:hAnsi="Times New Roman"/>
+          <w:b w:val="0"/>
+          <w:sz w:val="24"/>
+        </w:rPr>
+        <w:t>В начале файла расположен блок импортов с пояснением назначения библиотек. Это сделано специально, чтобы преподаватель при проверке видел, какая зависимость за что отвечает и где используется.</w:t>
+      </w:r>
+    </w:p>
+    <w:p>
+      <w:pPr>
         <w:shd w:fill="F2F5F9"/>
+        <w:spacing w:after="160"/>
+        <w:ind w:left="142" w:right="142"/>
       </w:pPr>
       <w:r>
         <w:rPr>
           <w:rFonts w:ascii="Courier New" w:hAnsi="Courier New"/>
+          <w:b w:val="0"/>
+          <w:sz w:val="17"/>
+        </w:rPr>
+        <w:t># Импорты</w:t>
+        <w:br/>
+        <w:t># json — для раздела II: загрузки и сохранения key-value данных в файле data.json</w:t>
+        <w:br/>
+        <w:t># os — для общей части: чтения переменных окружения DATA_FILE и FLASK_PORT</w:t>
+        <w:br/>
+        <w:t># pathlib.Path — для общей части: безопасной работы с путями к файлам проекта</w:t>
+        <w:br/>
+        <w:t># threading.RLock — для раздела II: защиты словаря data и файла data.json от одновременной записи</w:t>
+        <w:br/>
+        <w:t># typing.Any — для раздела II: описания значений, которые могут храниться в key-value хранилище</w:t>
+        <w:br/>
+        <w:t># flask — для раздела II: создания API-маршрутов, HTML-страницы и JSON-ответов</w:t>
+        <w:br/>
+        <w:t># flask_limiter — для раздела II: ограничения частоты запросов к API</w:t>
+        <w:br/>
+        <w:t># werkzeug.exceptions.HTTPException — для общей части: аккуратной обработки HTTP-ошибок</w:t>
+        <w:br/>
+        <w:br/>
+        <w:t>import json</w:t>
+        <w:br/>
+        <w:t>import os</w:t>
+        <w:br/>
+        <w:t>from pathlib import Path</w:t>
+        <w:br/>
+        <w:t>from threading import RLock</w:t>
+        <w:br/>
+        <w:t>from typing import Any</w:t>
+        <w:br/>
+        <w:br/>
+        <w:t>from flask import Flask, jsonify, render_template, request</w:t>
+        <w:br/>
+        <w:t>from flask_limiter import Limiter</w:t>
+        <w:br/>
+        <w:t>from flask_limiter.errors import RateLimitExceeded</w:t>
+        <w:br/>
+        <w:t>from flask_limiter.util import get_remote_address</w:t>
+        <w:br/>
+        <w:t>from werkzeug.exceptions import HTTPException</w:t>
+      </w:r>
+    </w:p>
+    <w:p>
+      <w:pPr>
+        <w:spacing w:after="80"/>
+        <w:ind w:firstLine="425"/>
+      </w:pPr>
+      <w:r>
+        <w:rPr>
+          <w:rFonts w:ascii="Times New Roman" w:hAnsi="Times New Roman"/>
+          <w:b w:val="0"/>
+          <w:sz w:val="24"/>
+        </w:rPr>
+        <w:t>Настройка приложения включает путь к data.json, создание Flask-приложения и настройку Limiter. Общий лимит задается в default_limits, а отдельные лимиты задаются непосредственно на маршрутах /set и /delete.</w:t>
+      </w:r>
+    </w:p>
+    <w:p>
+      <w:pPr>
+        <w:shd w:fill="F2F5F9"/>
+        <w:spacing w:after="160"/>
+        <w:ind w:left="142" w:right="142"/>
+      </w:pPr>
+      <w:r>
+        <w:rPr>
+          <w:rFonts w:ascii="Courier New" w:hAnsi="Courier New"/>
+          <w:b w:val="0"/>
+          <w:sz w:val="17"/>
+        </w:rPr>
+        <w:t>BASE_DIR = Path(__file__).resolve().parent</w:t>
+        <w:br/>
+        <w:t>DATA_FILE = Path(os.getenv("DATA_FILE", BASE_DIR / "data.json")).resolve()</w:t>
+        <w:br/>
+        <w:br/>
+        <w:t>app = Flask(__name__)</w:t>
+        <w:br/>
+        <w:br/>
+        <w:t># limiter ограничивает все маршруты общим правилом 100 запросов в сутки.</w:t>
+        <w:br/>
+        <w:t># Для POST /set и DELETE /delete/&lt;key&gt; ниже добавлены отдельные лимиты 10 запросов в минуту.</w:t>
+        <w:br/>
+        <w:t>limiter = Limiter(</w:t>
+        <w:br/>
+        <w:t xml:space="preserve">    key_func=get_remote_address,</w:t>
+        <w:br/>
+        <w:t xml:space="preserve">    app=app,</w:t>
+        <w:br/>
+        <w:t xml:space="preserve">    default_limits=["100 per day"],</w:t>
+        <w:br/>
+        <w:t xml:space="preserve">    storage_uri="memory://",</w:t>
+        <w:br/>
+        <w:t>)</w:t>
+        <w:br/>
+        <w:br/>
+        <w:t># data — основное key-value хранилище лабораторной работы.</w:t>
+        <w:br/>
+        <w:t># Ключ всегда строковый, значение может быть строкой, числом, списком, объектом JSON и т.д.</w:t>
+        <w:br/>
+        <w:t>data: dict[str, Any] = {}</w:t>
+        <w:br/>
+        <w:t>data_lock = RLock()</w:t>
+      </w:r>
+    </w:p>
+    <w:p>
+      <w:pPr>
+        <w:spacing w:after="80"/>
+        <w:ind w:firstLine="425"/>
+      </w:pPr>
+      <w:r>
+        <w:rPr>
+          <w:rFonts w:ascii="Times New Roman" w:hAnsi="Times New Roman"/>
+          <w:b w:val="0"/>
+          <w:sz w:val="24"/>
+        </w:rPr>
+        <w:t>Функции save_data() и load_data() отвечают за связь словаря data и файла data.json. Сохранение идет через временный файл: сначала данные записываются в .tmp, затем временный файл заменяет основной. Такой способ уменьшает риск повреждения data.json, если запись прервется.</w:t>
+      </w:r>
+    </w:p>
+    <w:p>
+      <w:pPr>
+        <w:shd w:fill="F2F5F9"/>
+        <w:spacing w:after="160"/>
+        <w:ind w:left="142" w:right="142"/>
+      </w:pPr>
+      <w:r>
+        <w:rPr>
+          <w:rFonts w:ascii="Courier New" w:hAnsi="Courier New"/>
+          <w:b w:val="0"/>
+          <w:sz w:val="17"/>
+        </w:rPr>
+        <w:t>def save_data() -&gt; None:</w:t>
+        <w:br/>
+        <w:t xml:space="preserve">    # После каждой изменяющей операции записываем актуальное состояние словаря data в data.json.</w:t>
+        <w:br/>
+        <w:t xml:space="preserve">    with data_lock:</w:t>
+        <w:br/>
+        <w:t xml:space="preserve">        DATA_FILE.parent.mkdir(parents=True, exist_ok=True)</w:t>
+        <w:br/>
+        <w:t xml:space="preserve">        temp_file = DATA_FILE.with_suffix(DATA_FILE.suffix + ".tmp")</w:t>
+        <w:br/>
+        <w:t xml:space="preserve">        temp_file.write_text(</w:t>
+        <w:br/>
+        <w:t xml:space="preserve">            json.dumps(data, ensure_ascii=False, indent=4, sort_keys=True),</w:t>
+        <w:br/>
+        <w:t xml:space="preserve">            encoding="utf-8",</w:t>
+        <w:br/>
+        <w:t xml:space="preserve">        )</w:t>
+        <w:br/>
+        <w:t xml:space="preserve">        temp_file.replace(DATA_FILE)</w:t>
+        <w:br/>
+        <w:br/>
+        <w:br/>
+        <w:t>def load_data() -&gt; None:</w:t>
+        <w:br/>
+        <w:t xml:space="preserve">    # При старте приложения автоматически загружаем data.json в словарь data.</w:t>
+        <w:br/>
+        <w:t xml:space="preserve">    with data_lock:</w:t>
+        <w:br/>
+        <w:t xml:space="preserve">        if not DATA_FILE.exists():</w:t>
+        <w:br/>
+        <w:t xml:space="preserve">            save_data()</w:t>
+        <w:br/>
+        <w:t xml:space="preserve">            return</w:t>
+        <w:br/>
+        <w:br/>
+        <w:t xml:space="preserve">        loaded_data = json.loads(DATA_FILE.read_text(encoding="utf-8"))</w:t>
+        <w:br/>
+        <w:t xml:space="preserve">        if not isinstance(loaded_data, dict):</w:t>
+        <w:br/>
+        <w:t xml:space="preserve">            raise RuntimeError("Файл data.json должен содержать JSON-объект с парами ключ-значение.")</w:t>
+        <w:br/>
+        <w:br/>
+        <w:t xml:space="preserve">        data.clear()</w:t>
+        <w:br/>
+        <w:t xml:space="preserve">        data.update(loaded_data)</w:t>
+        <w:br/>
+        <w:br/>
+        <w:br/>
+        <w:t>def current_snapshot() -&gt; dict[str, Any]:</w:t>
+        <w:br/>
+        <w:t xml:space="preserve">    # Отдаем копию словаря, чтобы шаблон или API-ответ не меняли основное хранилище напрямую.</w:t>
+        <w:br/>
+        <w:t xml:space="preserve">    with data_lock:</w:t>
+        <w:br/>
+        <w:t xml:space="preserve">        return dict(data)</w:t>
+      </w:r>
+    </w:p>
+    <w:p>
+      <w:pPr>
+        <w:spacing w:after="80"/>
+        <w:ind w:firstLine="425"/>
+      </w:pPr>
+      <w:r>
+        <w:rPr>
+          <w:rFonts w:ascii="Times New Roman" w:hAnsi="Times New Roman"/>
+          <w:b w:val="0"/>
+          <w:sz w:val="24"/>
+        </w:rPr>
+        <w:t>Проверка входных данных сделана отдельным блоком. request_payload() позволяет принимать и JSON-запросы, и HTML-формы. normalize_key() приводит ключ к аккуратному виду и запрещает пустые ключи. validate_value() проверяет, что значение можно сохранить в JSON.</w:t>
+      </w:r>
+    </w:p>
+    <w:p>
+      <w:pPr>
+        <w:shd w:fill="F2F5F9"/>
+        <w:spacing w:after="160"/>
+        <w:ind w:left="142" w:right="142"/>
+      </w:pPr>
+      <w:r>
+        <w:rPr>
+          <w:rFonts w:ascii="Courier New" w:hAnsi="Courier New"/>
+          <w:b w:val="0"/>
+          <w:sz w:val="17"/>
+        </w:rPr>
+        <w:t>def request_payload() -&gt; dict[str, Any]:</w:t>
+        <w:br/>
+        <w:t xml:space="preserve">    # API принимает JSON-запросы, а демонстрационная HTML-страница отправляет обычную form-data форму.</w:t>
+        <w:br/>
+        <w:t xml:space="preserve">    payload = request.get_json(silent=True) if request.is_json else None</w:t>
+        <w:br/>
+        <w:t xml:space="preserve">    if payload is None:</w:t>
+        <w:br/>
+        <w:t xml:space="preserve">        payload = request.form.to_dict()</w:t>
+        <w:br/>
+        <w:br/>
+        <w:t xml:space="preserve">    if not isinstance(payload, dict):</w:t>
+        <w:br/>
+        <w:t xml:space="preserve">        raise ValueError("Тело запроса должно быть JSON-объектом или HTML-формой.")</w:t>
+        <w:br/>
+        <w:t xml:space="preserve">    return payload</w:t>
+        <w:br/>
+        <w:br/>
+        <w:br/>
+        <w:t>def normalize_key(raw_key: Any) -&gt; str:</w:t>
+        <w:br/>
+        <w:t xml:space="preserve">    # Ключ приводится к строке и обрезается по краям, чтобы ' user ' и 'user' не считались разными ключами.</w:t>
+        <w:br/>
+        <w:t xml:space="preserve">    key = str(raw_key or "").strip()</w:t>
+        <w:br/>
+        <w:t xml:space="preserve">    if not key:</w:t>
+        <w:br/>
+        <w:t xml:space="preserve">        raise ValueError("Ключ обязателен.")</w:t>
+        <w:br/>
+        <w:t xml:space="preserve">    if len(key) &gt; 100:</w:t>
+        <w:br/>
+        <w:t xml:space="preserve">        raise ValueError("Ключ не должен быть длиннее 100 символов.")</w:t>
+        <w:br/>
+        <w:t xml:space="preserve">    return key</w:t>
+        <w:br/>
+        <w:br/>
+        <w:br/>
+        <w:t>def validate_value(value: Any) -&gt; Any:</w:t>
+        <w:br/>
+        <w:t xml:space="preserve">    # Значение должно сериализоваться в JSON, иначе его невозможно надежно сохранить в data.json.</w:t>
+        <w:br/>
+        <w:t xml:space="preserve">    try:</w:t>
+        <w:br/>
+        <w:t xml:space="preserve">        json.dumps(value, ensure_ascii=False)</w:t>
+        <w:br/>
+        <w:t xml:space="preserve">    except TypeError as error:</w:t>
+        <w:br/>
+        <w:t xml:space="preserve">        raise ValueError("Значение должно быть JSON-сериализуемым.") from error</w:t>
+        <w:br/>
+        <w:t xml:space="preserve">    return value</w:t>
+        <w:br/>
+        <w:br/>
+        <w:br/>
+        <w:t>def error_response(message: str, status_code: int):</w:t>
+        <w:br/>
+        <w:t xml:space="preserve">    # Единый формат ошибок помогает одинаково читать ответы в браузере, curl и Postman.</w:t>
+        <w:br/>
+        <w:t xml:space="preserve">    response = jsonify({</w:t>
+        <w:br/>
+        <w:t xml:space="preserve">        "ok": False,</w:t>
+        <w:br/>
+        <w:t xml:space="preserve">        "message": message,</w:t>
+        <w:br/>
+        <w:t xml:space="preserve">    })</w:t>
+        <w:br/>
+        <w:t xml:space="preserve">    return response, status_code</w:t>
+      </w:r>
+    </w:p>
+    <w:p>
+      <w:pPr>
+        <w:spacing w:after="80"/>
+        <w:ind w:firstLine="425"/>
+      </w:pPr>
+      <w:r>
+        <w:rPr>
+          <w:rFonts w:ascii="Times New Roman" w:hAnsi="Times New Roman"/>
+          <w:b w:val="0"/>
+          <w:sz w:val="24"/>
+        </w:rPr>
+        <w:t>Маршрут POST /set сохраняет пару ключ-значение. Если пользователь отправляет корректные данные, ключ записывается в словарь data, затем вызывается save_data(). Ответ содержит код 201, сохраненный ключ, значение и текущее количество элементов.</w:t>
+      </w:r>
+    </w:p>
+    <w:p>
+      <w:pPr>
+        <w:shd w:fill="F2F5F9"/>
+        <w:spacing w:after="160"/>
+        <w:ind w:left="142" w:right="142"/>
+      </w:pPr>
+      <w:r>
+        <w:rPr>
+          <w:rFonts w:ascii="Courier New" w:hAnsi="Courier New"/>
+          <w:b w:val="0"/>
+          <w:sz w:val="17"/>
+        </w:rPr>
+        <w:t>@app.post("/set")</w:t>
+        <w:br/>
+        <w:t>@limiter.limit("10 per minute", override_defaults=False)</w:t>
+        <w:br/>
+        <w:t>def set_value():</w:t>
+        <w:br/>
+        <w:t xml:space="preserve">    try:</w:t>
+        <w:br/>
+        <w:t xml:space="preserve">        payload = request_payload()</w:t>
+        <w:br/>
+        <w:t xml:space="preserve">        key = normalize_key(payload.get("key"))</w:t>
+        <w:br/>
+        <w:t xml:space="preserve">        if "value" not in payload:</w:t>
+        <w:br/>
+        <w:t xml:space="preserve">            raise ValueError("Значение обязательно.")</w:t>
+        <w:br/>
+        <w:br/>
+        <w:t xml:space="preserve">        value = validate_value(payload["value"])</w:t>
+        <w:br/>
+        <w:t xml:space="preserve">        with data_lock:</w:t>
+        <w:br/>
+        <w:t xml:space="preserve">            data[key] = value</w:t>
+        <w:br/>
+        <w:t xml:space="preserve">            save_data()</w:t>
+        <w:br/>
+        <w:br/>
+        <w:t xml:space="preserve">        return jsonify({</w:t>
+        <w:br/>
+        <w:t xml:space="preserve">            "ok": True,</w:t>
+        <w:br/>
+        <w:t xml:space="preserve">            "message": "Значение сохранено.",</w:t>
+        <w:br/>
+        <w:t xml:space="preserve">            "key": key,</w:t>
+        <w:br/>
+        <w:t xml:space="preserve">            "value": value,</w:t>
+        <w:br/>
+        <w:t xml:space="preserve">            "count": len(data),</w:t>
+        <w:br/>
+        <w:t xml:space="preserve">        }), 201</w:t>
+        <w:br/>
+        <w:t xml:space="preserve">    except ValueError as error:</w:t>
+        <w:br/>
+        <w:t xml:space="preserve">        return error_response(str(error), 400)</w:t>
+      </w:r>
+    </w:p>
+    <w:p>
+      <w:pPr>
+        <w:spacing w:after="80"/>
+        <w:ind w:firstLine="425"/>
+      </w:pPr>
+      <w:r>
+        <w:rPr>
+          <w:rFonts w:ascii="Times New Roman" w:hAnsi="Times New Roman"/>
+          <w:b w:val="0"/>
+          <w:sz w:val="24"/>
+        </w:rPr>
+        <w:t>Маршрут GET /get/&lt;key&gt; возвращает значение по ключу. Если ключ отсутствует, сервер не падает, а возвращает JSON-ошибку со статусом 404. Это важно для корректной работы API-клиентов.</w:t>
+      </w:r>
+    </w:p>
+    <w:p>
+      <w:pPr>
+        <w:shd w:fill="F2F5F9"/>
+        <w:spacing w:after="160"/>
+        <w:ind w:left="142" w:right="142"/>
+      </w:pPr>
+      <w:r>
+        <w:rPr>
+          <w:rFonts w:ascii="Courier New" w:hAnsi="Courier New"/>
+          <w:b w:val="0"/>
+          <w:sz w:val="17"/>
+        </w:rPr>
+        <w:t>@app.get("/get/")</w:t>
+        <w:br/>
+        <w:t>def get_value_without_key():</w:t>
+        <w:br/>
+        <w:t xml:space="preserve">    return error_response("Передайте ключ в адресе: /get/&lt;key&gt;.", 400)</w:t>
+        <w:br/>
+        <w:br/>
+        <w:br/>
+        <w:t>@app.get("/get/&lt;path:key&gt;")</w:t>
+        <w:br/>
+        <w:t>def get_value(key: str):</w:t>
+        <w:br/>
+        <w:t xml:space="preserve">    key = normalize_key(key)</w:t>
+        <w:br/>
+        <w:t xml:space="preserve">    with data_lock:</w:t>
+        <w:br/>
+        <w:t xml:space="preserve">        if key not in data:</w:t>
+        <w:br/>
+        <w:t xml:space="preserve">            return error_response("Ключ не найден.", 404)</w:t>
+        <w:br/>
+        <w:t xml:space="preserve">        value = data[key]</w:t>
+        <w:br/>
+        <w:br/>
+        <w:t xml:space="preserve">    return jsonify({</w:t>
+        <w:br/>
+        <w:t xml:space="preserve">        "ok": True,</w:t>
+        <w:br/>
+        <w:t xml:space="preserve">        "key": key,</w:t>
+        <w:br/>
+        <w:t xml:space="preserve">        "value": value,</w:t>
+        <w:br/>
+        <w:t xml:space="preserve">    })</w:t>
+      </w:r>
+    </w:p>
+    <w:p>
+      <w:pPr>
+        <w:spacing w:after="80"/>
+        <w:ind w:firstLine="425"/>
+      </w:pPr>
+      <w:r>
+        <w:rPr>
+          <w:rFonts w:ascii="Times New Roman" w:hAnsi="Times New Roman"/>
+          <w:b w:val="0"/>
+          <w:sz w:val="24"/>
+        </w:rPr>
+        <w:t>Маршрут DELETE /delete/&lt;key&gt; удаляет запись из словаря и также сохраняет файл. В ответе возвращается удаленное значение, чтобы было видно, что именно удалено.</w:t>
+      </w:r>
+    </w:p>
+    <w:p>
+      <w:pPr>
+        <w:shd w:fill="F2F5F9"/>
+        <w:spacing w:after="160"/>
+        <w:ind w:left="142" w:right="142"/>
+      </w:pPr>
+      <w:r>
+        <w:rPr>
+          <w:rFonts w:ascii="Courier New" w:hAnsi="Courier New"/>
+          <w:b w:val="0"/>
+          <w:sz w:val="17"/>
+        </w:rPr>
+        <w:t>@app.delete("/delete/")</w:t>
+        <w:br/>
+        <w:t>def delete_value_without_key():</w:t>
+        <w:br/>
+        <w:t xml:space="preserve">    return error_response("Передайте ключ в адресе: /delete/&lt;key&gt;.", 400)</w:t>
+        <w:br/>
+        <w:br/>
+        <w:br/>
+        <w:t>@app.delete("/delete/&lt;path:key&gt;")</w:t>
+        <w:br/>
+        <w:t>@limiter.limit("10 per minute", override_defaults=False)</w:t>
+        <w:br/>
+        <w:t>def delete_value(key: str):</w:t>
+        <w:br/>
+        <w:t xml:space="preserve">    key = normalize_key(key)</w:t>
+        <w:br/>
+        <w:t xml:space="preserve">    with data_lock:</w:t>
+        <w:br/>
+        <w:t xml:space="preserve">        if key not in data:</w:t>
+        <w:br/>
+        <w:t xml:space="preserve">            return error_response("Ключ не найден.", 404)</w:t>
+        <w:br/>
+        <w:t xml:space="preserve">        removed_value = data.pop(key)</w:t>
+        <w:br/>
+        <w:t xml:space="preserve">        save_data()</w:t>
+        <w:br/>
+        <w:br/>
+        <w:t xml:space="preserve">    return jsonify({</w:t>
+        <w:br/>
+        <w:t xml:space="preserve">        "ok": True,</w:t>
+        <w:br/>
+        <w:t xml:space="preserve">        "message": "Ключ удален.",</w:t>
+        <w:br/>
+        <w:t xml:space="preserve">        "key": key,</w:t>
+        <w:br/>
+        <w:t xml:space="preserve">        "removed_value": removed_value,</w:t>
+        <w:br/>
+        <w:t xml:space="preserve">        "count": len(data),</w:t>
+        <w:br/>
+        <w:t xml:space="preserve">    })</w:t>
+      </w:r>
+    </w:p>
+    <w:p>
+      <w:pPr>
+        <w:spacing w:after="80"/>
+        <w:ind w:firstLine="425"/>
+      </w:pPr>
+      <w:r>
+        <w:rPr>
+          <w:rFonts w:ascii="Times New Roman" w:hAnsi="Times New Roman"/>
+          <w:b w:val="0"/>
+          <w:sz w:val="24"/>
+        </w:rPr>
+        <w:t>Маршрут GET /exists/&lt;key&gt; не возвращает само значение, а только сообщает, есть ли ключ в хранилище. Это удобно, когда клиенту нужно проверить наличие записи без передачи данных.</w:t>
+      </w:r>
+    </w:p>
+    <w:p>
+      <w:pPr>
+        <w:shd w:fill="F2F5F9"/>
+        <w:spacing w:after="160"/>
+        <w:ind w:left="142" w:right="142"/>
+      </w:pPr>
+      <w:r>
+        <w:rPr>
+          <w:rFonts w:ascii="Courier New" w:hAnsi="Courier New"/>
+          <w:b w:val="0"/>
+          <w:sz w:val="17"/>
+        </w:rPr>
+        <w:t>@app.get("/exists/")</w:t>
+        <w:br/>
+        <w:t>def exists_without_key():</w:t>
+        <w:br/>
+        <w:t xml:space="preserve">    return error_response("Передайте ключ в адресе: /exists/&lt;key&gt;.", 400)</w:t>
+        <w:br/>
+        <w:br/>
+        <w:br/>
+        <w:t>@app.get("/exists/&lt;path:key&gt;")</w:t>
+        <w:br/>
+        <w:t>def exists(key: str):</w:t>
+        <w:br/>
+        <w:t xml:space="preserve">    key = normalize_key(key)</w:t>
+        <w:br/>
+        <w:t xml:space="preserve">    with data_lock:</w:t>
+        <w:br/>
+        <w:t xml:space="preserve">        key_exists = key in data</w:t>
+        <w:br/>
+        <w:br/>
+        <w:t xml:space="preserve">    return jsonify({</w:t>
+        <w:br/>
+        <w:t xml:space="preserve">        "ok": True,</w:t>
+        <w:br/>
+        <w:t xml:space="preserve">        "key": key,</w:t>
+        <w:br/>
+        <w:t xml:space="preserve">        "exists": key_exists,</w:t>
+        <w:br/>
+        <w:t xml:space="preserve">    })</w:t>
+      </w:r>
+    </w:p>
+    <w:p>
+      <w:pPr>
+        <w:spacing w:after="80"/>
+        <w:ind w:firstLine="425"/>
+      </w:pPr>
+      <w:r>
+        <w:rPr>
+          <w:rFonts w:ascii="Times New Roman" w:hAnsi="Times New Roman"/>
+          <w:b w:val="0"/>
+          <w:sz w:val="24"/>
+        </w:rPr>
+        <w:t>HTML-страница использует fetch-запросы к тем же API-маршрутам. Поэтому интерфейс в браузере не является отдельной логикой: он демонстрирует работу настоящего API.</w:t>
+      </w:r>
+    </w:p>
+    <w:p>
+      <w:pPr>
+        <w:shd w:fill="F2F5F9"/>
+        <w:spacing w:after="160"/>
+        <w:ind w:left="142" w:right="142"/>
+      </w:pPr>
+      <w:r>
+        <w:rPr>
+          <w:rFonts w:ascii="Courier New" w:hAnsi="Courier New"/>
+          <w:b w:val="0"/>
+          <w:sz w:val="17"/>
+        </w:rPr>
+        <w:t>&lt;script&gt;</w:t>
+        <w:br/>
+        <w:t xml:space="preserve">        const result = document.querySelector("#result");</w:t>
+        <w:br/>
+        <w:t xml:space="preserve">        const itemsBody = document.querySelector("#items-body");</w:t>
+        <w:br/>
+        <w:t xml:space="preserve">        const count = document.querySelector("#count");</w:t>
+        <w:br/>
+        <w:br/>
+        <w:t xml:space="preserve">        function showResponse(payload, status) {</w:t>
+        <w:br/>
+        <w:t xml:space="preserve">            result.textContent = JSON.stringify({ status, body: payload }, null, 4);</w:t>
+        <w:br/>
+        <w:t xml:space="preserve">            result.dataset.ok = String(status &gt;= 200 &amp;&amp; status &lt; 300);</w:t>
+        <w:br/>
+        <w:t xml:space="preserve">        }</w:t>
+        <w:br/>
+        <w:br/>
+        <w:t xml:space="preserve">        async function readJson(response) {</w:t>
+        <w:br/>
+        <w:t xml:space="preserve">            const payload = await response.json();</w:t>
+        <w:br/>
+        <w:t xml:space="preserve">            showResponse(payload, response.status);</w:t>
+        <w:br/>
+        <w:t xml:space="preserve">            await refreshTable();</w:t>
+        <w:br/>
+        <w:t xml:space="preserve">        }</w:t>
+        <w:br/>
+        <w:br/>
+        <w:t xml:space="preserve">        async function refreshTable() {</w:t>
+        <w:br/>
+        <w:t xml:space="preserve">            const response = await fetch("/all");</w:t>
+        <w:br/>
+        <w:t xml:space="preserve">            const payload = await response.json();</w:t>
+        <w:br/>
+        <w:t xml:space="preserve">            itemsBody.innerHTML = "";</w:t>
+        <w:br/>
+        <w:br/>
+        <w:t xml:space="preserve">            Object.entries(payload.data).forEach(([key, value]) =&gt; {</w:t>
+        <w:br/>
+        <w:t xml:space="preserve">                const row = document.createElement("tr");</w:t>
+        <w:br/>
+        <w:t xml:space="preserve">                const keyCell = document.createElement("td");</w:t>
+        <w:br/>
+        <w:t xml:space="preserve">                const valueCell = document.createElement("td");</w:t>
+        <w:br/>
+        <w:t xml:space="preserve">                keyCell.textContent = key;</w:t>
+        <w:br/>
+        <w:t xml:space="preserve">                valueCell.textContent = typeof value === "string" ? value : JSON.stringify(value);</w:t>
+        <w:br/>
+        <w:t xml:space="preserve">                row.append(keyCell, valueCell);</w:t>
+        <w:br/>
+        <w:t xml:space="preserve">                itemsBody.append(row);</w:t>
+        <w:br/>
+        <w:t xml:space="preserve">            });</w:t>
+        <w:br/>
+        <w:br/>
+        <w:t xml:space="preserve">            count.textContent = `${payload.count} ключа`;</w:t>
+        <w:br/>
+        <w:t xml:space="preserve">        }</w:t>
+        <w:br/>
+        <w:br/>
+        <w:t xml:space="preserve">        document.querySelector("#set-form").addEventListener("submit", async (event) =&gt; {</w:t>
+        <w:br/>
+        <w:t xml:space="preserve">            event.preventDefault();</w:t>
+        <w:br/>
+        <w:t xml:space="preserve">            const form = new FormData(event.currentTarget);</w:t>
+        <w:br/>
+        <w:t xml:space="preserve">            const response = await fetch("/set", {</w:t>
+        <w:br/>
+        <w:t xml:space="preserve">                method: "POST",</w:t>
+        <w:br/>
+        <w:t xml:space="preserve">                headers: { "Content-Type": "application/json" },</w:t>
+        <w:br/>
+        <w:t xml:space="preserve">                body: JSON.stringify({</w:t>
+        <w:br/>
+        <w:t xml:space="preserve">                    key: form.get("key"),</w:t>
+        <w:br/>
+        <w:t xml:space="preserve">                    value: form.get("value")</w:t>
+        <w:br/>
+        <w:t xml:space="preserve">                })</w:t>
+        <w:br/>
+        <w:t xml:space="preserve">            });</w:t>
+        <w:br/>
+        <w:t xml:space="preserve">            await readJson(response);</w:t>
+        <w:br/>
+        <w:t xml:space="preserve">        });</w:t>
+        <w:br/>
+        <w:br/>
+        <w:t xml:space="preserve">        document.querySelector("#key-form").addEventListener("click", async (event) =&gt; {</w:t>
+        <w:br/>
+        <w:t xml:space="preserve">            const action = event.target.dataset.action;</w:t>
+        <w:br/>
+        <w:t xml:space="preserve">            if (!action) {</w:t>
+        <w:br/>
+        <w:t xml:space="preserve">                return;</w:t>
+        <w:br/>
+        <w:t xml:space="preserve">            }</w:t>
+        <w:br/>
+        <w:br/>
+        <w:t xml:space="preserve">            const form = new FormData(event.currentTarget);</w:t>
+        <w:br/>
+        <w:t xml:space="preserve">            const key = encodeURIComponent(form.get("key"));</w:t>
+        <w:br/>
+        <w:t xml:space="preserve">            const route = action === "delete" ? `/delete/${key}` : `/${action}/${key}`;</w:t>
+        <w:br/>
+        <w:t xml:space="preserve">            const method = action === "delete" ? "DELETE" : "GET";</w:t>
+        <w:br/>
+        <w:t xml:space="preserve">            const response = await fetch(route, { method });</w:t>
+        <w:br/>
+        <w:t xml:space="preserve">            await readJson(response);</w:t>
+        <w:br/>
+        <w:t xml:space="preserve">        });</w:t>
+        <w:br/>
+        <w:t>&lt;/script&gt;</w:t>
+      </w:r>
+    </w:p>
+    <w:p>
+      <w:pPr>
+        <w:spacing w:after="80"/>
+        <w:ind w:firstLine="425"/>
+      </w:pPr>
+      <w:r>
+        <w:rPr>
+          <w:rFonts w:ascii="Times New Roman" w:hAnsi="Times New Roman"/>
+          <w:b w:val="0"/>
+          <w:sz w:val="24"/>
+        </w:rPr>
+        <w:t>Демонстрационный клиент client_demo.py использует requests. Он полезен для проверки, что приложение работает как API, а не только как страница в браузере.</w:t>
+      </w:r>
+    </w:p>
+    <w:p>
+      <w:pPr>
+        <w:shd w:fill="F2F5F9"/>
+        <w:spacing w:after="160"/>
+        <w:ind w:left="142" w:right="142"/>
+      </w:pPr>
+      <w:r>
+        <w:rPr>
+          <w:rFonts w:ascii="Courier New" w:hAnsi="Courier New"/>
+          <w:b w:val="0"/>
           <w:sz w:val="17"/>
         </w:rPr>
         <w:t># Импорты</w:t>
@@ -1113,8 +2403,886 @@
       <w:r>
         <w:rPr>
           <w:rFonts w:ascii="Times New Roman" w:hAnsi="Times New Roman"/>
+          <w:b/>
+          <w:sz w:val="28"/>
         </w:rPr>
-        <w:t>5. Демонстрация работы приложения</w:t>
+        <w:t>7. API и примеры запросов</w:t>
+      </w:r>
+    </w:p>
+    <w:tbl>
+      <w:tblPr>
+        <w:tblStyle w:val="TableGrid"/>
+        <w:tblW w:type="auto" w:w="0"/>
+        <w:tblLook w:firstColumn="1" w:firstRow="1" w:lastColumn="0" w:lastRow="0" w:noHBand="0" w:noVBand="1" w:val="04A0"/>
+      </w:tblPr>
+      <w:tblGrid>
+        <w:gridCol w:w="2493"/>
+        <w:gridCol w:w="2493"/>
+        <w:gridCol w:w="2493"/>
+        <w:gridCol w:w="2493"/>
+      </w:tblGrid>
+      <w:tr>
+        <w:tc>
+          <w:tcPr>
+            <w:tcW w:type="dxa" w:w="2493"/>
+          </w:tcPr>
+          <w:p>
+            <w:r>
+              <w:rPr>
+                <w:rFonts w:ascii="Times New Roman" w:hAnsi="Times New Roman"/>
+                <w:b/>
+                <w:sz w:val="24"/>
+              </w:rPr>
+              <w:t>Метод</w:t>
+            </w:r>
+          </w:p>
+        </w:tc>
+        <w:tc>
+          <w:tcPr>
+            <w:tcW w:type="dxa" w:w="2493"/>
+          </w:tcPr>
+          <w:p>
+            <w:r>
+              <w:rPr>
+                <w:rFonts w:ascii="Times New Roman" w:hAnsi="Times New Roman"/>
+                <w:b/>
+                <w:sz w:val="24"/>
+              </w:rPr>
+              <w:t>Маршрут</w:t>
+            </w:r>
+          </w:p>
+        </w:tc>
+        <w:tc>
+          <w:tcPr>
+            <w:tcW w:type="dxa" w:w="2493"/>
+          </w:tcPr>
+          <w:p>
+            <w:r>
+              <w:rPr>
+                <w:rFonts w:ascii="Times New Roman" w:hAnsi="Times New Roman"/>
+                <w:b/>
+                <w:sz w:val="24"/>
+              </w:rPr>
+              <w:t>Назначение</w:t>
+            </w:r>
+          </w:p>
+        </w:tc>
+        <w:tc>
+          <w:tcPr>
+            <w:tcW w:type="dxa" w:w="2493"/>
+          </w:tcPr>
+          <w:p>
+            <w:r>
+              <w:rPr>
+                <w:rFonts w:ascii="Times New Roman" w:hAnsi="Times New Roman"/>
+                <w:b/>
+                <w:sz w:val="24"/>
+              </w:rPr>
+              <w:t>Успешный статус</w:t>
+            </w:r>
+          </w:p>
+        </w:tc>
+      </w:tr>
+      <w:tr>
+        <w:tc>
+          <w:tcPr>
+            <w:tcW w:type="dxa" w:w="2493"/>
+          </w:tcPr>
+          <w:p>
+            <w:r>
+              <w:rPr>
+                <w:rFonts w:ascii="Times New Roman" w:hAnsi="Times New Roman"/>
+                <w:b w:val="0"/>
+                <w:sz w:val="24"/>
+              </w:rPr>
+              <w:t>POST</w:t>
+            </w:r>
+          </w:p>
+        </w:tc>
+        <w:tc>
+          <w:tcPr>
+            <w:tcW w:type="dxa" w:w="2493"/>
+          </w:tcPr>
+          <w:p>
+            <w:r>
+              <w:rPr>
+                <w:rFonts w:ascii="Times New Roman" w:hAnsi="Times New Roman"/>
+                <w:b w:val="0"/>
+                <w:sz w:val="24"/>
+              </w:rPr>
+              <w:t>/set</w:t>
+            </w:r>
+          </w:p>
+        </w:tc>
+        <w:tc>
+          <w:tcPr>
+            <w:tcW w:type="dxa" w:w="2493"/>
+          </w:tcPr>
+          <w:p>
+            <w:r>
+              <w:rPr>
+                <w:rFonts w:ascii="Times New Roman" w:hAnsi="Times New Roman"/>
+                <w:b w:val="0"/>
+                <w:sz w:val="24"/>
+              </w:rPr>
+              <w:t>Сохранить ключ и значение</w:t>
+            </w:r>
+          </w:p>
+        </w:tc>
+        <w:tc>
+          <w:tcPr>
+            <w:tcW w:type="dxa" w:w="2493"/>
+          </w:tcPr>
+          <w:p>
+            <w:r>
+              <w:rPr>
+                <w:rFonts w:ascii="Times New Roman" w:hAnsi="Times New Roman"/>
+                <w:b w:val="0"/>
+                <w:sz w:val="24"/>
+              </w:rPr>
+              <w:t>201 Created</w:t>
+            </w:r>
+          </w:p>
+        </w:tc>
+      </w:tr>
+      <w:tr>
+        <w:tc>
+          <w:tcPr>
+            <w:tcW w:type="dxa" w:w="2493"/>
+          </w:tcPr>
+          <w:p>
+            <w:r>
+              <w:rPr>
+                <w:rFonts w:ascii="Times New Roman" w:hAnsi="Times New Roman"/>
+                <w:b w:val="0"/>
+                <w:sz w:val="24"/>
+              </w:rPr>
+              <w:t>GET</w:t>
+            </w:r>
+          </w:p>
+        </w:tc>
+        <w:tc>
+          <w:tcPr>
+            <w:tcW w:type="dxa" w:w="2493"/>
+          </w:tcPr>
+          <w:p>
+            <w:r>
+              <w:rPr>
+                <w:rFonts w:ascii="Times New Roman" w:hAnsi="Times New Roman"/>
+                <w:b w:val="0"/>
+                <w:sz w:val="24"/>
+              </w:rPr>
+              <w:t>/get/&lt;key&gt;</w:t>
+            </w:r>
+          </w:p>
+        </w:tc>
+        <w:tc>
+          <w:tcPr>
+            <w:tcW w:type="dxa" w:w="2493"/>
+          </w:tcPr>
+          <w:p>
+            <w:r>
+              <w:rPr>
+                <w:rFonts w:ascii="Times New Roman" w:hAnsi="Times New Roman"/>
+                <w:b w:val="0"/>
+                <w:sz w:val="24"/>
+              </w:rPr>
+              <w:t>Получить значение по ключу</w:t>
+            </w:r>
+          </w:p>
+        </w:tc>
+        <w:tc>
+          <w:tcPr>
+            <w:tcW w:type="dxa" w:w="2493"/>
+          </w:tcPr>
+          <w:p>
+            <w:r>
+              <w:rPr>
+                <w:rFonts w:ascii="Times New Roman" w:hAnsi="Times New Roman"/>
+                <w:b w:val="0"/>
+                <w:sz w:val="24"/>
+              </w:rPr>
+              <w:t>200 OK</w:t>
+            </w:r>
+          </w:p>
+        </w:tc>
+      </w:tr>
+      <w:tr>
+        <w:tc>
+          <w:tcPr>
+            <w:tcW w:type="dxa" w:w="2493"/>
+          </w:tcPr>
+          <w:p>
+            <w:r>
+              <w:rPr>
+                <w:rFonts w:ascii="Times New Roman" w:hAnsi="Times New Roman"/>
+                <w:b w:val="0"/>
+                <w:sz w:val="24"/>
+              </w:rPr>
+              <w:t>DELETE</w:t>
+            </w:r>
+          </w:p>
+        </w:tc>
+        <w:tc>
+          <w:tcPr>
+            <w:tcW w:type="dxa" w:w="2493"/>
+          </w:tcPr>
+          <w:p>
+            <w:r>
+              <w:rPr>
+                <w:rFonts w:ascii="Times New Roman" w:hAnsi="Times New Roman"/>
+                <w:b w:val="0"/>
+                <w:sz w:val="24"/>
+              </w:rPr>
+              <w:t>/delete/&lt;key&gt;</w:t>
+            </w:r>
+          </w:p>
+        </w:tc>
+        <w:tc>
+          <w:tcPr>
+            <w:tcW w:type="dxa" w:w="2493"/>
+          </w:tcPr>
+          <w:p>
+            <w:r>
+              <w:rPr>
+                <w:rFonts w:ascii="Times New Roman" w:hAnsi="Times New Roman"/>
+                <w:b w:val="0"/>
+                <w:sz w:val="24"/>
+              </w:rPr>
+              <w:t>Удалить ключ</w:t>
+            </w:r>
+          </w:p>
+        </w:tc>
+        <w:tc>
+          <w:tcPr>
+            <w:tcW w:type="dxa" w:w="2493"/>
+          </w:tcPr>
+          <w:p>
+            <w:r>
+              <w:rPr>
+                <w:rFonts w:ascii="Times New Roman" w:hAnsi="Times New Roman"/>
+                <w:b w:val="0"/>
+                <w:sz w:val="24"/>
+              </w:rPr>
+              <w:t>200 OK</w:t>
+            </w:r>
+          </w:p>
+        </w:tc>
+      </w:tr>
+      <w:tr>
+        <w:tc>
+          <w:tcPr>
+            <w:tcW w:type="dxa" w:w="2493"/>
+          </w:tcPr>
+          <w:p>
+            <w:r>
+              <w:rPr>
+                <w:rFonts w:ascii="Times New Roman" w:hAnsi="Times New Roman"/>
+                <w:b w:val="0"/>
+                <w:sz w:val="24"/>
+              </w:rPr>
+              <w:t>GET</w:t>
+            </w:r>
+          </w:p>
+        </w:tc>
+        <w:tc>
+          <w:tcPr>
+            <w:tcW w:type="dxa" w:w="2493"/>
+          </w:tcPr>
+          <w:p>
+            <w:r>
+              <w:rPr>
+                <w:rFonts w:ascii="Times New Roman" w:hAnsi="Times New Roman"/>
+                <w:b w:val="0"/>
+                <w:sz w:val="24"/>
+              </w:rPr>
+              <w:t>/exists/&lt;key&gt;</w:t>
+            </w:r>
+          </w:p>
+        </w:tc>
+        <w:tc>
+          <w:tcPr>
+            <w:tcW w:type="dxa" w:w="2493"/>
+          </w:tcPr>
+          <w:p>
+            <w:r>
+              <w:rPr>
+                <w:rFonts w:ascii="Times New Roman" w:hAnsi="Times New Roman"/>
+                <w:b w:val="0"/>
+                <w:sz w:val="24"/>
+              </w:rPr>
+              <w:t>Проверить наличие ключа</w:t>
+            </w:r>
+          </w:p>
+        </w:tc>
+        <w:tc>
+          <w:tcPr>
+            <w:tcW w:type="dxa" w:w="2493"/>
+          </w:tcPr>
+          <w:p>
+            <w:r>
+              <w:rPr>
+                <w:rFonts w:ascii="Times New Roman" w:hAnsi="Times New Roman"/>
+                <w:b w:val="0"/>
+                <w:sz w:val="24"/>
+              </w:rPr>
+              <w:t>200 OK</w:t>
+            </w:r>
+          </w:p>
+        </w:tc>
+      </w:tr>
+      <w:tr>
+        <w:tc>
+          <w:tcPr>
+            <w:tcW w:type="dxa" w:w="2493"/>
+          </w:tcPr>
+          <w:p>
+            <w:r>
+              <w:rPr>
+                <w:rFonts w:ascii="Times New Roman" w:hAnsi="Times New Roman"/>
+                <w:b w:val="0"/>
+                <w:sz w:val="24"/>
+              </w:rPr>
+              <w:t>GET</w:t>
+            </w:r>
+          </w:p>
+        </w:tc>
+        <w:tc>
+          <w:tcPr>
+            <w:tcW w:type="dxa" w:w="2493"/>
+          </w:tcPr>
+          <w:p>
+            <w:r>
+              <w:rPr>
+                <w:rFonts w:ascii="Times New Roman" w:hAnsi="Times New Roman"/>
+                <w:b w:val="0"/>
+                <w:sz w:val="24"/>
+              </w:rPr>
+              <w:t>/all</w:t>
+            </w:r>
+          </w:p>
+        </w:tc>
+        <w:tc>
+          <w:tcPr>
+            <w:tcW w:type="dxa" w:w="2493"/>
+          </w:tcPr>
+          <w:p>
+            <w:r>
+              <w:rPr>
+                <w:rFonts w:ascii="Times New Roman" w:hAnsi="Times New Roman"/>
+                <w:b w:val="0"/>
+                <w:sz w:val="24"/>
+              </w:rPr>
+              <w:t>Получить все данные для демонстрационной страницы</w:t>
+            </w:r>
+          </w:p>
+        </w:tc>
+        <w:tc>
+          <w:tcPr>
+            <w:tcW w:type="dxa" w:w="2493"/>
+          </w:tcPr>
+          <w:p>
+            <w:r>
+              <w:rPr>
+                <w:rFonts w:ascii="Times New Roman" w:hAnsi="Times New Roman"/>
+                <w:b w:val="0"/>
+                <w:sz w:val="24"/>
+              </w:rPr>
+              <w:t>200 OK</w:t>
+            </w:r>
+          </w:p>
+        </w:tc>
+      </w:tr>
+    </w:tbl>
+    <w:p/>
+    <w:p>
+      <w:pPr>
+        <w:spacing w:after="80"/>
+        <w:ind w:firstLine="425"/>
+      </w:pPr>
+      <w:r>
+        <w:rPr>
+          <w:rFonts w:ascii="Times New Roman" w:hAnsi="Times New Roman"/>
+          <w:b w:val="0"/>
+          <w:sz w:val="24"/>
+        </w:rPr>
+        <w:t>Пример сохранения значения:</w:t>
+      </w:r>
+    </w:p>
+    <w:p>
+      <w:pPr>
+        <w:shd w:fill="F2F5F9"/>
+        <w:spacing w:after="160"/>
+        <w:ind w:left="142" w:right="142"/>
+      </w:pPr>
+      <w:r>
+        <w:rPr>
+          <w:rFonts w:ascii="Courier New" w:hAnsi="Courier New"/>
+          <w:b w:val="0"/>
+          <w:sz w:val="17"/>
+        </w:rPr>
+        <w:t>curl -i -X POST http://127.0.0.1:5000/set -H "Content-Type: application/json" -d "{\"key\":\"student\",\"value\":\"ФБИ\"}"</w:t>
+      </w:r>
+    </w:p>
+    <w:p>
+      <w:pPr>
+        <w:spacing w:after="80"/>
+        <w:ind w:firstLine="425"/>
+      </w:pPr>
+      <w:r>
+        <w:rPr>
+          <w:rFonts w:ascii="Times New Roman" w:hAnsi="Times New Roman"/>
+          <w:b w:val="0"/>
+          <w:sz w:val="24"/>
+        </w:rPr>
+        <w:t>Ожидаемый ответ:</w:t>
+      </w:r>
+    </w:p>
+    <w:p>
+      <w:pPr>
+        <w:shd w:fill="F2F5F9"/>
+        <w:spacing w:after="160"/>
+        <w:ind w:left="142" w:right="142"/>
+      </w:pPr>
+      <w:r>
+        <w:rPr>
+          <w:rFonts w:ascii="Courier New" w:hAnsi="Courier New"/>
+          <w:b w:val="0"/>
+          <w:sz w:val="17"/>
+        </w:rPr>
+        <w:t>{</w:t>
+        <w:br/>
+        <w:t xml:space="preserve">    "ok": true,</w:t>
+        <w:br/>
+        <w:t xml:space="preserve">    "message": "Значение сохранено.",</w:t>
+        <w:br/>
+        <w:t xml:space="preserve">    "key": "student",</w:t>
+        <w:br/>
+        <w:t xml:space="preserve">    "value": "ФБИ"</w:t>
+        <w:br/>
+        <w:t>}</w:t>
+      </w:r>
+    </w:p>
+    <w:p>
+      <w:pPr>
+        <w:spacing w:after="80"/>
+        <w:ind w:firstLine="425"/>
+      </w:pPr>
+      <w:r>
+        <w:rPr>
+          <w:rFonts w:ascii="Times New Roman" w:hAnsi="Times New Roman"/>
+          <w:b w:val="0"/>
+          <w:sz w:val="24"/>
+        </w:rPr>
+        <w:t>Пример получения значения:</w:t>
+      </w:r>
+    </w:p>
+    <w:p>
+      <w:pPr>
+        <w:shd w:fill="F2F5F9"/>
+        <w:spacing w:after="160"/>
+        <w:ind w:left="142" w:right="142"/>
+      </w:pPr>
+      <w:r>
+        <w:rPr>
+          <w:rFonts w:ascii="Courier New" w:hAnsi="Courier New"/>
+          <w:b w:val="0"/>
+          <w:sz w:val="17"/>
+        </w:rPr>
+        <w:t>curl -i http://127.0.0.1:5000/get/student</w:t>
+      </w:r>
+    </w:p>
+    <w:p>
+      <w:pPr>
+        <w:spacing w:after="80"/>
+        <w:ind w:firstLine="425"/>
+      </w:pPr>
+      <w:r>
+        <w:rPr>
+          <w:rFonts w:ascii="Times New Roman" w:hAnsi="Times New Roman"/>
+          <w:b w:val="0"/>
+          <w:sz w:val="24"/>
+        </w:rPr>
+        <w:t>Пример проверки существования:</w:t>
+      </w:r>
+    </w:p>
+    <w:p>
+      <w:pPr>
+        <w:shd w:fill="F2F5F9"/>
+        <w:spacing w:after="160"/>
+        <w:ind w:left="142" w:right="142"/>
+      </w:pPr>
+      <w:r>
+        <w:rPr>
+          <w:rFonts w:ascii="Courier New" w:hAnsi="Courier New"/>
+          <w:b w:val="0"/>
+          <w:sz w:val="17"/>
+        </w:rPr>
+        <w:t>curl -i http://127.0.0.1:5000/exists/student</w:t>
+      </w:r>
+    </w:p>
+    <w:p>
+      <w:pPr>
+        <w:spacing w:after="80"/>
+        <w:ind w:firstLine="425"/>
+      </w:pPr>
+      <w:r>
+        <w:rPr>
+          <w:rFonts w:ascii="Times New Roman" w:hAnsi="Times New Roman"/>
+          <w:b w:val="0"/>
+          <w:sz w:val="24"/>
+        </w:rPr>
+        <w:t>Пример удаления:</w:t>
+      </w:r>
+    </w:p>
+    <w:p>
+      <w:pPr>
+        <w:shd w:fill="F2F5F9"/>
+        <w:spacing w:after="160"/>
+        <w:ind w:left="142" w:right="142"/>
+      </w:pPr>
+      <w:r>
+        <w:rPr>
+          <w:rFonts w:ascii="Courier New" w:hAnsi="Courier New"/>
+          <w:b w:val="0"/>
+          <w:sz w:val="17"/>
+        </w:rPr>
+        <w:t>curl -i -X DELETE http://127.0.0.1:5000/delete/student</w:t>
+      </w:r>
+    </w:p>
+    <w:p>
+      <w:pPr>
+        <w:pStyle w:val="Heading1"/>
+      </w:pPr>
+      <w:r>
+        <w:rPr>
+          <w:rFonts w:ascii="Times New Roman" w:hAnsi="Times New Roman"/>
+          <w:b/>
+          <w:sz w:val="28"/>
+        </w:rPr>
+        <w:t>8. Обработка ошибок</w:t>
+      </w:r>
+    </w:p>
+    <w:p>
+      <w:pPr>
+        <w:spacing w:after="80"/>
+        <w:ind w:firstLine="425"/>
+      </w:pPr>
+      <w:r>
+        <w:rPr>
+          <w:rFonts w:ascii="Times New Roman" w:hAnsi="Times New Roman"/>
+          <w:b w:val="0"/>
+          <w:sz w:val="24"/>
+        </w:rPr>
+        <w:t>Ошибки API возвращаются в едином формате: ok=false и message с объяснением. Благодаря этому преподаватель или любой пользователь может быстро понять, что именно пошло не так. Например, если ключ не передан, сервер возвращает статус 400. Если ключ не найден, возвращается статус 404. Если лимит запросов превышен, возвращается статус 429.</w:t>
+      </w:r>
+    </w:p>
+    <w:tbl>
+      <w:tblPr>
+        <w:tblStyle w:val="TableGrid"/>
+        <w:tblW w:type="auto" w:w="0"/>
+        <w:tblLook w:firstColumn="1" w:firstRow="1" w:lastColumn="0" w:lastRow="0" w:noHBand="0" w:noVBand="1" w:val="04A0"/>
+      </w:tblPr>
+      <w:tblGrid>
+        <w:gridCol w:w="3324"/>
+        <w:gridCol w:w="3324"/>
+        <w:gridCol w:w="3324"/>
+      </w:tblGrid>
+      <w:tr>
+        <w:tc>
+          <w:tcPr>
+            <w:tcW w:type="dxa" w:w="3324"/>
+          </w:tcPr>
+          <w:p>
+            <w:r>
+              <w:rPr>
+                <w:rFonts w:ascii="Times New Roman" w:hAnsi="Times New Roman"/>
+                <w:b/>
+                <w:sz w:val="24"/>
+              </w:rPr>
+              <w:t>Ситуация</w:t>
+            </w:r>
+          </w:p>
+        </w:tc>
+        <w:tc>
+          <w:tcPr>
+            <w:tcW w:type="dxa" w:w="3324"/>
+          </w:tcPr>
+          <w:p>
+            <w:r>
+              <w:rPr>
+                <w:rFonts w:ascii="Times New Roman" w:hAnsi="Times New Roman"/>
+                <w:b/>
+                <w:sz w:val="24"/>
+              </w:rPr>
+              <w:t>Статус</w:t>
+            </w:r>
+          </w:p>
+        </w:tc>
+        <w:tc>
+          <w:tcPr>
+            <w:tcW w:type="dxa" w:w="3324"/>
+          </w:tcPr>
+          <w:p>
+            <w:r>
+              <w:rPr>
+                <w:rFonts w:ascii="Times New Roman" w:hAnsi="Times New Roman"/>
+                <w:b/>
+                <w:sz w:val="24"/>
+              </w:rPr>
+              <w:t>Пояснение</w:t>
+            </w:r>
+          </w:p>
+        </w:tc>
+      </w:tr>
+      <w:tr>
+        <w:tc>
+          <w:tcPr>
+            <w:tcW w:type="dxa" w:w="3324"/>
+          </w:tcPr>
+          <w:p>
+            <w:r>
+              <w:rPr>
+                <w:rFonts w:ascii="Times New Roman" w:hAnsi="Times New Roman"/>
+                <w:b w:val="0"/>
+                <w:sz w:val="24"/>
+              </w:rPr>
+              <w:t>Пустой ключ при /set</w:t>
+            </w:r>
+          </w:p>
+        </w:tc>
+        <w:tc>
+          <w:tcPr>
+            <w:tcW w:type="dxa" w:w="3324"/>
+          </w:tcPr>
+          <w:p>
+            <w:r>
+              <w:rPr>
+                <w:rFonts w:ascii="Times New Roman" w:hAnsi="Times New Roman"/>
+                <w:b w:val="0"/>
+                <w:sz w:val="24"/>
+              </w:rPr>
+              <w:t>400</w:t>
+            </w:r>
+          </w:p>
+        </w:tc>
+        <w:tc>
+          <w:tcPr>
+            <w:tcW w:type="dxa" w:w="3324"/>
+          </w:tcPr>
+          <w:p>
+            <w:r>
+              <w:rPr>
+                <w:rFonts w:ascii="Times New Roman" w:hAnsi="Times New Roman"/>
+                <w:b w:val="0"/>
+                <w:sz w:val="24"/>
+              </w:rPr>
+              <w:t>Ключ обязателен, поэтому запись не создается.</w:t>
+            </w:r>
+          </w:p>
+        </w:tc>
+      </w:tr>
+      <w:tr>
+        <w:tc>
+          <w:tcPr>
+            <w:tcW w:type="dxa" w:w="3324"/>
+          </w:tcPr>
+          <w:p>
+            <w:r>
+              <w:rPr>
+                <w:rFonts w:ascii="Times New Roman" w:hAnsi="Times New Roman"/>
+                <w:b w:val="0"/>
+                <w:sz w:val="24"/>
+              </w:rPr>
+              <w:t>Нет value при /set</w:t>
+            </w:r>
+          </w:p>
+        </w:tc>
+        <w:tc>
+          <w:tcPr>
+            <w:tcW w:type="dxa" w:w="3324"/>
+          </w:tcPr>
+          <w:p>
+            <w:r>
+              <w:rPr>
+                <w:rFonts w:ascii="Times New Roman" w:hAnsi="Times New Roman"/>
+                <w:b w:val="0"/>
+                <w:sz w:val="24"/>
+              </w:rPr>
+              <w:t>400</w:t>
+            </w:r>
+          </w:p>
+        </w:tc>
+        <w:tc>
+          <w:tcPr>
+            <w:tcW w:type="dxa" w:w="3324"/>
+          </w:tcPr>
+          <w:p>
+            <w:r>
+              <w:rPr>
+                <w:rFonts w:ascii="Times New Roman" w:hAnsi="Times New Roman"/>
+                <w:b w:val="0"/>
+                <w:sz w:val="24"/>
+              </w:rPr>
+              <w:t>Значение обязательно для сохранения пары ключ-значение.</w:t>
+            </w:r>
+          </w:p>
+        </w:tc>
+      </w:tr>
+      <w:tr>
+        <w:tc>
+          <w:tcPr>
+            <w:tcW w:type="dxa" w:w="3324"/>
+          </w:tcPr>
+          <w:p>
+            <w:r>
+              <w:rPr>
+                <w:rFonts w:ascii="Times New Roman" w:hAnsi="Times New Roman"/>
+                <w:b w:val="0"/>
+                <w:sz w:val="24"/>
+              </w:rPr>
+              <w:t>Ключ не найден при /get</w:t>
+            </w:r>
+          </w:p>
+        </w:tc>
+        <w:tc>
+          <w:tcPr>
+            <w:tcW w:type="dxa" w:w="3324"/>
+          </w:tcPr>
+          <w:p>
+            <w:r>
+              <w:rPr>
+                <w:rFonts w:ascii="Times New Roman" w:hAnsi="Times New Roman"/>
+                <w:b w:val="0"/>
+                <w:sz w:val="24"/>
+              </w:rPr>
+              <w:t>404</w:t>
+            </w:r>
+          </w:p>
+        </w:tc>
+        <w:tc>
+          <w:tcPr>
+            <w:tcW w:type="dxa" w:w="3324"/>
+          </w:tcPr>
+          <w:p>
+            <w:r>
+              <w:rPr>
+                <w:rFonts w:ascii="Times New Roman" w:hAnsi="Times New Roman"/>
+                <w:b w:val="0"/>
+                <w:sz w:val="24"/>
+              </w:rPr>
+              <w:t>Сервер сообщает, что такой записи нет.</w:t>
+            </w:r>
+          </w:p>
+        </w:tc>
+      </w:tr>
+      <w:tr>
+        <w:tc>
+          <w:tcPr>
+            <w:tcW w:type="dxa" w:w="3324"/>
+          </w:tcPr>
+          <w:p>
+            <w:r>
+              <w:rPr>
+                <w:rFonts w:ascii="Times New Roman" w:hAnsi="Times New Roman"/>
+                <w:b w:val="0"/>
+                <w:sz w:val="24"/>
+              </w:rPr>
+              <w:t>Ключ не найден при /delete</w:t>
+            </w:r>
+          </w:p>
+        </w:tc>
+        <w:tc>
+          <w:tcPr>
+            <w:tcW w:type="dxa" w:w="3324"/>
+          </w:tcPr>
+          <w:p>
+            <w:r>
+              <w:rPr>
+                <w:rFonts w:ascii="Times New Roman" w:hAnsi="Times New Roman"/>
+                <w:b w:val="0"/>
+                <w:sz w:val="24"/>
+              </w:rPr>
+              <w:t>404</w:t>
+            </w:r>
+          </w:p>
+        </w:tc>
+        <w:tc>
+          <w:tcPr>
+            <w:tcW w:type="dxa" w:w="3324"/>
+          </w:tcPr>
+          <w:p>
+            <w:r>
+              <w:rPr>
+                <w:rFonts w:ascii="Times New Roman" w:hAnsi="Times New Roman"/>
+                <w:b w:val="0"/>
+                <w:sz w:val="24"/>
+              </w:rPr>
+              <w:t>Нельзя удалить запись, которой нет в хранилище.</w:t>
+            </w:r>
+          </w:p>
+        </w:tc>
+      </w:tr>
+      <w:tr>
+        <w:tc>
+          <w:tcPr>
+            <w:tcW w:type="dxa" w:w="3324"/>
+          </w:tcPr>
+          <w:p>
+            <w:r>
+              <w:rPr>
+                <w:rFonts w:ascii="Times New Roman" w:hAnsi="Times New Roman"/>
+                <w:b w:val="0"/>
+                <w:sz w:val="24"/>
+              </w:rPr>
+              <w:t>Превышен лимит</w:t>
+            </w:r>
+          </w:p>
+        </w:tc>
+        <w:tc>
+          <w:tcPr>
+            <w:tcW w:type="dxa" w:w="3324"/>
+          </w:tcPr>
+          <w:p>
+            <w:r>
+              <w:rPr>
+                <w:rFonts w:ascii="Times New Roman" w:hAnsi="Times New Roman"/>
+                <w:b w:val="0"/>
+                <w:sz w:val="24"/>
+              </w:rPr>
+              <w:t>429</w:t>
+            </w:r>
+          </w:p>
+        </w:tc>
+        <w:tc>
+          <w:tcPr>
+            <w:tcW w:type="dxa" w:w="3324"/>
+          </w:tcPr>
+          <w:p>
+            <w:r>
+              <w:rPr>
+                <w:rFonts w:ascii="Times New Roman" w:hAnsi="Times New Roman"/>
+                <w:b w:val="0"/>
+                <w:sz w:val="24"/>
+              </w:rPr>
+              <w:t>Flask-Limiter блокирует слишком частые запросы.</w:t>
+            </w:r>
+          </w:p>
+        </w:tc>
+      </w:tr>
+    </w:tbl>
+    <w:p/>
+    <w:p>
+      <w:pPr>
+        <w:pStyle w:val="Heading1"/>
+      </w:pPr>
+      <w:r>
+        <w:rPr>
+          <w:rFonts w:ascii="Times New Roman" w:hAnsi="Times New Roman"/>
+          <w:b/>
+          <w:sz w:val="28"/>
+        </w:rPr>
+        <w:t>9. Демонстрация работы приложения</w:t>
       </w:r>
     </w:p>
     <w:p>
@@ -1137,7 +3305,7 @@
                     <pic:cNvPicPr/>
                   </pic:nvPicPr>
                   <pic:blipFill>
-                    <a:blip r:embed="rId10"/>
+                    <a:blip r:embed="rId11"/>
                     <a:stretch>
                       <a:fillRect/>
                     </a:stretch>
@@ -1171,13 +3339,17 @@
       </w:r>
     </w:p>
     <w:p>
+      <w:pPr>
+        <w:spacing w:after="80"/>
+        <w:ind w:firstLine="425"/>
+      </w:pPr>
       <w:r>
         <w:rPr>
           <w:rFonts w:ascii="Times New Roman" w:hAnsi="Times New Roman"/>
           <w:b w:val="0"/>
           <w:sz w:val="24"/>
         </w:rPr>
-        <w:t>На главной странице показаны формы для сохранения значения и операций с ключом. В правой части шапки отображаются установленные ограничения: 100 запросов в сутки и 10 запросов в минуту для изменяющих операций.</w:t>
+        <w:t>На главной странице расположены две формы: слева форма сохранения значения через POST /set, справа блок операций с ключом. Ниже находится область JSON-ответа сервера и таблица текущих данных. В шапке явно указаны ограничения: общий лимит 100 запросов в сутки и отдельный лимит 10 запросов в минуту для /set и /delete.</w:t>
       </w:r>
     </w:p>
     <w:p>
@@ -1200,7 +3372,7 @@
                     <pic:cNvPicPr/>
                   </pic:nvPicPr>
                   <pic:blipFill>
-                    <a:blip r:embed="rId11"/>
+                    <a:blip r:embed="rId12"/>
                     <a:stretch>
                       <a:fillRect/>
                     </a:stretch>
@@ -1234,13 +3406,17 @@
       </w:r>
     </w:p>
     <w:p>
+      <w:pPr>
+        <w:spacing w:after="80"/>
+        <w:ind w:firstLine="425"/>
+      </w:pPr>
       <w:r>
         <w:rPr>
           <w:rFonts w:ascii="Times New Roman" w:hAnsi="Times New Roman"/>
           <w:b w:val="0"/>
           <w:sz w:val="24"/>
         </w:rPr>
-        <w:t>Введен ключ student и значение «ФБИ-24, лабораторная работа 8». Сервер вернул статус 201, сообщение об успешном сохранении и обновил таблицу текущих данных. Это подтверждает работу маршрута POST /set и запись пары ключ-значение.</w:t>
+        <w:t>Введен ключ student и значение «ФБИ-24, лабораторная работа 8». Сервер вернул статус 201, ok=true, сообщение об успешном сохранении, сам ключ и значение. В таблице текущих данных появилась новая строка student, что подтверждает изменение словаря data. Так как операция изменяющая, после нее также обновляется data.json.</w:t>
       </w:r>
     </w:p>
     <w:p>
@@ -1260,69 +3436,6 @@
                 <pic:pic>
                   <pic:nvPicPr>
                     <pic:cNvPr id="0" name="03_get_success.png"/>
-                    <pic:cNvPicPr/>
-                  </pic:nvPicPr>
-                  <pic:blipFill>
-                    <a:blip r:embed="rId12"/>
-                    <a:stretch>
-                      <a:fillRect/>
-                    </a:stretch>
-                  </pic:blipFill>
-                  <pic:spPr>
-                    <a:xfrm>
-                      <a:off x="0" y="0"/>
-                      <a:ext cx="5940000" cy="5057262"/>
-                    </a:xfrm>
-                    <a:prstGeom prst="rect"/>
-                  </pic:spPr>
-                </pic:pic>
-              </a:graphicData>
-            </a:graphic>
-          </wp:inline>
-        </w:drawing>
-      </w:r>
-    </w:p>
-    <w:p>
-      <w:pPr>
-        <w:spacing w:after="80"/>
-        <w:jc w:val="center"/>
-      </w:pPr>
-      <w:r>
-        <w:rPr>
-          <w:rFonts w:ascii="Times New Roman" w:hAnsi="Times New Roman"/>
-          <w:b/>
-          <w:sz w:val="24"/>
-        </w:rPr>
-        <w:t>Рисунок 3 — Получение значения через GET /get/student</w:t>
-      </w:r>
-    </w:p>
-    <w:p>
-      <w:r>
-        <w:rPr>
-          <w:rFonts w:ascii="Times New Roman" w:hAnsi="Times New Roman"/>
-          <w:b w:val="0"/>
-          <w:sz w:val="24"/>
-        </w:rPr>
-        <w:t>После сохранения выполняется запрос на получение значения по ключу student. В JSON-ответе сервер возвращает тот же ключ и сохраненное значение, то есть чтение из хранилища работает корректно.</w:t>
-      </w:r>
-    </w:p>
-    <w:p>
-      <w:pPr>
-        <w:jc w:val="center"/>
-      </w:pPr>
-      <w:r>
-        <w:drawing>
-          <wp:inline xmlns:a="http://schemas.openxmlformats.org/drawingml/2006/main" xmlns:pic="http://schemas.openxmlformats.org/drawingml/2006/picture">
-            <wp:extent cx="5940000" cy="5057262"/>
-            <wp:docPr id="5" name="Picture 5"/>
-            <wp:cNvGraphicFramePr>
-              <a:graphicFrameLocks noChangeAspect="1"/>
-            </wp:cNvGraphicFramePr>
-            <a:graphic>
-              <a:graphicData uri="http://schemas.openxmlformats.org/drawingml/2006/picture">
-                <pic:pic>
-                  <pic:nvPicPr>
-                    <pic:cNvPr id="0" name="04_exists_true.png"/>
                     <pic:cNvPicPr/>
                   </pic:nvPicPr>
                   <pic:blipFill>
@@ -1356,17 +3469,88 @@
           <w:b/>
           <w:sz w:val="24"/>
         </w:rPr>
-        <w:t>Рисунок 4 — Проверка существования ключа через GET /exists/student</w:t>
+        <w:t>Рисунок 3 — Получение значения через GET /get/student</w:t>
       </w:r>
     </w:p>
     <w:p>
+      <w:pPr>
+        <w:spacing w:after="80"/>
+        <w:ind w:firstLine="425"/>
+      </w:pPr>
       <w:r>
         <w:rPr>
           <w:rFonts w:ascii="Times New Roman" w:hAnsi="Times New Roman"/>
           <w:b w:val="0"/>
           <w:sz w:val="24"/>
         </w:rPr>
-        <w:t>Маршрут /exists/student возвращает exists: true. Это показывает, что приложение умеет отдельно проверять наличие ключа без получения самого значения.</w:t>
+        <w:t>Запрос GET /get/student возвращает значение, которое ранее было сохранено. Это показывает, что данные находятся в хранилище и доступны по ключу. Маршрут не изменяет файл, а только читает текущее состояние словаря data.</w:t>
+      </w:r>
+    </w:p>
+    <w:p>
+      <w:pPr>
+        <w:jc w:val="center"/>
+      </w:pPr>
+      <w:r>
+        <w:drawing>
+          <wp:inline xmlns:a="http://schemas.openxmlformats.org/drawingml/2006/main" xmlns:pic="http://schemas.openxmlformats.org/drawingml/2006/picture">
+            <wp:extent cx="5940000" cy="5057262"/>
+            <wp:docPr id="5" name="Picture 5"/>
+            <wp:cNvGraphicFramePr>
+              <a:graphicFrameLocks noChangeAspect="1"/>
+            </wp:cNvGraphicFramePr>
+            <a:graphic>
+              <a:graphicData uri="http://schemas.openxmlformats.org/drawingml/2006/picture">
+                <pic:pic>
+                  <pic:nvPicPr>
+                    <pic:cNvPr id="0" name="04_exists_true.png"/>
+                    <pic:cNvPicPr/>
+                  </pic:nvPicPr>
+                  <pic:blipFill>
+                    <a:blip r:embed="rId14"/>
+                    <a:stretch>
+                      <a:fillRect/>
+                    </a:stretch>
+                  </pic:blipFill>
+                  <pic:spPr>
+                    <a:xfrm>
+                      <a:off x="0" y="0"/>
+                      <a:ext cx="5940000" cy="5057262"/>
+                    </a:xfrm>
+                    <a:prstGeom prst="rect"/>
+                  </pic:spPr>
+                </pic:pic>
+              </a:graphicData>
+            </a:graphic>
+          </wp:inline>
+        </w:drawing>
+      </w:r>
+    </w:p>
+    <w:p>
+      <w:pPr>
+        <w:spacing w:after="80"/>
+        <w:jc w:val="center"/>
+      </w:pPr>
+      <w:r>
+        <w:rPr>
+          <w:rFonts w:ascii="Times New Roman" w:hAnsi="Times New Roman"/>
+          <w:b/>
+          <w:sz w:val="24"/>
+        </w:rPr>
+        <w:t>Рисунок 4 — Проверка существования ключа через GET /exists/student</w:t>
+      </w:r>
+    </w:p>
+    <w:p>
+      <w:pPr>
+        <w:spacing w:after="80"/>
+        <w:ind w:firstLine="425"/>
+      </w:pPr>
+      <w:r>
+        <w:rPr>
+          <w:rFonts w:ascii="Times New Roman" w:hAnsi="Times New Roman"/>
+          <w:b w:val="0"/>
+          <w:sz w:val="24"/>
+        </w:rPr>
+        <w:t>Ответ contains exists=true. Такой маршрут нужен, когда клиенту достаточно узнать факт наличия ключа. Это менее избыточно, чем получать само значение, особенно если значение большое.</w:t>
       </w:r>
     </w:p>
     <w:p>
@@ -1389,7 +3573,7 @@
                     <pic:cNvPicPr/>
                   </pic:nvPicPr>
                   <pic:blipFill>
-                    <a:blip r:embed="rId14"/>
+                    <a:blip r:embed="rId15"/>
                     <a:stretch>
                       <a:fillRect/>
                     </a:stretch>
@@ -1423,13 +3607,17 @@
       </w:r>
     </w:p>
     <w:p>
+      <w:pPr>
+        <w:spacing w:after="80"/>
+        <w:ind w:firstLine="425"/>
+      </w:pPr>
       <w:r>
         <w:rPr>
           <w:rFonts w:ascii="Times New Roman" w:hAnsi="Times New Roman"/>
           <w:b w:val="0"/>
           <w:sz w:val="24"/>
         </w:rPr>
-        <w:t>После нажатия кнопки удаления сервер возвращает статус 200, удаленный ключ и удаленное значение. В таблице ключ student отсутствует, значит операция удаления выполнена и состояние хранилища обновлено.</w:t>
+        <w:t>После удаления сервер возвращает статус 200, имя удаленного ключа и removed_value. В таблице строка student исчезает. Это подтверждает, что удаление выполнено не только визуально, но и в серверном состоянии.</w:t>
       </w:r>
     </w:p>
     <w:p>
@@ -1452,7 +3640,7 @@
                     <pic:cNvPicPr/>
                   </pic:nvPicPr>
                   <pic:blipFill>
-                    <a:blip r:embed="rId15"/>
+                    <a:blip r:embed="rId16"/>
                     <a:stretch>
                       <a:fillRect/>
                     </a:stretch>
@@ -1482,17 +3670,21 @@
           <w:b/>
           <w:sz w:val="24"/>
         </w:rPr>
-        <w:t>Рисунок 6 — Срабатывание ограничения запросов Flask-Limiter</w:t>
+        <w:t>Рисунок 6 — Срабатывание Flask-Limiter</w:t>
       </w:r>
     </w:p>
     <w:p>
+      <w:pPr>
+        <w:spacing w:after="80"/>
+        <w:ind w:firstLine="425"/>
+      </w:pPr>
       <w:r>
         <w:rPr>
           <w:rFonts w:ascii="Times New Roman" w:hAnsi="Times New Roman"/>
           <w:b w:val="0"/>
           <w:sz w:val="24"/>
         </w:rPr>
-        <w:t>На скриншоте показана серия запросов к /set. Первые запросы получают статус 201, после превышения лимита сервер возвращает 429 и сообщение о превышении ограничения 10 запросов в минуту.</w:t>
+        <w:t>Для проверки лимита была выполнена серия запросов к /set. Первые запросы получают статус 201, затем сервер возвращает 429 Too Many Requests. Это доказывает, что отдельный лимит 10 запросов в минуту для изменяющих операций действительно работает.</w:t>
       </w:r>
     </w:p>
     <w:p>
@@ -1502,243 +3694,377 @@
       <w:r>
         <w:rPr>
           <w:rFonts w:ascii="Times New Roman" w:hAnsi="Times New Roman"/>
+          <w:b/>
+          <w:sz w:val="28"/>
         </w:rPr>
-        <w:t>6. Проверка выполнения требований</w:t>
+        <w:t>10. Проверка выполнения требований</w:t>
       </w:r>
     </w:p>
     <w:p>
       <w:pPr>
         <w:pStyle w:val="ListBullet"/>
-      </w:pPr>
-      <w:r>
-        <w:rPr>
-          <w:rFonts w:ascii="Times New Roman" w:hAnsi="Times New Roman"/>
-          <w:sz w:val="24"/>
-        </w:rPr>
-        <w:t>Flask-приложение запускается и открывает демонстрационную страницу.</w:t>
-      </w:r>
-    </w:p>
-    <w:p>
-      <w:pPr>
-        <w:pStyle w:val="ListBullet"/>
-      </w:pPr>
-      <w:r>
-        <w:rPr>
-          <w:rFonts w:ascii="Times New Roman" w:hAnsi="Times New Roman"/>
-          <w:sz w:val="24"/>
-        </w:rPr>
-        <w:t>Данные загружаются из data.json при старте приложения.</w:t>
-      </w:r>
-    </w:p>
-    <w:p>
-      <w:pPr>
-        <w:pStyle w:val="ListBullet"/>
-      </w:pPr>
-      <w:r>
-        <w:rPr>
-          <w:rFonts w:ascii="Times New Roman" w:hAnsi="Times New Roman"/>
-          <w:sz w:val="24"/>
-        </w:rPr>
-        <w:t>После POST /set изменения сохраняются в data.json.</w:t>
-      </w:r>
-    </w:p>
-    <w:p>
-      <w:pPr>
-        <w:pStyle w:val="ListBullet"/>
-      </w:pPr>
-      <w:r>
-        <w:rPr>
-          <w:rFonts w:ascii="Times New Roman" w:hAnsi="Times New Roman"/>
-          <w:sz w:val="24"/>
-        </w:rPr>
-        <w:t>После DELETE /delete/&lt;key&gt; изменения также сохраняются в data.json.</w:t>
-      </w:r>
-    </w:p>
-    <w:p>
-      <w:pPr>
-        <w:pStyle w:val="ListBullet"/>
-      </w:pPr>
-      <w:r>
-        <w:rPr>
-          <w:rFonts w:ascii="Times New Roman" w:hAnsi="Times New Roman"/>
-          <w:sz w:val="24"/>
-        </w:rPr>
-        <w:t>GET /get/&lt;key&gt; возвращает значение по ключу.</w:t>
-      </w:r>
-    </w:p>
-    <w:p>
-      <w:pPr>
-        <w:pStyle w:val="ListBullet"/>
-      </w:pPr>
-      <w:r>
-        <w:rPr>
-          <w:rFonts w:ascii="Times New Roman" w:hAnsi="Times New Roman"/>
-          <w:sz w:val="24"/>
-        </w:rPr>
-        <w:t>GET /exists/&lt;key&gt; возвращает логический признак exists.</w:t>
-      </w:r>
-    </w:p>
-    <w:p>
-      <w:pPr>
-        <w:pStyle w:val="ListBullet"/>
-      </w:pPr>
-      <w:r>
-        <w:rPr>
-          <w:rFonts w:ascii="Times New Roman" w:hAnsi="Times New Roman"/>
-          <w:sz w:val="24"/>
-        </w:rPr>
-        <w:t>Если ключ не передан или не найден, сервер возвращает понятную JSON-ошибку.</w:t>
-      </w:r>
-    </w:p>
-    <w:p>
-      <w:pPr>
-        <w:pStyle w:val="ListBullet"/>
-      </w:pPr>
-      <w:r>
-        <w:rPr>
-          <w:rFonts w:ascii="Times New Roman" w:hAnsi="Times New Roman"/>
-          <w:sz w:val="24"/>
-        </w:rPr>
-        <w:t>Flask-Limiter ограничивает все маршруты общим лимитом 100 запросов в сутки.</w:t>
-      </w:r>
-    </w:p>
-    <w:p>
-      <w:pPr>
-        <w:pStyle w:val="ListBullet"/>
-      </w:pPr>
-      <w:r>
-        <w:rPr>
-          <w:rFonts w:ascii="Times New Roman" w:hAnsi="Times New Roman"/>
-          <w:sz w:val="24"/>
-        </w:rPr>
-        <w:t>Для POST /set и DELETE /delete/&lt;key&gt; задан отдельный лимит 10 запросов в минуту.</w:t>
-      </w:r>
-    </w:p>
-    <w:p>
-      <w:pPr>
-        <w:pStyle w:val="ListBullet"/>
-      </w:pPr>
-      <w:r>
-        <w:rPr>
-          <w:rFonts w:ascii="Times New Roman" w:hAnsi="Times New Roman"/>
-          <w:sz w:val="24"/>
-        </w:rPr>
-        <w:t>Демонстрационный клиент client_demo.py использует requests и проверяет API из Python.</w:t>
-      </w:r>
-    </w:p>
-    <w:p>
+        <w:spacing w:after="60"/>
+      </w:pPr>
       <w:r>
         <w:rPr>
           <w:rFonts w:ascii="Times New Roman" w:hAnsi="Times New Roman"/>
           <w:b w:val="0"/>
           <w:sz w:val="24"/>
         </w:rPr>
-        <w:t>Для проверки использовались команды:</w:t>
+        <w:t>Приложение запускается локально и открывается в браузере.</w:t>
       </w:r>
     </w:p>
     <w:p>
       <w:pPr>
-        <w:shd w:fill="F2F5F9"/>
-      </w:pPr>
-      <w:r>
-        <w:rPr>
-          <w:rFonts w:ascii="Courier New" w:hAnsi="Courier New"/>
-          <w:sz w:val="17"/>
-        </w:rPr>
-        <w:t>python -m compileall app.py client_demo.py</w:t>
-        <w:br/>
-        <w:t>python client_demo.py --base-url http://127.0.0.1:5002</w:t>
-      </w:r>
-    </w:p>
-    <w:p>
+        <w:pStyle w:val="ListBullet"/>
+        <w:spacing w:after="60"/>
+      </w:pPr>
       <w:r>
         <w:rPr>
           <w:rFonts w:ascii="Times New Roman" w:hAnsi="Times New Roman"/>
           <w:b w:val="0"/>
           <w:sz w:val="24"/>
         </w:rPr>
-        <w:t>Также выполнялась автоматическая проверка HTTP-сценариев: открытие главной страницы, /all, /set, /get, /exists, /delete, запись в data.json и срабатывание лимита 429.</w:t>
+        <w:t>Файл data.json загружается автоматически при старте.</w:t>
       </w:r>
     </w:p>
     <w:p>
       <w:pPr>
-        <w:pStyle w:val="Heading1"/>
-      </w:pPr>
-      <w:r>
-        <w:rPr>
-          <w:rFonts w:ascii="Times New Roman" w:hAnsi="Times New Roman"/>
-        </w:rPr>
-        <w:t>7. Команды для ручной проверки</w:t>
-      </w:r>
-    </w:p>
-    <w:p>
+        <w:pStyle w:val="ListBullet"/>
+        <w:spacing w:after="60"/>
+      </w:pPr>
       <w:r>
         <w:rPr>
           <w:rFonts w:ascii="Times New Roman" w:hAnsi="Times New Roman"/>
           <w:b w:val="0"/>
           <w:sz w:val="24"/>
         </w:rPr>
-        <w:t>Запуск локально:</w:t>
+        <w:t>Словарь data является основным хранилищем во время работы приложения.</w:t>
       </w:r>
     </w:p>
     <w:p>
       <w:pPr>
-        <w:shd w:fill="F2F5F9"/>
-      </w:pPr>
-      <w:r>
-        <w:rPr>
-          <w:rFonts w:ascii="Courier New" w:hAnsi="Courier New"/>
-          <w:sz w:val="17"/>
-        </w:rPr>
-        <w:t>python -m venv .venv</w:t>
-        <w:br/>
-        <w:t>.venv\Scripts\activate</w:t>
-        <w:br/>
-        <w:t>pip install -r requirements.txt</w:t>
-        <w:br/>
-        <w:t>python app.py</w:t>
-      </w:r>
-    </w:p>
-    <w:p>
+        <w:pStyle w:val="ListBullet"/>
+        <w:spacing w:after="60"/>
+      </w:pPr>
       <w:r>
         <w:rPr>
           <w:rFonts w:ascii="Times New Roman" w:hAnsi="Times New Roman"/>
           <w:b w:val="0"/>
           <w:sz w:val="24"/>
         </w:rPr>
-        <w:t>Проверка через curl или Postman:</w:t>
+        <w:t>POST /set сохраняет значение и возвращает JSON-ответ.</w:t>
       </w:r>
     </w:p>
     <w:p>
       <w:pPr>
+        <w:pStyle w:val="ListBullet"/>
+        <w:spacing w:after="60"/>
+      </w:pPr>
+      <w:r>
+        <w:rPr>
+          <w:rFonts w:ascii="Times New Roman" w:hAnsi="Times New Roman"/>
+          <w:b w:val="0"/>
+          <w:sz w:val="24"/>
+        </w:rPr>
+        <w:t>GET /get/&lt;key&gt; получает значение по ключу.</w:t>
+      </w:r>
+    </w:p>
+    <w:p>
+      <w:pPr>
+        <w:pStyle w:val="ListBullet"/>
+        <w:spacing w:after="60"/>
+      </w:pPr>
+      <w:r>
+        <w:rPr>
+          <w:rFonts w:ascii="Times New Roman" w:hAnsi="Times New Roman"/>
+          <w:b w:val="0"/>
+          <w:sz w:val="24"/>
+        </w:rPr>
+        <w:t>DELETE /delete/&lt;key&gt; удаляет ключ и сохраняет результат в data.json.</w:t>
+      </w:r>
+    </w:p>
+    <w:p>
+      <w:pPr>
+        <w:pStyle w:val="ListBullet"/>
+        <w:spacing w:after="60"/>
+      </w:pPr>
+      <w:r>
+        <w:rPr>
+          <w:rFonts w:ascii="Times New Roman" w:hAnsi="Times New Roman"/>
+          <w:b w:val="0"/>
+          <w:sz w:val="24"/>
+        </w:rPr>
+        <w:t>GET /exists/&lt;key&gt; возвращает true или false.</w:t>
+      </w:r>
+    </w:p>
+    <w:p>
+      <w:pPr>
+        <w:pStyle w:val="ListBullet"/>
+        <w:spacing w:after="60"/>
+      </w:pPr>
+      <w:r>
+        <w:rPr>
+          <w:rFonts w:ascii="Times New Roman" w:hAnsi="Times New Roman"/>
+          <w:b w:val="0"/>
+          <w:sz w:val="24"/>
+        </w:rPr>
+        <w:t>После /set и /delete файл data.json реально меняется.</w:t>
+      </w:r>
+    </w:p>
+    <w:p>
+      <w:pPr>
+        <w:pStyle w:val="ListBullet"/>
+        <w:spacing w:after="60"/>
+      </w:pPr>
+      <w:r>
+        <w:rPr>
+          <w:rFonts w:ascii="Times New Roman" w:hAnsi="Times New Roman"/>
+          <w:b w:val="0"/>
+          <w:sz w:val="24"/>
+        </w:rPr>
+        <w:t>Общий лимит 100 запросов в сутки указан в Limiter.</w:t>
+      </w:r>
+    </w:p>
+    <w:p>
+      <w:pPr>
+        <w:pStyle w:val="ListBullet"/>
+        <w:spacing w:after="60"/>
+      </w:pPr>
+      <w:r>
+        <w:rPr>
+          <w:rFonts w:ascii="Times New Roman" w:hAnsi="Times New Roman"/>
+          <w:b w:val="0"/>
+          <w:sz w:val="24"/>
+        </w:rPr>
+        <w:t>Отдельный лимит 10 запросов в минуту установлен для /set и /delete.</w:t>
+      </w:r>
+    </w:p>
+    <w:p>
+      <w:pPr>
+        <w:pStyle w:val="ListBullet"/>
+        <w:spacing w:after="60"/>
+      </w:pPr>
+      <w:r>
+        <w:rPr>
+          <w:rFonts w:ascii="Times New Roman" w:hAnsi="Times New Roman"/>
+          <w:b w:val="0"/>
+          <w:sz w:val="24"/>
+        </w:rPr>
+        <w:t>При ошибках сервер возвращает понятный JSON-ответ.</w:t>
+      </w:r>
+    </w:p>
+    <w:p>
+      <w:pPr>
+        <w:pStyle w:val="ListBullet"/>
+        <w:spacing w:after="60"/>
+      </w:pPr>
+      <w:r>
+        <w:rPr>
+          <w:rFonts w:ascii="Times New Roman" w:hAnsi="Times New Roman"/>
+          <w:b w:val="0"/>
+          <w:sz w:val="24"/>
+        </w:rPr>
+        <w:t>Есть демонстрационная страница и отдельный клиент на requests.</w:t>
+      </w:r>
+    </w:p>
+    <w:p>
+      <w:pPr>
+        <w:pStyle w:val="ListBullet"/>
+        <w:spacing w:after="60"/>
+      </w:pPr>
+      <w:r>
+        <w:rPr>
+          <w:rFonts w:ascii="Times New Roman" w:hAnsi="Times New Roman"/>
+          <w:b w:val="0"/>
+          <w:sz w:val="24"/>
+        </w:rPr>
+        <w:t>Код снабжен комментариями по разделам лабораторной работы.</w:t>
+      </w:r>
+    </w:p>
+    <w:p>
+      <w:pPr>
+        <w:spacing w:after="80"/>
+        <w:ind w:firstLine="425"/>
+      </w:pPr>
+      <w:r>
+        <w:rPr>
+          <w:rFonts w:ascii="Times New Roman" w:hAnsi="Times New Roman"/>
+          <w:b w:val="0"/>
+          <w:sz w:val="24"/>
+        </w:rPr>
+        <w:t>Финальные команды проверки:</w:t>
+      </w:r>
+    </w:p>
+    <w:p>
+      <w:pPr>
         <w:shd w:fill="F2F5F9"/>
+        <w:spacing w:after="160"/>
+        <w:ind w:left="142" w:right="142"/>
       </w:pPr>
       <w:r>
         <w:rPr>
           <w:rFonts w:ascii="Courier New" w:hAnsi="Courier New"/>
+          <w:b w:val="0"/>
           <w:sz w:val="17"/>
         </w:rPr>
-        <w:t>curl -i -X POST http://127.0.0.1:5000/set -H "Content-Type: application/json" -d "{\"key\":\"student\",\"value\":\"ФБИ\"}"</w:t>
-        <w:br/>
-        <w:t>curl -i http://127.0.0.1:5000/get/student</w:t>
-        <w:br/>
-        <w:t>curl -i http://127.0.0.1:5000/exists/student</w:t>
-        <w:br/>
-        <w:t>curl -i -X DELETE http://127.0.0.1:5000/delete/student</w:t>
+        <w:t>python -m compileall app.py client_demo.py</w:t>
+        <w:br/>
+        <w:t>python client_demo.py --base-url http://127.0.0.1:5002</w:t>
       </w:r>
     </w:p>
     <w:p>
       <w:pPr>
-        <w:pStyle w:val="Heading1"/>
+        <w:spacing w:after="80"/>
+        <w:ind w:firstLine="425"/>
       </w:pPr>
       <w:r>
         <w:rPr>
           <w:rFonts w:ascii="Times New Roman" w:hAnsi="Times New Roman"/>
+          <w:b w:val="0"/>
+          <w:sz w:val="24"/>
         </w:rPr>
-        <w:t>8. Ответы на контрольные вопросы</w:t>
+        <w:t>Также была выполнена автоматическая проверка через Flask test_client: загрузка из файла, /set, /get, /exists, /delete, сохранение после изменения, валидация пустого ключа и получение статуса 429 при превышении лимита.</w:t>
       </w:r>
     </w:p>
     <w:p>
+      <w:pPr>
+        <w:pStyle w:val="Heading1"/>
+      </w:pPr>
+      <w:r>
+        <w:rPr>
+          <w:rFonts w:ascii="Times New Roman" w:hAnsi="Times New Roman"/>
+          <w:b/>
+          <w:sz w:val="28"/>
+        </w:rPr>
+        <w:t>11. Запуск приложения</w:t>
+      </w:r>
+    </w:p>
+    <w:p>
+      <w:pPr>
+        <w:spacing w:after="80"/>
+        <w:ind w:firstLine="425"/>
+      </w:pPr>
+      <w:r>
+        <w:rPr>
+          <w:rFonts w:ascii="Times New Roman" w:hAnsi="Times New Roman"/>
+          <w:b w:val="0"/>
+          <w:sz w:val="24"/>
+        </w:rPr>
+        <w:t>Локальный запуск через Python:</w:t>
+      </w:r>
+    </w:p>
+    <w:p>
+      <w:pPr>
+        <w:shd w:fill="F2F5F9"/>
+        <w:spacing w:after="160"/>
+        <w:ind w:left="142" w:right="142"/>
+      </w:pPr>
+      <w:r>
+        <w:rPr>
+          <w:rFonts w:ascii="Courier New" w:hAnsi="Courier New"/>
+          <w:b w:val="0"/>
+          <w:sz w:val="17"/>
+        </w:rPr>
+        <w:t>python -m venv .venv</w:t>
+        <w:br/>
+        <w:t>.venv\Scripts\activate</w:t>
+        <w:br/>
+        <w:t>pip install -r requirements.txt</w:t>
+        <w:br/>
+        <w:t>python app.py</w:t>
+      </w:r>
+    </w:p>
+    <w:p>
+      <w:pPr>
+        <w:spacing w:after="80"/>
+        <w:ind w:firstLine="425"/>
+      </w:pPr>
+      <w:r>
+        <w:rPr>
+          <w:rFonts w:ascii="Times New Roman" w:hAnsi="Times New Roman"/>
+          <w:b w:val="0"/>
+          <w:sz w:val="24"/>
+        </w:rPr>
+        <w:t>После запуска приложение доступно по адресу:</w:t>
+      </w:r>
+    </w:p>
+    <w:p>
+      <w:pPr>
+        <w:shd w:fill="F2F5F9"/>
+        <w:spacing w:after="160"/>
+        <w:ind w:left="142" w:right="142"/>
+      </w:pPr>
+      <w:r>
+        <w:rPr>
+          <w:rFonts w:ascii="Courier New" w:hAnsi="Courier New"/>
+          <w:b w:val="0"/>
+          <w:sz w:val="17"/>
+        </w:rPr>
+        <w:t>http://127.0.0.1:5000</w:t>
+      </w:r>
+    </w:p>
+    <w:p>
+      <w:pPr>
+        <w:spacing w:after="80"/>
+        <w:ind w:firstLine="425"/>
+      </w:pPr>
+      <w:r>
+        <w:rPr>
+          <w:rFonts w:ascii="Times New Roman" w:hAnsi="Times New Roman"/>
+          <w:b w:val="0"/>
+          <w:sz w:val="24"/>
+        </w:rPr>
+        <w:t>Запуск через Docker Compose:</w:t>
+      </w:r>
+    </w:p>
+    <w:p>
+      <w:pPr>
+        <w:shd w:fill="F2F5F9"/>
+        <w:spacing w:after="160"/>
+        <w:ind w:left="142" w:right="142"/>
+      </w:pPr>
+      <w:r>
+        <w:rPr>
+          <w:rFonts w:ascii="Courier New" w:hAnsi="Courier New"/>
+          <w:b w:val="0"/>
+          <w:sz w:val="17"/>
+        </w:rPr>
+        <w:t>docker compose up --build</w:t>
+      </w:r>
+    </w:p>
+    <w:p>
+      <w:pPr>
+        <w:spacing w:after="80"/>
+        <w:ind w:firstLine="425"/>
+      </w:pPr>
+      <w:r>
+        <w:rPr>
+          <w:rFonts w:ascii="Times New Roman" w:hAnsi="Times New Roman"/>
+          <w:b w:val="0"/>
+          <w:sz w:val="24"/>
+        </w:rPr>
+        <w:t>В docker-compose.yml файл проекта подключается в контейнер как volume. Это удобно для лабораторной работы: data.json остается на компьютере, и после перезапуска контейнера сохраненные ключи не исчезают.</w:t>
+      </w:r>
+    </w:p>
+    <w:p>
+      <w:pPr>
+        <w:pStyle w:val="Heading1"/>
+      </w:pPr>
+      <w:r>
+        <w:rPr>
+          <w:rFonts w:ascii="Times New Roman" w:hAnsi="Times New Roman"/>
+          <w:b/>
+          <w:sz w:val="28"/>
+        </w:rPr>
+        <w:t>12. Ответы на контрольные вопросы</w:t>
+      </w:r>
+    </w:p>
+    <w:p>
+      <w:pPr>
+        <w:spacing w:after="80"/>
+        <w:ind w:firstLine="425"/>
+      </w:pPr>
       <w:r>
         <w:rPr>
           <w:rFonts w:ascii="Times New Roman" w:hAnsi="Times New Roman"/>
@@ -1749,154 +4075,390 @@
       </w:r>
     </w:p>
     <w:p>
+      <w:pPr>
+        <w:spacing w:after="80"/>
+        <w:ind w:firstLine="425"/>
+      </w:pPr>
       <w:r>
         <w:rPr>
           <w:rFonts w:ascii="Times New Roman" w:hAnsi="Times New Roman"/>
           <w:b w:val="0"/>
           <w:sz w:val="24"/>
         </w:rPr>
-        <w:t>Это хранилище, где данные представлены парами: ключ и значение. Ключ используется для быстрого доступа к конкретному значению.</w:t>
+        <w:t>Это способ хранения данных, при котором каждая запись состоит из ключа и значения. По ключу можно быстро получить, изменить или удалить значение.</w:t>
       </w:r>
     </w:p>
     <w:p>
+      <w:pPr>
+        <w:spacing w:after="80"/>
+        <w:ind w:firstLine="425"/>
+      </w:pPr>
       <w:r>
         <w:rPr>
           <w:rFonts w:ascii="Times New Roman" w:hAnsi="Times New Roman"/>
           <w:b/>
           <w:sz w:val="24"/>
         </w:rPr>
-        <w:t>Почему данные загружаются из data.json при старте?</w:t>
+        <w:t>Почему в работе используется словарь data?</w:t>
       </w:r>
     </w:p>
     <w:p>
+      <w:pPr>
+        <w:spacing w:after="80"/>
+        <w:ind w:firstLine="425"/>
+      </w:pPr>
       <w:r>
         <w:rPr>
           <w:rFonts w:ascii="Times New Roman" w:hAnsi="Times New Roman"/>
           <w:b w:val="0"/>
           <w:sz w:val="24"/>
         </w:rPr>
-        <w:t>Так приложение не теряет состояние между запусками. Словарь data восстанавливается из файла, а не начинается каждый раз пустым.</w:t>
+        <w:t>Словарь Python уже реализует идею key-value: обращение к значению идет по ключу, добавление и удаление выполняются простыми операциями.</w:t>
       </w:r>
     </w:p>
     <w:p>
+      <w:pPr>
+        <w:spacing w:after="80"/>
+        <w:ind w:firstLine="425"/>
+      </w:pPr>
       <w:r>
         <w:rPr>
           <w:rFonts w:ascii="Times New Roman" w:hAnsi="Times New Roman"/>
           <w:b/>
           <w:sz w:val="24"/>
         </w:rPr>
-        <w:t>Почему изменения сохраняются после каждой операции?</w:t>
+        <w:t>Зачем нужен data.json?</w:t>
       </w:r>
     </w:p>
     <w:p>
+      <w:pPr>
+        <w:spacing w:after="80"/>
+        <w:ind w:firstLine="425"/>
+      </w:pPr>
       <w:r>
         <w:rPr>
           <w:rFonts w:ascii="Times New Roman" w:hAnsi="Times New Roman"/>
           <w:b w:val="0"/>
           <w:sz w:val="24"/>
         </w:rPr>
-        <w:t>Если приложение завершится после добавления или удаления ключа, изменения уже будут записаны в data.json и не потеряются.</w:t>
+        <w:t>Словарь data хранится в памяти и пропадет после остановки программы. Файл data.json сохраняет состояние между запусками.</w:t>
       </w:r>
     </w:p>
     <w:p>
+      <w:pPr>
+        <w:spacing w:after="80"/>
+        <w:ind w:firstLine="425"/>
+      </w:pPr>
       <w:r>
         <w:rPr>
           <w:rFonts w:ascii="Times New Roman" w:hAnsi="Times New Roman"/>
           <w:b/>
           <w:sz w:val="24"/>
         </w:rPr>
-        <w:t>Зачем нужен Flask-Limiter?</w:t>
+        <w:t>Почему сохранение выполняется после каждой операции?</w:t>
       </w:r>
     </w:p>
     <w:p>
+      <w:pPr>
+        <w:spacing w:after="80"/>
+        <w:ind w:firstLine="425"/>
+      </w:pPr>
       <w:r>
         <w:rPr>
           <w:rFonts w:ascii="Times New Roman" w:hAnsi="Times New Roman"/>
           <w:b w:val="0"/>
           <w:sz w:val="24"/>
         </w:rPr>
-        <w:t>Он ограничивает частоту запросов и защищает API от слишком большого количества обращений за короткое время.</w:t>
+        <w:t>Так уменьшается риск потери данных. Если сервер остановится после изменения, запись уже будет находиться в файле.</w:t>
       </w:r>
     </w:p>
     <w:p>
+      <w:pPr>
+        <w:spacing w:after="80"/>
+        <w:ind w:firstLine="425"/>
+      </w:pPr>
       <w:r>
         <w:rPr>
           <w:rFonts w:ascii="Times New Roman" w:hAnsi="Times New Roman"/>
           <w:b/>
           <w:sz w:val="24"/>
         </w:rPr>
-        <w:t>Почему /set использует POST, а /delete использует DELETE?</w:t>
+        <w:t>Почему /set использует POST?</w:t>
       </w:r>
     </w:p>
     <w:p>
+      <w:pPr>
+        <w:spacing w:after="80"/>
+        <w:ind w:firstLine="425"/>
+      </w:pPr>
       <w:r>
         <w:rPr>
           <w:rFonts w:ascii="Times New Roman" w:hAnsi="Times New Roman"/>
           <w:b w:val="0"/>
           <w:sz w:val="24"/>
         </w:rPr>
-        <w:t>POST подходит для создания или изменения данных, а DELETE явно обозначает удаление ресурса по ключу.</w:t>
+        <w:t>POST применяется для создания или изменения данных. В данном случае он сохраняет пару ключ-значение.</w:t>
       </w:r>
     </w:p>
     <w:p>
+      <w:pPr>
+        <w:spacing w:after="80"/>
+        <w:ind w:firstLine="425"/>
+      </w:pPr>
       <w:r>
         <w:rPr>
           <w:rFonts w:ascii="Times New Roman" w:hAnsi="Times New Roman"/>
           <w:b/>
           <w:sz w:val="24"/>
         </w:rPr>
-        <w:t>Что произойдет при превышении лимита?</w:t>
+        <w:t>Почему /delete использует DELETE?</w:t>
       </w:r>
     </w:p>
     <w:p>
+      <w:pPr>
+        <w:spacing w:after="80"/>
+        <w:ind w:firstLine="425"/>
+      </w:pPr>
       <w:r>
         <w:rPr>
           <w:rFonts w:ascii="Times New Roman" w:hAnsi="Times New Roman"/>
           <w:b w:val="0"/>
           <w:sz w:val="24"/>
         </w:rPr>
-        <w:t>Flask-Limiter остановит выполнение обработчика и вернет HTTP 429. В приложении это оформлено как JSON-ответ с понятным сообщением.</w:t>
+        <w:t>HTTP-метод DELETE явно обозначает удаление ресурса. В приложении ресурсом является ключ.</w:t>
       </w:r>
     </w:p>
     <w:p>
       <w:pPr>
-        <w:pStyle w:val="Heading1"/>
+        <w:spacing w:after="80"/>
+        <w:ind w:firstLine="425"/>
       </w:pPr>
       <w:r>
         <w:rPr>
           <w:rFonts w:ascii="Times New Roman" w:hAnsi="Times New Roman"/>
+          <w:b/>
+          <w:sz w:val="24"/>
         </w:rPr>
-        <w:t>9. Вывод</w:t>
+        <w:t>Что делает Flask-Limiter?</w:t>
       </w:r>
     </w:p>
     <w:p>
+      <w:pPr>
+        <w:spacing w:after="80"/>
+        <w:ind w:firstLine="425"/>
+      </w:pPr>
       <w:r>
         <w:rPr>
           <w:rFonts w:ascii="Times New Roman" w:hAnsi="Times New Roman"/>
           <w:b w:val="0"/>
           <w:sz w:val="24"/>
         </w:rPr>
-        <w:t>В ходе лабораторной работы разработано key-value хранилище на Flask. Реализованы загрузка данных из data.json, сохранение изменений после операций, основные API-маршруты для работы с ключами и ограничение частоты запросов через Flask-Limiter. Дополнительно подготовлены HTML-страница для наглядной проверки, клиент на requests, README и Docker-файлы для удобного запуска.</w:t>
+        <w:t>Он считает запросы и блокирует новые обращения, если пользователь превысил установленный лимит.</w:t>
       </w:r>
     </w:p>
     <w:p>
       <w:pPr>
-        <w:pStyle w:val="Heading1"/>
+        <w:spacing w:after="80"/>
+        <w:ind w:firstLine="425"/>
       </w:pPr>
       <w:r>
         <w:rPr>
           <w:rFonts w:ascii="Times New Roman" w:hAnsi="Times New Roman"/>
+          <w:b/>
+          <w:sz w:val="24"/>
         </w:rPr>
-        <w:t>10. Список использованных источников</w:t>
+        <w:t>Что означает HTTP 429?</w:t>
       </w:r>
     </w:p>
     <w:p>
       <w:pPr>
-        <w:pStyle w:val="ListNumber"/>
+        <w:spacing w:after="80"/>
+        <w:ind w:firstLine="425"/>
       </w:pPr>
       <w:r>
         <w:rPr>
           <w:rFonts w:ascii="Times New Roman" w:hAnsi="Times New Roman"/>
+          <w:b w:val="0"/>
+          <w:sz w:val="24"/>
+        </w:rPr>
+        <w:t>Это статус Too Many Requests. Он сообщает, что клиент отправил слишком много запросов за заданный период.</w:t>
+      </w:r>
+    </w:p>
+    <w:p>
+      <w:pPr>
+        <w:spacing w:after="80"/>
+        <w:ind w:firstLine="425"/>
+      </w:pPr>
+      <w:r>
+        <w:rPr>
+          <w:rFonts w:ascii="Times New Roman" w:hAnsi="Times New Roman"/>
+          <w:b/>
+          <w:sz w:val="24"/>
+        </w:rPr>
+        <w:t>Почему ошибки возвращаются в JSON?</w:t>
+      </w:r>
+    </w:p>
+    <w:p>
+      <w:pPr>
+        <w:spacing w:after="80"/>
+        <w:ind w:firstLine="425"/>
+      </w:pPr>
+      <w:r>
+        <w:rPr>
+          <w:rFonts w:ascii="Times New Roman" w:hAnsi="Times New Roman"/>
+          <w:b w:val="0"/>
+          <w:sz w:val="24"/>
+        </w:rPr>
+        <w:t>API удобнее проверять в Postman, curl и requests, когда и успешные ответы, и ошибки имеют единый JSON-формат.</w:t>
+      </w:r>
+    </w:p>
+    <w:p>
+      <w:pPr>
+        <w:spacing w:after="80"/>
+        <w:ind w:firstLine="425"/>
+      </w:pPr>
+      <w:r>
+        <w:rPr>
+          <w:rFonts w:ascii="Times New Roman" w:hAnsi="Times New Roman"/>
+          <w:b/>
+          <w:sz w:val="24"/>
+        </w:rPr>
+        <w:t>Для чего нужен client_demo.py?</w:t>
+      </w:r>
+    </w:p>
+    <w:p>
+      <w:pPr>
+        <w:spacing w:after="80"/>
+        <w:ind w:firstLine="425"/>
+      </w:pPr>
+      <w:r>
+        <w:rPr>
+          <w:rFonts w:ascii="Times New Roman" w:hAnsi="Times New Roman"/>
+          <w:b w:val="0"/>
+          <w:sz w:val="24"/>
+        </w:rPr>
+        <w:t>Он показывает, что API можно использовать программно из Python, а не только через браузерный интерфейс.</w:t>
+      </w:r>
+    </w:p>
+    <w:p>
+      <w:pPr>
+        <w:pStyle w:val="Heading1"/>
+      </w:pPr>
+      <w:r>
+        <w:rPr>
+          <w:rFonts w:ascii="Times New Roman" w:hAnsi="Times New Roman"/>
+          <w:b/>
+          <w:sz w:val="28"/>
+        </w:rPr>
+        <w:t>13. Подробный вывод</w:t>
+      </w:r>
+    </w:p>
+    <w:p>
+      <w:pPr>
+        <w:spacing w:after="80"/>
+        <w:ind w:firstLine="425"/>
+      </w:pPr>
+      <w:r>
+        <w:rPr>
+          <w:rFonts w:ascii="Times New Roman" w:hAnsi="Times New Roman"/>
+          <w:b w:val="0"/>
+          <w:sz w:val="24"/>
+        </w:rPr>
+        <w:t>В результате выполнения лабораторной работы было разработано полноценное учебное key-value хранилище на Flask. Работа включает не только минимальные маршруты, но и дополнительные элементы, которые делают приложение удобным для проверки: HTML-интерфейс, единый формат JSON-ответов, обработку ошибок, демонстрационный клиент и подробную инструкцию по запуску.</w:t>
+      </w:r>
+    </w:p>
+    <w:p>
+      <w:pPr>
+        <w:spacing w:after="80"/>
+        <w:ind w:firstLine="425"/>
+      </w:pPr>
+      <w:r>
+        <w:rPr>
+          <w:rFonts w:ascii="Times New Roman" w:hAnsi="Times New Roman"/>
+          <w:b w:val="0"/>
+          <w:sz w:val="24"/>
+        </w:rPr>
+        <w:t>Основной принцип key-value хранения показан на практике: данные представлены словарем data, где каждому ключу соответствует значение. При запуске приложение читает data.json, а после добавления или удаления ключа сохраняет новое состояние обратно в файл. Таким образом, реализована связь между оперативной памятью приложения и постоянным файловым хранением.</w:t>
+      </w:r>
+    </w:p>
+    <w:p>
+      <w:pPr>
+        <w:spacing w:after="80"/>
+        <w:ind w:firstLine="425"/>
+      </w:pPr>
+      <w:r>
+        <w:rPr>
+          <w:rFonts w:ascii="Times New Roman" w:hAnsi="Times New Roman"/>
+          <w:b w:val="0"/>
+          <w:sz w:val="24"/>
+        </w:rPr>
+        <w:t>Особое внимание уделено надежности и проверяемости. В коде есть валидация ключей, проверка сериализуемости значений, блокировка RLock для операций с общими данными, аккуратная запись через временный файл и единая обработка ошибок. Это делает решение более устойчивым, чем простой пример со словарем без проверок.</w:t>
+      </w:r>
+    </w:p>
+    <w:p>
+      <w:pPr>
+        <w:spacing w:after="80"/>
+        <w:ind w:firstLine="425"/>
+      </w:pPr>
+      <w:r>
+        <w:rPr>
+          <w:rFonts w:ascii="Times New Roman" w:hAnsi="Times New Roman"/>
+          <w:b w:val="0"/>
+          <w:sz w:val="24"/>
+        </w:rPr>
+        <w:t>Flask-Limiter показывает, как в веб-приложении ограничивать частоту запросов. Общий лимит защищает все маршруты, а отдельный лимит для /set и /delete защищает операции, которые изменяют состояние хранилища и файл data.json. На скриншоте со статусом 429 видно, что ограничение реально срабатывает.</w:t>
+      </w:r>
+    </w:p>
+    <w:p>
+      <w:pPr>
+        <w:spacing w:after="80"/>
+        <w:ind w:firstLine="425"/>
+      </w:pPr>
+      <w:r>
+        <w:rPr>
+          <w:rFonts w:ascii="Times New Roman" w:hAnsi="Times New Roman"/>
+          <w:b w:val="0"/>
+          <w:sz w:val="24"/>
+        </w:rPr>
+        <w:t>Также была проверена работа приложения разными способами: через браузер, через Python-клиент requests и через автоматические HTTP-проверки. Это подтверждает, что лабораторная работа не привязана к одному интерфейсу и может быть проверена преподавателем удобным способом.</w:t>
+      </w:r>
+    </w:p>
+    <w:p>
+      <w:pPr>
+        <w:spacing w:after="80"/>
+        <w:ind w:firstLine="425"/>
+      </w:pPr>
+      <w:r>
+        <w:rPr>
+          <w:rFonts w:ascii="Times New Roman" w:hAnsi="Times New Roman"/>
+          <w:b w:val="0"/>
+          <w:sz w:val="24"/>
+        </w:rPr>
+        <w:t>Итоговый проект соответствует заданию лабораторной работы №8: реализовано key-value хранилище, загрузка из data.json, сохранение после изменений, API-маршруты /set, /get, /delete, /exists и ограничения запросов через Flask-Limiter. Подготовленный отчет содержит теорию, описание библиотек, фрагменты кода, примеры запросов, скриншоты и подробные пояснения, поэтому работу можно проверять без устной защиты.</w:t>
+      </w:r>
+    </w:p>
+    <w:p>
+      <w:pPr>
+        <w:pStyle w:val="Heading1"/>
+      </w:pPr>
+      <w:r>
+        <w:rPr>
+          <w:rFonts w:ascii="Times New Roman" w:hAnsi="Times New Roman"/>
+          <w:b/>
+          <w:sz w:val="28"/>
+        </w:rPr>
+        <w:t>14. Список использованных источников</w:t>
+      </w:r>
+    </w:p>
+    <w:p>
+      <w:pPr>
+        <w:pStyle w:val="ListNumber"/>
+        <w:spacing w:after="60"/>
+      </w:pPr>
+      <w:r>
+        <w:rPr>
+          <w:rFonts w:ascii="Times New Roman" w:hAnsi="Times New Roman"/>
+          <w:b w:val="0"/>
           <w:sz w:val="24"/>
         </w:rPr>
         <w:t>Flask Documentation. Quickstart. URL: https://flask.palletsprojects.com/en/stable/quickstart/ (дата обращения: 29.05.2026).</w:t>
@@ -1905,10 +4467,12 @@
     <w:p>
       <w:pPr>
         <w:pStyle w:val="ListNumber"/>
+        <w:spacing w:after="60"/>
       </w:pPr>
       <w:r>
         <w:rPr>
           <w:rFonts w:ascii="Times New Roman" w:hAnsi="Times New Roman"/>
+          <w:b w:val="0"/>
           <w:sz w:val="24"/>
         </w:rPr>
         <w:t>Flask-Limiter Documentation. URL: https://flask-limiter.readthedocs.io/en/stable/ (дата обращения: 29.05.2026).</w:t>
@@ -1917,10 +4481,12 @@
     <w:p>
       <w:pPr>
         <w:pStyle w:val="ListNumber"/>
+        <w:spacing w:after="60"/>
       </w:pPr>
       <w:r>
         <w:rPr>
           <w:rFonts w:ascii="Times New Roman" w:hAnsi="Times New Roman"/>
+          <w:b w:val="0"/>
           <w:sz w:val="24"/>
         </w:rPr>
         <w:t>Python Documentation. json — JSON encoder and decoder. URL: https://docs.python.org/3/library/json.html (дата обращения: 29.05.2026).</w:t>
@@ -1929,16 +4495,33 @@
     <w:p>
       <w:pPr>
         <w:pStyle w:val="ListNumber"/>
+        <w:spacing w:after="60"/>
       </w:pPr>
       <w:r>
         <w:rPr>
           <w:rFonts w:ascii="Times New Roman" w:hAnsi="Times New Roman"/>
+          <w:b w:val="0"/>
           <w:sz w:val="24"/>
         </w:rPr>
         <w:t>Requests Documentation. Quickstart. URL: https://requests.readthedocs.io/en/stable/user/quickstart/ (дата обращения: 29.05.2026).</w:t>
       </w:r>
     </w:p>
+    <w:p>
+      <w:pPr>
+        <w:pStyle w:val="ListNumber"/>
+        <w:spacing w:after="60"/>
+      </w:pPr>
+      <w:r>
+        <w:rPr>
+          <w:rFonts w:ascii="Times New Roman" w:hAnsi="Times New Roman"/>
+          <w:b w:val="0"/>
+          <w:sz w:val="24"/>
+        </w:rPr>
+        <w:t>Python Documentation. pathlib — Object-oriented filesystem paths. URL: https://docs.python.org/3/library/pathlib.html (дата обращения: 29.05.2026).</w:t>
+      </w:r>
+    </w:p>
     <w:sectPr>
+      <w:headerReference w:type="default" r:id="rId10"/>
       <w:pgSz w:w="12240" w:h="15840"/>
       <w:pgMar w:top="1134" w:right="850" w:bottom="1134" w:left="1417" w:header="720" w:footer="720" w:gutter="0"/>
       <w:cols w:space="720"/>
@@ -1946,6 +4529,51 @@
     </w:sectPr>
   </w:body>
 </w:document>
+</file>
+
+<file path=word/header1.xml><?xml version="1.0" encoding="utf-8"?>
+<w:hdr xmlns:m="http://schemas.openxmlformats.org/officeDocument/2006/math" xmlns:mc="http://schemas.openxmlformats.org/markup-compatibility/2006" xmlns:mo="http://schemas.microsoft.com/office/mac/office/2008/main" xmlns:mv="urn:schemas-microsoft-com:mac:vml" xmlns:o="urn:schemas-microsoft-com:office:office" xmlns:r="http://schemas.openxmlformats.org/officeDocument/2006/relationships" xmlns:v="urn:schemas-microsoft-com:vml" xmlns:w10="urn:schemas-microsoft-com:office:word" xmlns:w14="http://schemas.microsoft.com/office/word/2010/wordml" xmlns:w="http://schemas.openxmlformats.org/wordprocessingml/2006/main" xmlns:wne="http://schemas.microsoft.com/office/word/2006/wordml" xmlns:wp14="http://schemas.microsoft.com/office/word/2010/wordprocessingDrawing" xmlns:wp="http://schemas.openxmlformats.org/drawingml/2006/wordprocessingDrawing" xmlns:wpc="http://schemas.microsoft.com/office/word/2010/wordprocessingCanvas" xmlns:wpg="http://schemas.microsoft.com/office/word/2010/wordprocessingGroup" xmlns:wpi="http://schemas.microsoft.com/office/word/2010/wordprocessingInk" xmlns:wps="http://schemas.microsoft.com/office/word/2010/wordprocessingShape" mc:Ignorable="w14 wp14">
+  <w:p>
+    <w:pPr>
+      <w:pStyle w:val="Header"/>
+      <w:jc w:val="right"/>
+    </w:pPr>
+    <w:r>
+      <w:drawing>
+        <wp:inline xmlns:a="http://schemas.openxmlformats.org/drawingml/2006/main" xmlns:pic="http://schemas.openxmlformats.org/drawingml/2006/picture">
+          <wp:extent cx="1152000" cy="332800"/>
+          <wp:docPr id="1" name="Picture 1"/>
+          <wp:cNvGraphicFramePr>
+            <a:graphicFrameLocks noChangeAspect="1"/>
+          </wp:cNvGraphicFramePr>
+          <a:graphic>
+            <a:graphicData uri="http://schemas.openxmlformats.org/drawingml/2006/picture">
+              <pic:pic>
+                <pic:nvPicPr>
+                  <pic:cNvPr id="0" name="ngtu_logo.png"/>
+                  <pic:cNvPicPr/>
+                </pic:nvPicPr>
+                <pic:blipFill>
+                  <a:blip r:embed="rId1"/>
+                  <a:stretch>
+                    <a:fillRect/>
+                  </a:stretch>
+                </pic:blipFill>
+                <pic:spPr>
+                  <a:xfrm>
+                    <a:off x="0" y="0"/>
+                    <a:ext cx="1152000" cy="332800"/>
+                  </a:xfrm>
+                  <a:prstGeom prst="rect"/>
+                </pic:spPr>
+              </pic:pic>
+            </a:graphicData>
+          </a:graphic>
+        </wp:inline>
+      </w:drawing>
+    </w:r>
+  </w:p>
+</w:hdr>
 </file>
 
 <file path=word/numbering.xml><?xml version="1.0" encoding="utf-8"?>

</xml_diff>

<commit_message>
Expand report and remove logo
</commit_message>
<xml_diff>
--- a/docs/LR_8_key_value_report.docx
+++ b/docs/LR_8_key_value_report.docx
@@ -4,46 +4,7 @@
   <w:body>
     <w:p>
       <w:pPr>
-        <w:jc w:val="center"/>
-      </w:pPr>
-      <w:r>
-        <w:drawing>
-          <wp:inline xmlns:a="http://schemas.openxmlformats.org/drawingml/2006/main" xmlns:pic="http://schemas.openxmlformats.org/drawingml/2006/picture">
-            <wp:extent cx="3060000" cy="884000"/>
-            <wp:docPr id="1" name="Picture 1"/>
-            <wp:cNvGraphicFramePr>
-              <a:graphicFrameLocks noChangeAspect="1"/>
-            </wp:cNvGraphicFramePr>
-            <a:graphic>
-              <a:graphicData uri="http://schemas.openxmlformats.org/drawingml/2006/picture">
-                <pic:pic>
-                  <pic:nvPicPr>
-                    <pic:cNvPr id="0" name="ngtu_logo.png"/>
-                    <pic:cNvPicPr/>
-                  </pic:nvPicPr>
-                  <pic:blipFill>
-                    <a:blip r:embed="rId9"/>
-                    <a:stretch>
-                      <a:fillRect/>
-                    </a:stretch>
-                  </pic:blipFill>
-                  <pic:spPr>
-                    <a:xfrm>
-                      <a:off x="0" y="0"/>
-                      <a:ext cx="3060000" cy="884000"/>
-                    </a:xfrm>
-                    <a:prstGeom prst="rect"/>
-                  </pic:spPr>
-                </pic:pic>
-              </a:graphicData>
-            </a:graphic>
-          </wp:inline>
-        </w:drawing>
-      </w:r>
-    </w:p>
-    <w:p>
-      <w:pPr>
-        <w:spacing w:after="80"/>
+        <w:spacing w:after="100"/>
         <w:jc w:val="center"/>
       </w:pPr>
       <w:r>
@@ -57,7 +18,7 @@
     </w:p>
     <w:p>
       <w:pPr>
-        <w:spacing w:after="80"/>
+        <w:spacing w:after="100"/>
         <w:jc w:val="center"/>
       </w:pPr>
       <w:r>
@@ -71,7 +32,7 @@
     </w:p>
     <w:p>
       <w:pPr>
-        <w:spacing w:after="80"/>
+        <w:spacing w:after="100"/>
         <w:jc w:val="center"/>
       </w:pPr>
       <w:r>
@@ -85,7 +46,7 @@
     </w:p>
     <w:p>
       <w:pPr>
-        <w:spacing w:after="80"/>
+        <w:spacing w:after="100"/>
         <w:jc w:val="center"/>
       </w:pPr>
       <w:r>
@@ -100,35 +61,35 @@
     <w:p/>
     <w:p>
       <w:pPr>
-        <w:spacing w:after="80"/>
+        <w:spacing w:after="100"/>
         <w:jc w:val="center"/>
       </w:pPr>
       <w:r>
         <w:rPr>
           <w:rFonts w:ascii="Times New Roman" w:hAnsi="Times New Roman"/>
           <w:b/>
-          <w:sz w:val="28"/>
+          <w:sz w:val="30"/>
         </w:rPr>
         <w:t>ОТЧЕТ</w:t>
       </w:r>
     </w:p>
     <w:p>
       <w:pPr>
-        <w:spacing w:after="80"/>
+        <w:spacing w:after="100"/>
         <w:jc w:val="center"/>
       </w:pPr>
       <w:r>
         <w:rPr>
           <w:rFonts w:ascii="Times New Roman" w:hAnsi="Times New Roman"/>
           <w:b/>
-          <w:sz w:val="28"/>
+          <w:sz w:val="30"/>
         </w:rPr>
         <w:t>о выполнении лабораторной работы №8</w:t>
       </w:r>
     </w:p>
     <w:p>
       <w:pPr>
-        <w:spacing w:after="80"/>
+        <w:spacing w:after="100"/>
         <w:jc w:val="center"/>
       </w:pPr>
       <w:r>
@@ -142,7 +103,7 @@
     </w:p>
     <w:p>
       <w:pPr>
-        <w:spacing w:after="80"/>
+        <w:spacing w:after="100"/>
         <w:jc w:val="center"/>
       </w:pPr>
       <w:r>
@@ -157,7 +118,7 @@
     <w:p/>
     <w:p>
       <w:pPr>
-        <w:spacing w:after="80"/>
+        <w:spacing w:after="100"/>
         <w:jc w:val="right"/>
       </w:pPr>
       <w:r>
@@ -171,7 +132,7 @@
     </w:p>
     <w:p>
       <w:pPr>
-        <w:spacing w:after="80"/>
+        <w:spacing w:after="100"/>
         <w:jc w:val="right"/>
       </w:pPr>
       <w:r>
@@ -186,7 +147,7 @@
     <w:p/>
     <w:p>
       <w:pPr>
-        <w:spacing w:after="80"/>
+        <w:spacing w:after="100"/>
         <w:jc w:val="center"/>
       </w:pPr>
       <w:r>
@@ -213,13 +174,13 @@
           <w:b/>
           <w:sz w:val="28"/>
         </w:rPr>
-        <w:t>Содержание выполненной работы</w:t>
+        <w:t>Введение</w:t>
       </w:r>
     </w:p>
     <w:p>
       <w:pPr>
-        <w:pStyle w:val="ListBullet"/>
-        <w:spacing w:after="60"/>
+        <w:spacing w:after="100"/>
+        <w:ind w:firstLine="425"/>
       </w:pPr>
       <w:r>
         <w:rPr>
@@ -227,13 +188,13 @@
           <w:b w:val="0"/>
           <w:sz w:val="24"/>
         </w:rPr>
-        <w:t>поставлена задача и определены требования лабораторной работы;</w:t>
+        <w:t>Данная лабораторная работа посвящена разработке простого key-value хранилища. Несмотря на небольшой объем исходной задачи, тема важна для понимания того, как веб-приложение принимает запросы, изменяет внутреннее состояние, сохраняет данные во внешний файл и возвращает результат клиенту в формате JSON.</w:t>
       </w:r>
     </w:p>
     <w:p>
       <w:pPr>
-        <w:pStyle w:val="ListBullet"/>
-        <w:spacing w:after="60"/>
+        <w:spacing w:after="100"/>
+        <w:ind w:firstLine="425"/>
       </w:pPr>
       <w:r>
         <w:rPr>
@@ -241,13 +202,13 @@
           <w:b w:val="0"/>
           <w:sz w:val="24"/>
         </w:rPr>
-        <w:t>разработано Flask-приложение с key-value хранилищем;</w:t>
+        <w:t>Выполненное приложение можно рассматривать как учебный пример серверной части. В нем есть основное хранилище data, файл постоянного хранения data.json, HTTP API на Flask, защита от слишком частых запросов через Flask-Limiter и интерфейс для демонстрации работы в браузере.</w:t>
       </w:r>
     </w:p>
     <w:p>
       <w:pPr>
-        <w:pStyle w:val="ListBullet"/>
-        <w:spacing w:after="60"/>
+        <w:spacing w:after="100"/>
+        <w:ind w:firstLine="425"/>
       </w:pPr>
       <w:r>
         <w:rPr>
@@ -255,13 +216,26 @@
           <w:b w:val="0"/>
           <w:sz w:val="24"/>
         </w:rPr>
-        <w:t>реализована автоматическая загрузка данных из data.json при старте;</w:t>
+        <w:t>Такой формат удобен для проверки без устной защиты: преподаватель может открыть отчет, увидеть теоретическое обоснование, посмотреть структуру кода, сравнить API с заданием, изучить скриншоты и при необходимости запустить проект локально или через Docker.</w:t>
       </w:r>
     </w:p>
     <w:p>
       <w:pPr>
-        <w:pStyle w:val="ListBullet"/>
-        <w:spacing w:after="60"/>
+        <w:pStyle w:val="Heading1"/>
+      </w:pPr>
+      <w:r>
+        <w:rPr>
+          <w:rFonts w:ascii="Times New Roman" w:hAnsi="Times New Roman"/>
+          <w:b/>
+          <w:sz w:val="28"/>
+        </w:rPr>
+        <w:t>1. Цель и задачи лабораторной работы</w:t>
+      </w:r>
+    </w:p>
+    <w:p>
+      <w:pPr>
+        <w:spacing w:after="100"/>
+        <w:ind w:firstLine="425"/>
       </w:pPr>
       <w:r>
         <w:rPr>
@@ -269,13 +243,13 @@
           <w:b w:val="0"/>
           <w:sz w:val="24"/>
         </w:rPr>
-        <w:t>реализовано сохранение состояния после каждой изменяющей операции;</w:t>
+        <w:t>Цель лабораторной работы — изучить принципы работы key-value хранилищ и реализовать небольшое программное приложение, которое хранит данные в виде пар «ключ — значение».</w:t>
       </w:r>
     </w:p>
     <w:p>
       <w:pPr>
-        <w:pStyle w:val="ListBullet"/>
-        <w:spacing w:after="60"/>
+        <w:spacing w:after="100"/>
+        <w:ind w:firstLine="425"/>
       </w:pPr>
       <w:r>
         <w:rPr>
@@ -283,7 +257,7 @@
           <w:b w:val="0"/>
           <w:sz w:val="24"/>
         </w:rPr>
-        <w:t>создано API для добавления, получения, удаления и проверки ключей;</w:t>
+        <w:t>В рамках работы необходимо было не только создать маршруты Flask, но и продумать полный цикл работы данных: загрузку из файла при старте, изменение в оперативной памяти, сохранение после операций, обработку ошибок и ограничение запросов.</w:t>
       </w:r>
     </w:p>
     <w:p>
@@ -297,7 +271,7 @@
           <w:b w:val="0"/>
           <w:sz w:val="24"/>
         </w:rPr>
-        <w:t>настроены ограничения запросов через Flask-Limiter;</w:t>
+        <w:t>реализовать хранилище как словарь Python data;</w:t>
       </w:r>
     </w:p>
     <w:p>
@@ -311,7 +285,7 @@
           <w:b w:val="0"/>
           <w:sz w:val="24"/>
         </w:rPr>
-        <w:t>создана демонстрационная HTML-страница для наглядной проверки;</w:t>
+        <w:t>организовать автоматическую загрузку данных из data.json;</w:t>
       </w:r>
     </w:p>
     <w:p>
@@ -325,7 +299,7 @@
           <w:b w:val="0"/>
           <w:sz w:val="24"/>
         </w:rPr>
-        <w:t>создан отдельный клиент client_demo.py на библиотеке requests;</w:t>
+        <w:t>обеспечить сохранение изменений в data.json после операций добавления и удаления;</w:t>
       </w:r>
     </w:p>
     <w:p>
@@ -339,7 +313,63 @@
           <w:b w:val="0"/>
           <w:sz w:val="24"/>
         </w:rPr>
-        <w:t>подготовлены скриншоты, описание работы и список источников.</w:t>
+        <w:t>создать маршруты POST /set, GET /get/&lt;key&gt;, DELETE /delete/&lt;key&gt;, GET /exists/&lt;key&gt;;</w:t>
+      </w:r>
+    </w:p>
+    <w:p>
+      <w:pPr>
+        <w:pStyle w:val="ListBullet"/>
+        <w:spacing w:after="60"/>
+      </w:pPr>
+      <w:r>
+        <w:rPr>
+          <w:rFonts w:ascii="Times New Roman" w:hAnsi="Times New Roman"/>
+          <w:b w:val="0"/>
+          <w:sz w:val="24"/>
+        </w:rPr>
+        <w:t>настроить общий лимит запросов для приложения;</w:t>
+      </w:r>
+    </w:p>
+    <w:p>
+      <w:pPr>
+        <w:pStyle w:val="ListBullet"/>
+        <w:spacing w:after="60"/>
+      </w:pPr>
+      <w:r>
+        <w:rPr>
+          <w:rFonts w:ascii="Times New Roman" w:hAnsi="Times New Roman"/>
+          <w:b w:val="0"/>
+          <w:sz w:val="24"/>
+        </w:rPr>
+        <w:t>настроить отдельный лимит для изменяющих операций /set и /delete;</w:t>
+      </w:r>
+    </w:p>
+    <w:p>
+      <w:pPr>
+        <w:pStyle w:val="ListBullet"/>
+        <w:spacing w:after="60"/>
+      </w:pPr>
+      <w:r>
+        <w:rPr>
+          <w:rFonts w:ascii="Times New Roman" w:hAnsi="Times New Roman"/>
+          <w:b w:val="0"/>
+          <w:sz w:val="24"/>
+        </w:rPr>
+        <w:t>подготовить понятные JSON-ответы для успешных операций и ошибок;</w:t>
+      </w:r>
+    </w:p>
+    <w:p>
+      <w:pPr>
+        <w:pStyle w:val="ListBullet"/>
+        <w:spacing w:after="60"/>
+      </w:pPr>
+      <w:r>
+        <w:rPr>
+          <w:rFonts w:ascii="Times New Roman" w:hAnsi="Times New Roman"/>
+          <w:b w:val="0"/>
+          <w:sz w:val="24"/>
+        </w:rPr>
+        <w:t>сделать демонстрационный интерфейс и подробный отчет со скриншотами.</w:t>
       </w:r>
     </w:p>
     <w:p>
@@ -352,12 +382,12 @@
           <w:b/>
           <w:sz w:val="28"/>
         </w:rPr>
-        <w:t>1. Цель и постановка задачи</w:t>
+        <w:t>2. Теоретическая часть: с чем выполнялась работа</w:t>
       </w:r>
     </w:p>
     <w:p>
       <w:pPr>
-        <w:spacing w:after="80"/>
+        <w:spacing w:after="100"/>
         <w:ind w:firstLine="425"/>
       </w:pPr>
       <w:r>
@@ -366,12 +396,12 @@
           <w:b w:val="0"/>
           <w:sz w:val="24"/>
         </w:rPr>
-        <w:t>Цель лабораторной работы — изучить принципы работы key-value хранилищ и закрепить навыки разработки простого API на Flask. В качестве результата требуется не просто написать отдельные функции, а собрать небольшое приложение, которое можно запустить, проверить через браузер, проверить через HTTP-клиент и передать преподавателю вместе с отчетом.</w:t>
+        <w:t>Key-value хранилище — это способ хранения информации, при котором каждая запись имеет уникальный ключ и связанное с ним значение. Самый простой пример такого подхода в Python — словарь. Если есть ключ, можно быстро получить значение, изменить его или удалить.</w:t>
       </w:r>
     </w:p>
     <w:p>
       <w:pPr>
-        <w:spacing w:after="80"/>
+        <w:spacing w:after="100"/>
         <w:ind w:firstLine="425"/>
       </w:pPr>
       <w:r>
@@ -380,12 +410,12 @@
           <w:b w:val="0"/>
           <w:sz w:val="24"/>
         </w:rPr>
-        <w:t>В лабораторной работе реализовано key-value хранилище, где данные находятся в оперативной памяти в словаре Python data, а постоянное состояние хранится в файле data.json. Такой подход хорошо подходит для учебной задачи: он наглядно показывает связь между памятью приложения, файлом хранения и HTTP-запросами пользователя.</w:t>
+        <w:t>В отличие от таблиц реляционной базы данных, key-value модель не требует заранее описывать сложную структуру колонок. Ключ задает имя записи, а значение может быть строкой, числом, списком или JSON-объектом. Это делает такую модель простой и наглядной для учебной работы.</w:t>
       </w:r>
     </w:p>
     <w:p>
       <w:pPr>
-        <w:spacing w:after="80"/>
+        <w:spacing w:after="100"/>
         <w:ind w:firstLine="425"/>
       </w:pPr>
       <w:r>
@@ -394,13 +424,13 @@
           <w:b w:val="0"/>
           <w:sz w:val="24"/>
         </w:rPr>
-        <w:t>Требования задания были интерпретированы следующим образом:</w:t>
+        <w:t>В данной лабораторной работе ключи представлены строками, например course, lab, storage_type или student. Значения сохраняются в JSON-файл, поэтому они должны быть совместимы с JSON. Это важное ограничение: если объект нельзя сериализовать, его нельзя надежно сохранить в data.json.</w:t>
       </w:r>
     </w:p>
     <w:p>
       <w:pPr>
-        <w:pStyle w:val="ListBullet"/>
-        <w:spacing w:after="60"/>
+        <w:spacing w:after="100"/>
+        <w:ind w:firstLine="425"/>
       </w:pPr>
       <w:r>
         <w:rPr>
@@ -408,13 +438,13 @@
           <w:b w:val="0"/>
           <w:sz w:val="24"/>
         </w:rPr>
-        <w:t>хранилище должно быть представлено словарем data;</w:t>
+        <w:t>Файл data.json используется как постоянное хранилище. Когда Flask-приложение запускается, данные из файла читаются и помещаются в словарь data. После операции добавления или удаления словарь снова записывается в data.json. Благодаря этому данные не пропадают после остановки приложения.</w:t>
       </w:r>
     </w:p>
     <w:p>
       <w:pPr>
-        <w:pStyle w:val="ListBullet"/>
-        <w:spacing w:after="60"/>
+        <w:spacing w:after="100"/>
+        <w:ind w:firstLine="425"/>
       </w:pPr>
       <w:r>
         <w:rPr>
@@ -422,13 +452,13 @@
           <w:b w:val="0"/>
           <w:sz w:val="24"/>
         </w:rPr>
-        <w:t>при запуске приложения файл data.json автоматически читается и превращается в словарь;</w:t>
+        <w:t>HTTP API построено вокруг стандартных методов. Метод POST используется для сохранения значения, GET — для чтения и проверки, DELETE — для удаления. Такое разделение делает маршруты логичными: по методу запроса сразу понятно, какое действие будет выполнено.</w:t>
       </w:r>
     </w:p>
     <w:p>
       <w:pPr>
-        <w:pStyle w:val="ListBullet"/>
-        <w:spacing w:after="60"/>
+        <w:spacing w:after="100"/>
+        <w:ind w:firstLine="425"/>
       </w:pPr>
       <w:r>
         <w:rPr>
@@ -436,13 +466,13 @@
           <w:b w:val="0"/>
           <w:sz w:val="24"/>
         </w:rPr>
-        <w:t>если пользователь добавляет или удаляет ключ, файл data.json сразу обновляется;</w:t>
+        <w:t>JSON выбран в качестве формата обмена данными, потому что он широко используется в веб-приложениях. Его удобно читать человеку, удобно отправлять через Postman или curl, а Python умеет работать с ним через стандартный модуль json.</w:t>
       </w:r>
     </w:p>
     <w:p>
       <w:pPr>
-        <w:pStyle w:val="ListBullet"/>
-        <w:spacing w:after="60"/>
+        <w:spacing w:after="100"/>
+        <w:ind w:firstLine="425"/>
       </w:pPr>
       <w:r>
         <w:rPr>
@@ -450,13 +480,26 @@
           <w:b w:val="0"/>
           <w:sz w:val="24"/>
         </w:rPr>
-        <w:t>API должно возвращать понятные JSON-ответы, а не только HTML-страницы;</w:t>
+        <w:t>Ограничение запросов через Flask-Limiter показывает еще один важный аспект веб-разработки. Сервер должен не только выполнять полезные действия, но и защищаться от слишком частых обращений. В работе общий лимит применяется ко всем маршрутам, а отдельный лимит установлен для операций изменения данных.</w:t>
       </w:r>
     </w:p>
     <w:p>
       <w:pPr>
-        <w:pStyle w:val="ListBullet"/>
-        <w:spacing w:after="60"/>
+        <w:pStyle w:val="Heading1"/>
+      </w:pPr>
+      <w:r>
+        <w:rPr>
+          <w:rFonts w:ascii="Times New Roman" w:hAnsi="Times New Roman"/>
+          <w:b/>
+          <w:sz w:val="28"/>
+        </w:rPr>
+        <w:t>3. Использованные библиотеки и модули</w:t>
+      </w:r>
+    </w:p>
+    <w:p>
+      <w:pPr>
+        <w:spacing w:after="100"/>
+        <w:ind w:firstLine="425"/>
       </w:pPr>
       <w:r>
         <w:rPr>
@@ -464,131 +507,7 @@
           <w:b w:val="0"/>
           <w:sz w:val="24"/>
         </w:rPr>
-        <w:t>ошибки должны возвращаться в едином формате, чтобы их удобно было читать в Postman или curl;</w:t>
-      </w:r>
-    </w:p>
-    <w:p>
-      <w:pPr>
-        <w:pStyle w:val="ListBullet"/>
-        <w:spacing w:after="60"/>
-      </w:pPr>
-      <w:r>
-        <w:rPr>
-          <w:rFonts w:ascii="Times New Roman" w:hAnsi="Times New Roman"/>
-          <w:b w:val="0"/>
-          <w:sz w:val="24"/>
-        </w:rPr>
-        <w:t>ограничение запросов должно защищать приложение от слишком частых операций изменения;</w:t>
-      </w:r>
-    </w:p>
-    <w:p>
-      <w:pPr>
-        <w:pStyle w:val="ListBullet"/>
-        <w:spacing w:after="60"/>
-      </w:pPr>
-      <w:r>
-        <w:rPr>
-          <w:rFonts w:ascii="Times New Roman" w:hAnsi="Times New Roman"/>
-          <w:b w:val="0"/>
-          <w:sz w:val="24"/>
-        </w:rPr>
-        <w:t>должна быть возможность продемонстрировать работу без написания дополнительных команд вручную.</w:t>
-      </w:r>
-    </w:p>
-    <w:p>
-      <w:pPr>
-        <w:pStyle w:val="Heading1"/>
-      </w:pPr>
-      <w:r>
-        <w:rPr>
-          <w:rFonts w:ascii="Times New Roman" w:hAnsi="Times New Roman"/>
-          <w:b/>
-          <w:sz w:val="28"/>
-        </w:rPr>
-        <w:t>2. Теоретическая часть</w:t>
-      </w:r>
-    </w:p>
-    <w:p>
-      <w:pPr>
-        <w:spacing w:after="80"/>
-        <w:ind w:firstLine="425"/>
-      </w:pPr>
-      <w:r>
-        <w:rPr>
-          <w:rFonts w:ascii="Times New Roman" w:hAnsi="Times New Roman"/>
-          <w:b w:val="0"/>
-          <w:sz w:val="24"/>
-        </w:rPr>
-        <w:t>Key-value хранилище — это модель хранения данных, в которой каждая запись представлена парой «ключ — значение». Ключ играет роль уникального идентификатора, а значение содержит полезные данные. В отличие от реляционной базы данных, где данные обычно распределены по таблицам, key-value подход делает акцент на простом и быстром доступе к объекту по его имени.</w:t>
-      </w:r>
-    </w:p>
-    <w:p>
-      <w:pPr>
-        <w:spacing w:after="80"/>
-        <w:ind w:firstLine="425"/>
-      </w:pPr>
-      <w:r>
-        <w:rPr>
-          <w:rFonts w:ascii="Times New Roman" w:hAnsi="Times New Roman"/>
-          <w:b w:val="0"/>
-          <w:sz w:val="24"/>
-        </w:rPr>
-        <w:t>В данной лабораторной работе ключом является строка, например student, course или storage_type. Значением может быть строка, число, список или объект JSON. Так как итоговое состояние сохраняется в data.json, значение дополнительно проверяется на JSON-сериализуемость. Это означает, что приложение не позволит сохранить объект, который невозможно записать в JSON-файл.</w:t>
-      </w:r>
-    </w:p>
-    <w:p>
-      <w:pPr>
-        <w:spacing w:after="80"/>
-        <w:ind w:firstLine="425"/>
-      </w:pPr>
-      <w:r>
-        <w:rPr>
-          <w:rFonts w:ascii="Times New Roman" w:hAnsi="Times New Roman"/>
-          <w:b w:val="0"/>
-          <w:sz w:val="24"/>
-        </w:rPr>
-        <w:t>Файл data.json выбран как простой вариант постоянного хранения. Когда приложение работает, словарь data находится в оперативной памяти. Если приложение остановить, оперативная память очистится, поэтому после каждой операции изменения вызывается сохранение в файл. При новом запуске load_data() снова читает data.json и восстанавливает хранилище.</w:t>
-      </w:r>
-    </w:p>
-    <w:p>
-      <w:pPr>
-        <w:spacing w:after="80"/>
-        <w:ind w:firstLine="425"/>
-      </w:pPr>
-      <w:r>
-        <w:rPr>
-          <w:rFonts w:ascii="Times New Roman" w:hAnsi="Times New Roman"/>
-          <w:b w:val="0"/>
-          <w:sz w:val="24"/>
-        </w:rPr>
-        <w:t>Для организации API применяются разные HTTP-методы. Метод GET используется для чтения данных, POST — для создания или изменения записи, DELETE — для удаления записи. Такое разделение соответствует обычной практике проектирования REST-подобных интерфейсов и делает приложение понятным для проверки.</w:t>
-      </w:r>
-    </w:p>
-    <w:p>
-      <w:pPr>
-        <w:spacing w:after="80"/>
-        <w:ind w:firstLine="425"/>
-      </w:pPr>
-      <w:r>
-        <w:rPr>
-          <w:rFonts w:ascii="Times New Roman" w:hAnsi="Times New Roman"/>
-          <w:b w:val="0"/>
-          <w:sz w:val="24"/>
-        </w:rPr>
-        <w:t>Ограничение запросов является важной частью веб-приложений. Даже учебное приложение может получить слишком много запросов подряд: случайно, из-за ошибки клиента или намеренно. Flask-Limiter позволяет ограничить количество запросов без написания собственной системы подсчета. В работе общий лимит задан для всего приложения, а операции /set и /delete дополнительно ограничены, потому что именно они изменяют состояние файла.</w:t>
-      </w:r>
-    </w:p>
-    <w:p>
-      <w:pPr>
-        <w:pStyle w:val="Heading1"/>
-      </w:pPr>
-      <w:r>
-        <w:rPr>
-          <w:rFonts w:ascii="Times New Roman" w:hAnsi="Times New Roman"/>
-          <w:b/>
-          <w:sz w:val="28"/>
-        </w:rPr>
-        <w:t>3. Использованные библиотеки</w:t>
+        <w:t>В работе использовались как внешние библиотеки, установленные через requirements.txt, так и стандартные модули Python. Ниже приведено подробное описание роли каждой зависимости.</w:t>
       </w:r>
     </w:p>
     <w:tbl>
@@ -629,7 +548,7 @@
                 <w:b/>
                 <w:sz w:val="24"/>
               </w:rPr>
-              <w:t>Где используется</w:t>
+              <w:t>Назначение в работе</w:t>
             </w:r>
           </w:p>
         </w:tc>
@@ -644,7 +563,7 @@
                 <w:b/>
                 <w:sz w:val="24"/>
               </w:rPr>
-              <w:t>Зачем нужен</w:t>
+              <w:t>Почему это важно</w:t>
             </w:r>
           </w:p>
         </w:tc>
@@ -676,7 +595,7 @@
                 <w:b w:val="0"/>
                 <w:sz w:val="24"/>
               </w:rPr>
-              <w:t>app.py</w:t>
+              <w:t>Создание веб-приложения, маршрутов, JSON-ответов и HTML-страницы.</w:t>
             </w:r>
           </w:p>
         </w:tc>
@@ -691,7 +610,7 @@
                 <w:b w:val="0"/>
                 <w:sz w:val="24"/>
               </w:rPr>
-              <w:t>Создание веб-приложения, маршрутов, JSON-ответов и HTML-страницы.</w:t>
+              <w:t>Flask является основой серверной части: он принимает запрос, вызывает нужную функцию и формирует ответ.</w:t>
             </w:r>
           </w:p>
         </w:tc>
@@ -723,7 +642,7 @@
                 <w:b w:val="0"/>
                 <w:sz w:val="24"/>
               </w:rPr>
-              <w:t>app.py</w:t>
+              <w:t>Настройка ограничений 100 запросов в сутки и 10 запросов в минуту для /set и /delete.</w:t>
             </w:r>
           </w:p>
         </w:tc>
@@ -738,7 +657,54 @@
                 <w:b w:val="0"/>
                 <w:sz w:val="24"/>
               </w:rPr>
-              <w:t>Ограничение частоты запросов: общий лимит и отдельные лимиты для изменяющих маршрутов.</w:t>
+              <w:t>Позволяет показать, как API защищается от слишком частых запросов.</w:t>
+            </w:r>
+          </w:p>
+        </w:tc>
+      </w:tr>
+      <w:tr>
+        <w:tc>
+          <w:tcPr>
+            <w:tcW w:type="dxa" w:w="3324"/>
+          </w:tcPr>
+          <w:p>
+            <w:r>
+              <w:rPr>
+                <w:rFonts w:ascii="Times New Roman" w:hAnsi="Times New Roman"/>
+                <w:b w:val="0"/>
+                <w:sz w:val="24"/>
+              </w:rPr>
+              <w:t>requests</w:t>
+            </w:r>
+          </w:p>
+        </w:tc>
+        <w:tc>
+          <w:tcPr>
+            <w:tcW w:type="dxa" w:w="3324"/>
+          </w:tcPr>
+          <w:p>
+            <w:r>
+              <w:rPr>
+                <w:rFonts w:ascii="Times New Roman" w:hAnsi="Times New Roman"/>
+                <w:b w:val="0"/>
+                <w:sz w:val="24"/>
+              </w:rPr>
+              <w:t>Отправка запросов в client_demo.py.</w:t>
+            </w:r>
+          </w:p>
+        </w:tc>
+        <w:tc>
+          <w:tcPr>
+            <w:tcW w:type="dxa" w:w="3324"/>
+          </w:tcPr>
+          <w:p>
+            <w:r>
+              <w:rPr>
+                <w:rFonts w:ascii="Times New Roman" w:hAnsi="Times New Roman"/>
+                <w:b w:val="0"/>
+                <w:sz w:val="24"/>
+              </w:rPr>
+              <w:t>Доказывает, что приложение работает как API и может использоваться сторонним клиентом.</w:t>
             </w:r>
           </w:p>
         </w:tc>
@@ -770,7 +736,7 @@
                 <w:b w:val="0"/>
                 <w:sz w:val="24"/>
               </w:rPr>
-              <w:t>app.py</w:t>
+              <w:t>Чтение и запись data.json, проверка сериализуемости значения.</w:t>
             </w:r>
           </w:p>
         </w:tc>
@@ -785,7 +751,7 @@
                 <w:b w:val="0"/>
                 <w:sz w:val="24"/>
               </w:rPr>
-              <w:t>Чтение data.json, запись data.json, проверка сериализуемости значений.</w:t>
+              <w:t>Без json невозможно корректно сохранять словарь data в файл.</w:t>
             </w:r>
           </w:p>
         </w:tc>
@@ -817,7 +783,7 @@
                 <w:b w:val="0"/>
                 <w:sz w:val="24"/>
               </w:rPr>
-              <w:t>app.py</w:t>
+              <w:t>Формирование путей к data.json и файлам проекта.</w:t>
             </w:r>
           </w:p>
         </w:tc>
@@ -832,7 +798,7 @@
                 <w:b w:val="0"/>
                 <w:sz w:val="24"/>
               </w:rPr>
-              <w:t>Формирование безопасных путей к файлам проекта и data.json.</w:t>
+              <w:t>Делает работу с путями понятнее и надежнее, чем ручная сборка строк.</w:t>
             </w:r>
           </w:p>
         </w:tc>
@@ -864,7 +830,7 @@
                 <w:b w:val="0"/>
                 <w:sz w:val="24"/>
               </w:rPr>
-              <w:t>app.py</w:t>
+              <w:t>Блокировка операций чтения/записи data.</w:t>
             </w:r>
           </w:p>
         </w:tc>
@@ -879,7 +845,7 @@
                 <w:b w:val="0"/>
                 <w:sz w:val="24"/>
               </w:rPr>
-              <w:t>Защита словаря data и файла от одновременной записи несколькими запросами.</w:t>
+              <w:t>Нужна, чтобы несколько запросов не изменяли словарь и файл одновременно.</w:t>
             </w:r>
           </w:p>
         </w:tc>
@@ -911,7 +877,7 @@
                 <w:b w:val="0"/>
                 <w:sz w:val="24"/>
               </w:rPr>
-              <w:t>app.py</w:t>
+              <w:t>Описание типа значения в словаре.</w:t>
             </w:r>
           </w:p>
         </w:tc>
@@ -926,54 +892,7 @@
                 <w:b w:val="0"/>
                 <w:sz w:val="24"/>
               </w:rPr>
-              <w:t>Пояснение, что значение key-value хранилища может быть разных типов.</w:t>
-            </w:r>
-          </w:p>
-        </w:tc>
-      </w:tr>
-      <w:tr>
-        <w:tc>
-          <w:tcPr>
-            <w:tcW w:type="dxa" w:w="3324"/>
-          </w:tcPr>
-          <w:p>
-            <w:r>
-              <w:rPr>
-                <w:rFonts w:ascii="Times New Roman" w:hAnsi="Times New Roman"/>
-                <w:b w:val="0"/>
-                <w:sz w:val="24"/>
-              </w:rPr>
-              <w:t>requests</w:t>
-            </w:r>
-          </w:p>
-        </w:tc>
-        <w:tc>
-          <w:tcPr>
-            <w:tcW w:type="dxa" w:w="3324"/>
-          </w:tcPr>
-          <w:p>
-            <w:r>
-              <w:rPr>
-                <w:rFonts w:ascii="Times New Roman" w:hAnsi="Times New Roman"/>
-                <w:b w:val="0"/>
-                <w:sz w:val="24"/>
-              </w:rPr>
-              <w:t>client_demo.py</w:t>
-            </w:r>
-          </w:p>
-        </w:tc>
-        <w:tc>
-          <w:tcPr>
-            <w:tcW w:type="dxa" w:w="3324"/>
-          </w:tcPr>
-          <w:p>
-            <w:r>
-              <w:rPr>
-                <w:rFonts w:ascii="Times New Roman" w:hAnsi="Times New Roman"/>
-                <w:b w:val="0"/>
-                <w:sz w:val="24"/>
-              </w:rPr>
-              <w:t>Отправка HTTP-запросов к API из отдельного демонстрационного клиента.</w:t>
+              <w:t>Показывает, что значение key-value хранилища может быть разного типа.</w:t>
             </w:r>
           </w:p>
         </w:tc>
@@ -1005,7 +924,7 @@
                 <w:b w:val="0"/>
                 <w:sz w:val="24"/>
               </w:rPr>
-              <w:t>app.py</w:t>
+              <w:t>Обработка HTTP-ошибок.</w:t>
             </w:r>
           </w:p>
         </w:tc>
@@ -1020,7 +939,7 @@
                 <w:b w:val="0"/>
                 <w:sz w:val="24"/>
               </w:rPr>
-              <w:t>Единая обработка HTTP-ошибок и возврат их в JSON-формате.</w:t>
+              <w:t>Позволяет возвращать ошибки в едином JSON-формате.</w:t>
             </w:r>
           </w:p>
         </w:tc>
@@ -1029,7 +948,7 @@
     <w:p/>
     <w:p>
       <w:pPr>
-        <w:spacing w:after="80"/>
+        <w:spacing w:after="100"/>
         <w:ind w:firstLine="425"/>
       </w:pPr>
       <w:r>
@@ -1038,12 +957,12 @@
           <w:b w:val="0"/>
           <w:sz w:val="24"/>
         </w:rPr>
-        <w:t>Отдельно стоит отметить Flask-Limiter. В приложении используется storage_uri='memory://', то есть счетчики лимитов хранятся в памяти процесса. Для учебной лабораторной работы этого достаточно: лимит виден, его можно проверить, и не требуется поднимать Redis или другую внешнюю систему хранения счетчиков.</w:t>
+        <w:t>Flask в данной работе используется как учебный веб-фреймворк. Он не требует сложной настройки, но позволяет реализовать полноценные маршруты, обработку методов GET/POST/DELETE и возврат JSON.</w:t>
       </w:r>
     </w:p>
     <w:p>
       <w:pPr>
-        <w:spacing w:after="80"/>
+        <w:spacing w:after="100"/>
         <w:ind w:firstLine="425"/>
       </w:pPr>
       <w:r>
@@ -1052,7 +971,35 @@
           <w:b w:val="0"/>
           <w:sz w:val="24"/>
         </w:rPr>
-        <w:t>Модуль json используется не только для записи файла, но и как часть проверки входных данных. Если значение не может быть сериализовано, приложение возвращает ошибку. Это предотвращает ситуацию, когда пользователь отправил данные, сервер принял их в память, но потом не смог сохранить в data.json.</w:t>
+        <w:t>Flask-Limiter подключается к Flask-приложению через объект Limiter. В настройке указан key_func=get_remote_address, то есть лимит считается по IP-адресу клиента. Для учебной работы используется memory://, поэтому счетчики лимитов находятся в памяти процесса.</w:t>
+      </w:r>
+    </w:p>
+    <w:p>
+      <w:pPr>
+        <w:spacing w:after="100"/>
+        <w:ind w:firstLine="425"/>
+      </w:pPr>
+      <w:r>
+        <w:rPr>
+          <w:rFonts w:ascii="Times New Roman" w:hAnsi="Times New Roman"/>
+          <w:b w:val="0"/>
+          <w:sz w:val="24"/>
+        </w:rPr>
+        <w:t>Модуль json выполняет две роли. Первая — чтение и запись файла data.json. Вторая — проверка того, что значение действительно можно сохранить. Это делает приложение аккуратнее, потому что ошибка обнаруживается до записи в файл.</w:t>
+      </w:r>
+    </w:p>
+    <w:p>
+      <w:pPr>
+        <w:spacing w:after="100"/>
+        <w:ind w:firstLine="425"/>
+      </w:pPr>
+      <w:r>
+        <w:rPr>
+          <w:rFonts w:ascii="Times New Roman" w:hAnsi="Times New Roman"/>
+          <w:b w:val="0"/>
+          <w:sz w:val="24"/>
+        </w:rPr>
+        <w:t>Библиотека requests вынесена в отдельный клиент client_demo.py. Это сделано специально: браузерная страница показывает визуальную часть, а requests показывает, что сервер можно использовать программно как обычное API.</w:t>
       </w:r>
     </w:p>
     <w:p>
@@ -1075,13 +1022,14 @@
         <w:tblLook w:firstColumn="1" w:firstRow="1" w:lastColumn="0" w:lastRow="0" w:noHBand="0" w:noVBand="1" w:val="04A0"/>
       </w:tblPr>
       <w:tblGrid>
-        <w:gridCol w:w="4986"/>
-        <w:gridCol w:w="4986"/>
+        <w:gridCol w:w="3324"/>
+        <w:gridCol w:w="3324"/>
+        <w:gridCol w:w="3324"/>
       </w:tblGrid>
       <w:tr>
         <w:tc>
           <w:tcPr>
-            <w:tcW w:type="dxa" w:w="4986"/>
+            <w:tcW w:type="dxa" w:w="3324"/>
           </w:tcPr>
           <w:p>
             <w:r>
@@ -1090,13 +1038,13 @@
                 <w:b/>
                 <w:sz w:val="24"/>
               </w:rPr>
-              <w:t>Файл</w:t>
+              <w:t>Файл или папка</w:t>
             </w:r>
           </w:p>
         </w:tc>
         <w:tc>
           <w:tcPr>
-            <w:tcW w:type="dxa" w:w="4986"/>
+            <w:tcW w:type="dxa" w:w="3324"/>
           </w:tcPr>
           <w:p>
             <w:r>
@@ -1105,7 +1053,22 @@
                 <w:b/>
                 <w:sz w:val="24"/>
               </w:rPr>
-              <w:t>Подробное назначение</w:t>
+              <w:t>Содержание</w:t>
+            </w:r>
+          </w:p>
+        </w:tc>
+        <w:tc>
+          <w:tcPr>
+            <w:tcW w:type="dxa" w:w="3324"/>
+          </w:tcPr>
+          <w:p>
+            <w:r>
+              <w:rPr>
+                <w:rFonts w:ascii="Times New Roman" w:hAnsi="Times New Roman"/>
+                <w:b/>
+                <w:sz w:val="24"/>
+              </w:rPr>
+              <w:t>Роль при проверке</w:t>
             </w:r>
           </w:p>
         </w:tc>
@@ -1113,7 +1076,7 @@
       <w:tr>
         <w:tc>
           <w:tcPr>
-            <w:tcW w:type="dxa" w:w="4986"/>
+            <w:tcW w:type="dxa" w:w="3324"/>
           </w:tcPr>
           <w:p>
             <w:r>
@@ -1128,7 +1091,7 @@
         </w:tc>
         <w:tc>
           <w:tcPr>
-            <w:tcW w:type="dxa" w:w="4986"/>
+            <w:tcW w:type="dxa" w:w="3324"/>
           </w:tcPr>
           <w:p>
             <w:r>
@@ -1137,7 +1100,22 @@
                 <w:b w:val="0"/>
                 <w:sz w:val="24"/>
               </w:rPr>
-              <w:t>Основное приложение. Содержит настройки Flask, Limiter, словарь data, функции load_data/save_data, валидацию и маршруты API.</w:t>
+              <w:t>Главный файл Flask-приложения.</w:t>
+            </w:r>
+          </w:p>
+        </w:tc>
+        <w:tc>
+          <w:tcPr>
+            <w:tcW w:type="dxa" w:w="3324"/>
+          </w:tcPr>
+          <w:p>
+            <w:r>
+              <w:rPr>
+                <w:rFonts w:ascii="Times New Roman" w:hAnsi="Times New Roman"/>
+                <w:b w:val="0"/>
+                <w:sz w:val="24"/>
+              </w:rPr>
+              <w:t>Именно здесь находятся хранилище data, маршруты API, загрузка и сохранение data.json.</w:t>
             </w:r>
           </w:p>
         </w:tc>
@@ -1145,7 +1123,7 @@
       <w:tr>
         <w:tc>
           <w:tcPr>
-            <w:tcW w:type="dxa" w:w="4986"/>
+            <w:tcW w:type="dxa" w:w="3324"/>
           </w:tcPr>
           <w:p>
             <w:r>
@@ -1160,7 +1138,7 @@
         </w:tc>
         <w:tc>
           <w:tcPr>
-            <w:tcW w:type="dxa" w:w="4986"/>
+            <w:tcW w:type="dxa" w:w="3324"/>
           </w:tcPr>
           <w:p>
             <w:r>
@@ -1169,7 +1147,22 @@
                 <w:b w:val="0"/>
                 <w:sz w:val="24"/>
               </w:rPr>
-              <w:t>Файл начальных и текущих данных. При старте загружается в словарь data, после изменений перезаписывается.</w:t>
+              <w:t>Файл с начальными и текущими данными.</w:t>
+            </w:r>
+          </w:p>
+        </w:tc>
+        <w:tc>
+          <w:tcPr>
+            <w:tcW w:type="dxa" w:w="3324"/>
+          </w:tcPr>
+          <w:p>
+            <w:r>
+              <w:rPr>
+                <w:rFonts w:ascii="Times New Roman" w:hAnsi="Times New Roman"/>
+                <w:b w:val="0"/>
+                <w:sz w:val="24"/>
+              </w:rPr>
+              <w:t>По нему видно, что данные сохраняются между запусками.</w:t>
             </w:r>
           </w:p>
         </w:tc>
@@ -1177,7 +1170,7 @@
       <w:tr>
         <w:tc>
           <w:tcPr>
-            <w:tcW w:type="dxa" w:w="4986"/>
+            <w:tcW w:type="dxa" w:w="3324"/>
           </w:tcPr>
           <w:p>
             <w:r>
@@ -1192,7 +1185,7 @@
         </w:tc>
         <w:tc>
           <w:tcPr>
-            <w:tcW w:type="dxa" w:w="4986"/>
+            <w:tcW w:type="dxa" w:w="3324"/>
           </w:tcPr>
           <w:p>
             <w:r>
@@ -1201,7 +1194,22 @@
                 <w:b w:val="0"/>
                 <w:sz w:val="24"/>
               </w:rPr>
-              <w:t>Демонстрационный интерфейс: формы для /set, /get, /exists, /delete и область с JSON-ответом сервера.</w:t>
+              <w:t>HTML-страница демонстрации.</w:t>
+            </w:r>
+          </w:p>
+        </w:tc>
+        <w:tc>
+          <w:tcPr>
+            <w:tcW w:type="dxa" w:w="3324"/>
+          </w:tcPr>
+          <w:p>
+            <w:r>
+              <w:rPr>
+                <w:rFonts w:ascii="Times New Roman" w:hAnsi="Times New Roman"/>
+                <w:b w:val="0"/>
+                <w:sz w:val="24"/>
+              </w:rPr>
+              <w:t>Позволяет преподавателю проверить API через браузер.</w:t>
             </w:r>
           </w:p>
         </w:tc>
@@ -1209,7 +1217,7 @@
       <w:tr>
         <w:tc>
           <w:tcPr>
-            <w:tcW w:type="dxa" w:w="4986"/>
+            <w:tcW w:type="dxa" w:w="3324"/>
           </w:tcPr>
           <w:p>
             <w:r>
@@ -1224,7 +1232,7 @@
         </w:tc>
         <w:tc>
           <w:tcPr>
-            <w:tcW w:type="dxa" w:w="4986"/>
+            <w:tcW w:type="dxa" w:w="3324"/>
           </w:tcPr>
           <w:p>
             <w:r>
@@ -1233,7 +1241,22 @@
                 <w:b w:val="0"/>
                 <w:sz w:val="24"/>
               </w:rPr>
-              <w:t>Внешний вид страницы: панели, таблица, кнопки, блок JSON-ответа, адаптивная верстка.</w:t>
+              <w:t>Стили интерфейса.</w:t>
+            </w:r>
+          </w:p>
+        </w:tc>
+        <w:tc>
+          <w:tcPr>
+            <w:tcW w:type="dxa" w:w="3324"/>
+          </w:tcPr>
+          <w:p>
+            <w:r>
+              <w:rPr>
+                <w:rFonts w:ascii="Times New Roman" w:hAnsi="Times New Roman"/>
+                <w:b w:val="0"/>
+                <w:sz w:val="24"/>
+              </w:rPr>
+              <w:t>Делает демонстрационную страницу читаемой и аккуратной.</w:t>
             </w:r>
           </w:p>
         </w:tc>
@@ -1241,7 +1264,7 @@
       <w:tr>
         <w:tc>
           <w:tcPr>
-            <w:tcW w:type="dxa" w:w="4986"/>
+            <w:tcW w:type="dxa" w:w="3324"/>
           </w:tcPr>
           <w:p>
             <w:r>
@@ -1256,7 +1279,7 @@
         </w:tc>
         <w:tc>
           <w:tcPr>
-            <w:tcW w:type="dxa" w:w="4986"/>
+            <w:tcW w:type="dxa" w:w="3324"/>
           </w:tcPr>
           <w:p>
             <w:r>
@@ -1265,7 +1288,22 @@
                 <w:b w:val="0"/>
                 <w:sz w:val="24"/>
               </w:rPr>
-              <w:t>Отдельный Python-клиент на requests, показывающий, что API можно использовать не только из браузера.</w:t>
+              <w:t>Скрипт проверки через requests.</w:t>
+            </w:r>
+          </w:p>
+        </w:tc>
+        <w:tc>
+          <w:tcPr>
+            <w:tcW w:type="dxa" w:w="3324"/>
+          </w:tcPr>
+          <w:p>
+            <w:r>
+              <w:rPr>
+                <w:rFonts w:ascii="Times New Roman" w:hAnsi="Times New Roman"/>
+                <w:b w:val="0"/>
+                <w:sz w:val="24"/>
+              </w:rPr>
+              <w:t>Показывает работу API без браузера.</w:t>
             </w:r>
           </w:p>
         </w:tc>
@@ -1273,7 +1311,7 @@
       <w:tr>
         <w:tc>
           <w:tcPr>
-            <w:tcW w:type="dxa" w:w="4986"/>
+            <w:tcW w:type="dxa" w:w="3324"/>
           </w:tcPr>
           <w:p>
             <w:r>
@@ -1288,7 +1326,7 @@
         </w:tc>
         <w:tc>
           <w:tcPr>
-            <w:tcW w:type="dxa" w:w="4986"/>
+            <w:tcW w:type="dxa" w:w="3324"/>
           </w:tcPr>
           <w:p>
             <w:r>
@@ -1297,7 +1335,22 @@
                 <w:b w:val="0"/>
                 <w:sz w:val="24"/>
               </w:rPr>
-              <w:t>Зависимости проекта: Flask, Flask-Limiter, requests.</w:t>
+              <w:t>Список зависимостей.</w:t>
+            </w:r>
+          </w:p>
+        </w:tc>
+        <w:tc>
+          <w:tcPr>
+            <w:tcW w:type="dxa" w:w="3324"/>
+          </w:tcPr>
+          <w:p>
+            <w:r>
+              <w:rPr>
+                <w:rFonts w:ascii="Times New Roman" w:hAnsi="Times New Roman"/>
+                <w:b w:val="0"/>
+                <w:sz w:val="24"/>
+              </w:rPr>
+              <w:t>Позволяет быстро установить нужные библиотеки.</w:t>
             </w:r>
           </w:p>
         </w:tc>
@@ -1305,7 +1358,7 @@
       <w:tr>
         <w:tc>
           <w:tcPr>
-            <w:tcW w:type="dxa" w:w="4986"/>
+            <w:tcW w:type="dxa" w:w="3324"/>
           </w:tcPr>
           <w:p>
             <w:r>
@@ -1320,7 +1373,7 @@
         </w:tc>
         <w:tc>
           <w:tcPr>
-            <w:tcW w:type="dxa" w:w="4986"/>
+            <w:tcW w:type="dxa" w:w="3324"/>
           </w:tcPr>
           <w:p>
             <w:r>
@@ -1329,7 +1382,22 @@
                 <w:b w:val="0"/>
                 <w:sz w:val="24"/>
               </w:rPr>
-              <w:t>Сборка контейнера с Python и зависимостями.</w:t>
+              <w:t>Описание Docker-образа.</w:t>
+            </w:r>
+          </w:p>
+        </w:tc>
+        <w:tc>
+          <w:tcPr>
+            <w:tcW w:type="dxa" w:w="3324"/>
+          </w:tcPr>
+          <w:p>
+            <w:r>
+              <w:rPr>
+                <w:rFonts w:ascii="Times New Roman" w:hAnsi="Times New Roman"/>
+                <w:b w:val="0"/>
+                <w:sz w:val="24"/>
+              </w:rPr>
+              <w:t>Нужен для контейнерного запуска.</w:t>
             </w:r>
           </w:p>
         </w:tc>
@@ -1337,7 +1405,7 @@
       <w:tr>
         <w:tc>
           <w:tcPr>
-            <w:tcW w:type="dxa" w:w="4986"/>
+            <w:tcW w:type="dxa" w:w="3324"/>
           </w:tcPr>
           <w:p>
             <w:r>
@@ -1352,7 +1420,7 @@
         </w:tc>
         <w:tc>
           <w:tcPr>
-            <w:tcW w:type="dxa" w:w="4986"/>
+            <w:tcW w:type="dxa" w:w="3324"/>
           </w:tcPr>
           <w:p>
             <w:r>
@@ -1361,7 +1429,22 @@
                 <w:b w:val="0"/>
                 <w:sz w:val="24"/>
               </w:rPr>
-              <w:t>Удобный запуск приложения в Docker с пробросом порта и подключением файла data.json.</w:t>
+              <w:t>Настройка сервиса lab8.</w:t>
+            </w:r>
+          </w:p>
+        </w:tc>
+        <w:tc>
+          <w:tcPr>
+            <w:tcW w:type="dxa" w:w="3324"/>
+          </w:tcPr>
+          <w:p>
+            <w:r>
+              <w:rPr>
+                <w:rFonts w:ascii="Times New Roman" w:hAnsi="Times New Roman"/>
+                <w:b w:val="0"/>
+                <w:sz w:val="24"/>
+              </w:rPr>
+              <w:t>Позволяет запустить приложение одной командой Docker Compose.</w:t>
             </w:r>
           </w:p>
         </w:tc>
@@ -1369,7 +1452,7 @@
       <w:tr>
         <w:tc>
           <w:tcPr>
-            <w:tcW w:type="dxa" w:w="4986"/>
+            <w:tcW w:type="dxa" w:w="3324"/>
           </w:tcPr>
           <w:p>
             <w:r>
@@ -1384,7 +1467,7 @@
         </w:tc>
         <w:tc>
           <w:tcPr>
-            <w:tcW w:type="dxa" w:w="4986"/>
+            <w:tcW w:type="dxa" w:w="3324"/>
           </w:tcPr>
           <w:p>
             <w:r>
@@ -1393,7 +1476,22 @@
                 <w:b w:val="0"/>
                 <w:sz w:val="24"/>
               </w:rPr>
-              <w:t>Скриншоты, вставленные в отчет.</w:t>
+              <w:t>Скриншоты работы.</w:t>
+            </w:r>
+          </w:p>
+        </w:tc>
+        <w:tc>
+          <w:tcPr>
+            <w:tcW w:type="dxa" w:w="3324"/>
+          </w:tcPr>
+          <w:p>
+            <w:r>
+              <w:rPr>
+                <w:rFonts w:ascii="Times New Roman" w:hAnsi="Times New Roman"/>
+                <w:b w:val="0"/>
+                <w:sz w:val="24"/>
+              </w:rPr>
+              <w:t>Используются в отчете как доказательство выполнения сценариев.</w:t>
             </w:r>
           </w:p>
         </w:tc>
@@ -1401,7 +1499,7 @@
       <w:tr>
         <w:tc>
           <w:tcPr>
-            <w:tcW w:type="dxa" w:w="4986"/>
+            <w:tcW w:type="dxa" w:w="3324"/>
           </w:tcPr>
           <w:p>
             <w:r>
@@ -1416,7 +1514,7 @@
         </w:tc>
         <w:tc>
           <w:tcPr>
-            <w:tcW w:type="dxa" w:w="4986"/>
+            <w:tcW w:type="dxa" w:w="3324"/>
           </w:tcPr>
           <w:p>
             <w:r>
@@ -1425,7 +1523,22 @@
                 <w:b w:val="0"/>
                 <w:sz w:val="24"/>
               </w:rPr>
-              <w:t>Итоговый отчет по лабораторной работе.</w:t>
+              <w:t>Итоговый отчет.</w:t>
+            </w:r>
+          </w:p>
+        </w:tc>
+        <w:tc>
+          <w:tcPr>
+            <w:tcW w:type="dxa" w:w="3324"/>
+          </w:tcPr>
+          <w:p>
+            <w:r>
+              <w:rPr>
+                <w:rFonts w:ascii="Times New Roman" w:hAnsi="Times New Roman"/>
+                <w:b w:val="0"/>
+                <w:sz w:val="24"/>
+              </w:rPr>
+              <w:t>Основной файл для сдачи лабораторной работы.</w:t>
             </w:r>
           </w:p>
         </w:tc>
@@ -1442,12 +1555,12 @@
           <w:b/>
           <w:sz w:val="28"/>
         </w:rPr>
-        <w:t>5. Архитектура и логика работы</w:t>
+        <w:t>5. Алгоритм работы приложения</w:t>
       </w:r>
     </w:p>
     <w:p>
       <w:pPr>
-        <w:spacing w:after="80"/>
+        <w:spacing w:after="100"/>
         <w:ind w:firstLine="425"/>
       </w:pPr>
       <w:r>
@@ -1456,12 +1569,12 @@
           <w:b w:val="0"/>
           <w:sz w:val="24"/>
         </w:rPr>
-        <w:t>Архитектура приложения состоит из трех уровней: файловое хранение, серверная логика и пользовательский/клиентский уровень. Файловое хранение представлено data.json. Серверная логика находится в app.py и отвечает за обработку запросов. Пользовательский уровень представлен HTML-страницей и отдельным скриптом client_demo.py.</w:t>
+        <w:t>При запуске приложения сначала определяется путь к файлу data.json. Далее создается Flask-приложение, настраивается Flask-Limiter и объявляется словарь data. После этого вызывается load_data(), которая загружает данные из файла.</w:t>
       </w:r>
     </w:p>
     <w:p>
       <w:pPr>
-        <w:spacing w:after="80"/>
+        <w:spacing w:after="100"/>
         <w:ind w:firstLine="425"/>
       </w:pPr>
       <w:r>
@@ -1470,13 +1583,13 @@
           <w:b w:val="0"/>
           <w:sz w:val="24"/>
         </w:rPr>
-        <w:t>Общий жизненный цикл данных выглядит так:</w:t>
+        <w:t>Если пользователь отправляет запрос POST /set, приложение получает тело запроса, проверяет ключ, проверяет наличие значения и записывает пару в словарь data. Сразу после этого вызывается save_data(), чтобы новое состояние появилось в data.json.</w:t>
       </w:r>
     </w:p>
     <w:p>
       <w:pPr>
-        <w:pStyle w:val="ListNumber"/>
-        <w:spacing w:after="60"/>
+        <w:spacing w:after="100"/>
+        <w:ind w:firstLine="425"/>
       </w:pPr>
       <w:r>
         <w:rPr>
@@ -1484,13 +1597,13 @@
           <w:b w:val="0"/>
           <w:sz w:val="24"/>
         </w:rPr>
-        <w:t>пользователь или клиент отправляет HTTP-запрос;</w:t>
+        <w:t>Если пользователь отправляет GET /get/&lt;key&gt;, приложение проверяет ключ и ищет его в словаре. Если ключ найден, возвращается значение. Если ключа нет, возвращается ошибка 404 в JSON-формате.</w:t>
       </w:r>
     </w:p>
     <w:p>
       <w:pPr>
-        <w:pStyle w:val="ListNumber"/>
-        <w:spacing w:after="60"/>
+        <w:spacing w:after="100"/>
+        <w:ind w:firstLine="425"/>
       </w:pPr>
       <w:r>
         <w:rPr>
@@ -1498,13 +1611,13 @@
           <w:b w:val="0"/>
           <w:sz w:val="24"/>
         </w:rPr>
-        <w:t>Flask выбирает подходящий маршрут;</w:t>
+        <w:t>Если пользователь отправляет DELETE /delete/&lt;key&gt;, приложение удаляет ключ из словаря, сохраняет новое состояние файла и возвращает удаленное значение в поле removed_value.</w:t>
       </w:r>
     </w:p>
     <w:p>
       <w:pPr>
-        <w:pStyle w:val="ListNumber"/>
-        <w:spacing w:after="60"/>
+        <w:spacing w:after="100"/>
+        <w:ind w:firstLine="425"/>
       </w:pPr>
       <w:r>
         <w:rPr>
@@ -1512,13 +1625,13 @@
           <w:b w:val="0"/>
           <w:sz w:val="24"/>
         </w:rPr>
-        <w:t>приложение проверяет ключ и значение;</w:t>
+        <w:t>Маршрут GET /exists/&lt;key&gt; не возвращает само значение, а сообщает только true или false. Такой маршрут полезен, когда клиенту важно узнать факт наличия записи без передачи содержимого.</w:t>
       </w:r>
     </w:p>
     <w:p>
       <w:pPr>
-        <w:pStyle w:val="ListNumber"/>
-        <w:spacing w:after="60"/>
+        <w:spacing w:after="100"/>
+        <w:ind w:firstLine="425"/>
       </w:pPr>
       <w:r>
         <w:rPr>
@@ -1526,7 +1639,7 @@
           <w:b w:val="0"/>
           <w:sz w:val="24"/>
         </w:rPr>
-        <w:t>если операция изменяющая, словарь data обновляется;</w:t>
+        <w:t>Для всех операций с data и data.json используется блокировка data_lock. Это защищает общий словарь и файл от одновременного изменения несколькими запросами.</w:t>
       </w:r>
     </w:p>
     <w:p>
@@ -1540,7 +1653,7 @@
           <w:b w:val="0"/>
           <w:sz w:val="24"/>
         </w:rPr>
-        <w:t>после изменения вызывается save_data(), и новое состояние попадает в data.json;</w:t>
+        <w:t>запуск приложения;</w:t>
       </w:r>
     </w:p>
     <w:p>
@@ -1554,13 +1667,13 @@
           <w:b w:val="0"/>
           <w:sz w:val="24"/>
         </w:rPr>
-        <w:t>сервер возвращает JSON-ответ с признаком ok, сообщением и полезными данными.</w:t>
+        <w:t>чтение data.json;</w:t>
       </w:r>
     </w:p>
     <w:p>
       <w:pPr>
-        <w:spacing w:after="80"/>
-        <w:ind w:firstLine="425"/>
+        <w:pStyle w:val="ListNumber"/>
+        <w:spacing w:after="60"/>
       </w:pPr>
       <w:r>
         <w:rPr>
@@ -1568,7 +1681,77 @@
           <w:b w:val="0"/>
           <w:sz w:val="24"/>
         </w:rPr>
-        <w:t>Для защиты от одновременной записи используется RLock. В обычной демонстрации это почти незаметно, но с точки зрения надежности важно: если два запроса почти одновременно изменят словарь, блокировка не даст им одновременно записывать файл.</w:t>
+        <w:t>формирование словаря data;</w:t>
+      </w:r>
+    </w:p>
+    <w:p>
+      <w:pPr>
+        <w:pStyle w:val="ListNumber"/>
+        <w:spacing w:after="60"/>
+      </w:pPr>
+      <w:r>
+        <w:rPr>
+          <w:rFonts w:ascii="Times New Roman" w:hAnsi="Times New Roman"/>
+          <w:b w:val="0"/>
+          <w:sz w:val="24"/>
+        </w:rPr>
+        <w:t>ожидание HTTP-запроса;</w:t>
+      </w:r>
+    </w:p>
+    <w:p>
+      <w:pPr>
+        <w:pStyle w:val="ListNumber"/>
+        <w:spacing w:after="60"/>
+      </w:pPr>
+      <w:r>
+        <w:rPr>
+          <w:rFonts w:ascii="Times New Roman" w:hAnsi="Times New Roman"/>
+          <w:b w:val="0"/>
+          <w:sz w:val="24"/>
+        </w:rPr>
+        <w:t>проверка входных данных;</w:t>
+      </w:r>
+    </w:p>
+    <w:p>
+      <w:pPr>
+        <w:pStyle w:val="ListNumber"/>
+        <w:spacing w:after="60"/>
+      </w:pPr>
+      <w:r>
+        <w:rPr>
+          <w:rFonts w:ascii="Times New Roman" w:hAnsi="Times New Roman"/>
+          <w:b w:val="0"/>
+          <w:sz w:val="24"/>
+        </w:rPr>
+        <w:t>выполнение операции с ключом;</w:t>
+      </w:r>
+    </w:p>
+    <w:p>
+      <w:pPr>
+        <w:pStyle w:val="ListNumber"/>
+        <w:spacing w:after="60"/>
+      </w:pPr>
+      <w:r>
+        <w:rPr>
+          <w:rFonts w:ascii="Times New Roman" w:hAnsi="Times New Roman"/>
+          <w:b w:val="0"/>
+          <w:sz w:val="24"/>
+        </w:rPr>
+        <w:t>сохранение файла при изменении;</w:t>
+      </w:r>
+    </w:p>
+    <w:p>
+      <w:pPr>
+        <w:pStyle w:val="ListNumber"/>
+        <w:spacing w:after="60"/>
+      </w:pPr>
+      <w:r>
+        <w:rPr>
+          <w:rFonts w:ascii="Times New Roman" w:hAnsi="Times New Roman"/>
+          <w:b w:val="0"/>
+          <w:sz w:val="24"/>
+        </w:rPr>
+        <w:t>возврат JSON-ответа клиенту.</w:t>
       </w:r>
     </w:p>
     <w:p>
@@ -1581,12 +1764,12 @@
           <w:b/>
           <w:sz w:val="28"/>
         </w:rPr>
-        <w:t>6. Реализация кода</w:t>
+        <w:t>6. Реализация основных частей кода</w:t>
       </w:r>
     </w:p>
     <w:p>
       <w:pPr>
-        <w:spacing w:after="80"/>
+        <w:spacing w:after="100"/>
         <w:ind w:firstLine="425"/>
       </w:pPr>
       <w:r>
@@ -1595,14 +1778,14 @@
           <w:b w:val="0"/>
           <w:sz w:val="24"/>
         </w:rPr>
-        <w:t>В начале файла расположен блок импортов с пояснением назначения библиотек. Это сделано специально, чтобы преподаватель при проверке видел, какая зависимость за что отвечает и где используется.</w:t>
+        <w:t>В начале app.py расположен блок импортов с пояснением. Это сделано для удобства проверки: сразу видно, какие библиотеки подключены и почему они нужны.</w:t>
       </w:r>
     </w:p>
     <w:p>
       <w:pPr>
+        <w:spacing w:after="140"/>
+        <w:ind w:left="142" w:right="142"/>
         <w:shd w:fill="F2F5F9"/>
-        <w:spacing w:after="160"/>
-        <w:ind w:left="142" w:right="142"/>
       </w:pPr>
       <w:r>
         <w:rPr>
@@ -1653,7 +1836,7 @@
     </w:p>
     <w:p>
       <w:pPr>
-        <w:spacing w:after="80"/>
+        <w:spacing w:after="100"/>
         <w:ind w:firstLine="425"/>
       </w:pPr>
       <w:r>
@@ -1662,14 +1845,14 @@
           <w:b w:val="0"/>
           <w:sz w:val="24"/>
         </w:rPr>
-        <w:t>Настройка приложения включает путь к data.json, создание Flask-приложения и настройку Limiter. Общий лимит задается в default_limits, а отдельные лимиты задаются непосредственно на маршрутах /set и /delete.</w:t>
+        <w:t>Следующий фрагмент показывает настройку файла хранения, Flask-приложения и Limiter. Общий лимит задается в default_limits, а отдельные лимиты задаются декораторами на маршрутах.</w:t>
       </w:r>
     </w:p>
     <w:p>
       <w:pPr>
+        <w:spacing w:after="140"/>
+        <w:ind w:left="142" w:right="142"/>
         <w:shd w:fill="F2F5F9"/>
-        <w:spacing w:after="160"/>
-        <w:ind w:left="142" w:right="142"/>
       </w:pPr>
       <w:r>
         <w:rPr>
@@ -1713,7 +1896,7 @@
     </w:p>
     <w:p>
       <w:pPr>
-        <w:spacing w:after="80"/>
+        <w:spacing w:after="100"/>
         <w:ind w:firstLine="425"/>
       </w:pPr>
       <w:r>
@@ -1722,14 +1905,14 @@
           <w:b w:val="0"/>
           <w:sz w:val="24"/>
         </w:rPr>
-        <w:t>Функции save_data() и load_data() отвечают за связь словаря data и файла data.json. Сохранение идет через временный файл: сначала данные записываются в .tmp, затем временный файл заменяет основной. Такой способ уменьшает риск повреждения data.json, если запись прервется.</w:t>
+        <w:t>Функции save_data() и load_data() отвечают за постоянное хранение. Обратите внимание, что save_data() записывает данные через временный файл. Это аккуратнее, чем напрямую перезаписывать data.json.</w:t>
       </w:r>
     </w:p>
     <w:p>
       <w:pPr>
+        <w:spacing w:after="140"/>
+        <w:ind w:left="142" w:right="142"/>
         <w:shd w:fill="F2F5F9"/>
-        <w:spacing w:after="160"/>
-        <w:ind w:left="142" w:right="142"/>
       </w:pPr>
       <w:r>
         <w:rPr>
@@ -1796,7 +1979,7 @@
     </w:p>
     <w:p>
       <w:pPr>
-        <w:spacing w:after="80"/>
+        <w:spacing w:after="100"/>
         <w:ind w:firstLine="425"/>
       </w:pPr>
       <w:r>
@@ -1805,14 +1988,14 @@
           <w:b w:val="0"/>
           <w:sz w:val="24"/>
         </w:rPr>
-        <w:t>Проверка входных данных сделана отдельным блоком. request_payload() позволяет принимать и JSON-запросы, и HTML-формы. normalize_key() приводит ключ к аккуратному виду и запрещает пустые ключи. validate_value() проверяет, что значение можно сохранить в JSON.</w:t>
+        <w:t>Блок проверки входных данных нужен для того, чтобы API не сохраняло пустые ключи и неподходящие значения. request_payload() поддерживает и JSON, и HTML-форму, поэтому один и тот же серверный код работает и для браузерного интерфейса, и для программных клиентов.</w:t>
       </w:r>
     </w:p>
     <w:p>
       <w:pPr>
+        <w:spacing w:after="140"/>
+        <w:ind w:left="142" w:right="142"/>
         <w:shd w:fill="F2F5F9"/>
-        <w:spacing w:after="160"/>
-        <w:ind w:left="142" w:right="142"/>
       </w:pPr>
       <w:r>
         <w:rPr>
@@ -1890,7 +2073,7 @@
     </w:p>
     <w:p>
       <w:pPr>
-        <w:spacing w:after="80"/>
+        <w:spacing w:after="100"/>
         <w:ind w:firstLine="425"/>
       </w:pPr>
       <w:r>
@@ -1899,14 +2082,14 @@
           <w:b w:val="0"/>
           <w:sz w:val="24"/>
         </w:rPr>
-        <w:t>Маршрут POST /set сохраняет пару ключ-значение. Если пользователь отправляет корректные данные, ключ записывается в словарь data, затем вызывается save_data(). Ответ содержит код 201, сохраненный ключ, значение и текущее количество элементов.</w:t>
+        <w:t>Маршрут POST /set является основным маршрутом изменения данных. Он сохраняет значение, обновляет файл и возвращает статус 201. На маршруте стоит отдельный лимит 10 запросов в минуту.</w:t>
       </w:r>
     </w:p>
     <w:p>
       <w:pPr>
+        <w:spacing w:after="140"/>
+        <w:ind w:left="142" w:right="142"/>
         <w:shd w:fill="F2F5F9"/>
-        <w:spacing w:after="160"/>
-        <w:ind w:left="142" w:right="142"/>
       </w:pPr>
       <w:r>
         <w:rPr>
@@ -1961,7 +2144,7 @@
     </w:p>
     <w:p>
       <w:pPr>
-        <w:spacing w:after="80"/>
+        <w:spacing w:after="100"/>
         <w:ind w:firstLine="425"/>
       </w:pPr>
       <w:r>
@@ -1970,14 +2153,14 @@
           <w:b w:val="0"/>
           <w:sz w:val="24"/>
         </w:rPr>
-        <w:t>Маршрут GET /get/&lt;key&gt; возвращает значение по ключу. Если ключ отсутствует, сервер не падает, а возвращает JSON-ошибку со статусом 404. Это важно для корректной работы API-клиентов.</w:t>
+        <w:t>Маршруты получения, удаления и проверки существования ключа реализуют остальные требования лабораторной работы. Они используют общий подход: нормализация ключа, работа со словарем data и возврат JSON.</w:t>
       </w:r>
     </w:p>
     <w:p>
       <w:pPr>
+        <w:spacing w:after="140"/>
+        <w:ind w:left="142" w:right="142"/>
         <w:shd w:fill="F2F5F9"/>
-        <w:spacing w:after="160"/>
-        <w:ind w:left="142" w:right="142"/>
       </w:pPr>
       <w:r>
         <w:rPr>
@@ -2017,34 +2200,16 @@
         <w:t xml:space="preserve">        "value": value,</w:t>
         <w:br/>
         <w:t xml:space="preserve">    })</w:t>
-      </w:r>
-    </w:p>
-    <w:p>
-      <w:pPr>
-        <w:spacing w:after="80"/>
-        <w:ind w:firstLine="425"/>
-      </w:pPr>
-      <w:r>
-        <w:rPr>
-          <w:rFonts w:ascii="Times New Roman" w:hAnsi="Times New Roman"/>
-          <w:b w:val="0"/>
-          <w:sz w:val="24"/>
-        </w:rPr>
-        <w:t>Маршрут DELETE /delete/&lt;key&gt; удаляет запись из словаря и также сохраняет файл. В ответе возвращается удаленное значение, чтобы было видно, что именно удалено.</w:t>
-      </w:r>
-    </w:p>
-    <w:p>
-      <w:pPr>
-        <w:shd w:fill="F2F5F9"/>
-        <w:spacing w:after="160"/>
-        <w:ind w:left="142" w:right="142"/>
-      </w:pPr>
-      <w:r>
-        <w:rPr>
-          <w:rFonts w:ascii="Courier New" w:hAnsi="Courier New"/>
-          <w:b w:val="0"/>
-          <w:sz w:val="17"/>
-        </w:rPr>
+        <w:br/>
+        <w:br/>
+        <w:br/>
+        <w:t># ==============================</w:t>
+        <w:br/>
+        <w:t># Раздел II — API: DELETE /delete/&lt;key&gt; — удалить ключ</w:t>
+        <w:br/>
+        <w:t># ==============================</w:t>
+        <w:br/>
+        <w:br/>
         <w:t>@app.delete("/delete/")</w:t>
         <w:br/>
         <w:t>def delete_value_without_key():</w:t>
@@ -2085,34 +2250,16 @@
         <w:t xml:space="preserve">        "count": len(data),</w:t>
         <w:br/>
         <w:t xml:space="preserve">    })</w:t>
-      </w:r>
-    </w:p>
-    <w:p>
-      <w:pPr>
-        <w:spacing w:after="80"/>
-        <w:ind w:firstLine="425"/>
-      </w:pPr>
-      <w:r>
-        <w:rPr>
-          <w:rFonts w:ascii="Times New Roman" w:hAnsi="Times New Roman"/>
-          <w:b w:val="0"/>
-          <w:sz w:val="24"/>
-        </w:rPr>
-        <w:t>Маршрут GET /exists/&lt;key&gt; не возвращает само значение, а только сообщает, есть ли ключ в хранилище. Это удобно, когда клиенту нужно проверить наличие записи без передачи данных.</w:t>
-      </w:r>
-    </w:p>
-    <w:p>
-      <w:pPr>
-        <w:shd w:fill="F2F5F9"/>
-        <w:spacing w:after="160"/>
-        <w:ind w:left="142" w:right="142"/>
-      </w:pPr>
-      <w:r>
-        <w:rPr>
-          <w:rFonts w:ascii="Courier New" w:hAnsi="Courier New"/>
-          <w:b w:val="0"/>
-          <w:sz w:val="17"/>
-        </w:rPr>
+        <w:br/>
+        <w:br/>
+        <w:br/>
+        <w:t># ==============================</w:t>
+        <w:br/>
+        <w:t># Раздел II — API: GET /exists/&lt;key&gt; — проверить наличие ключа</w:t>
+        <w:br/>
+        <w:t># ==============================</w:t>
+        <w:br/>
+        <w:br/>
         <w:t>@app.get("/exists/")</w:t>
         <w:br/>
         <w:t>def exists_without_key():</w:t>
@@ -2145,7 +2292,7 @@
     </w:p>
     <w:p>
       <w:pPr>
-        <w:spacing w:after="80"/>
+        <w:spacing w:after="100"/>
         <w:ind w:firstLine="425"/>
       </w:pPr>
       <w:r>
@@ -2154,157 +2301,14 @@
           <w:b w:val="0"/>
           <w:sz w:val="24"/>
         </w:rPr>
-        <w:t>HTML-страница использует fetch-запросы к тем же API-маршрутам. Поэтому интерфейс в браузере не является отдельной логикой: он демонстрирует работу настоящего API.</w:t>
+        <w:t>Демонстрационный клиент client_demo.py последовательно отправляет запросы к API. Он нужен для проверки через requests, как было указано в разделе подготовки лабораторной работы.</w:t>
       </w:r>
     </w:p>
     <w:p>
       <w:pPr>
+        <w:spacing w:after="140"/>
+        <w:ind w:left="142" w:right="142"/>
         <w:shd w:fill="F2F5F9"/>
-        <w:spacing w:after="160"/>
-        <w:ind w:left="142" w:right="142"/>
-      </w:pPr>
-      <w:r>
-        <w:rPr>
-          <w:rFonts w:ascii="Courier New" w:hAnsi="Courier New"/>
-          <w:b w:val="0"/>
-          <w:sz w:val="17"/>
-        </w:rPr>
-        <w:t>&lt;script&gt;</w:t>
-        <w:br/>
-        <w:t xml:space="preserve">        const result = document.querySelector("#result");</w:t>
-        <w:br/>
-        <w:t xml:space="preserve">        const itemsBody = document.querySelector("#items-body");</w:t>
-        <w:br/>
-        <w:t xml:space="preserve">        const count = document.querySelector("#count");</w:t>
-        <w:br/>
-        <w:br/>
-        <w:t xml:space="preserve">        function showResponse(payload, status) {</w:t>
-        <w:br/>
-        <w:t xml:space="preserve">            result.textContent = JSON.stringify({ status, body: payload }, null, 4);</w:t>
-        <w:br/>
-        <w:t xml:space="preserve">            result.dataset.ok = String(status &gt;= 200 &amp;&amp; status &lt; 300);</w:t>
-        <w:br/>
-        <w:t xml:space="preserve">        }</w:t>
-        <w:br/>
-        <w:br/>
-        <w:t xml:space="preserve">        async function readJson(response) {</w:t>
-        <w:br/>
-        <w:t xml:space="preserve">            const payload = await response.json();</w:t>
-        <w:br/>
-        <w:t xml:space="preserve">            showResponse(payload, response.status);</w:t>
-        <w:br/>
-        <w:t xml:space="preserve">            await refreshTable();</w:t>
-        <w:br/>
-        <w:t xml:space="preserve">        }</w:t>
-        <w:br/>
-        <w:br/>
-        <w:t xml:space="preserve">        async function refreshTable() {</w:t>
-        <w:br/>
-        <w:t xml:space="preserve">            const response = await fetch("/all");</w:t>
-        <w:br/>
-        <w:t xml:space="preserve">            const payload = await response.json();</w:t>
-        <w:br/>
-        <w:t xml:space="preserve">            itemsBody.innerHTML = "";</w:t>
-        <w:br/>
-        <w:br/>
-        <w:t xml:space="preserve">            Object.entries(payload.data).forEach(([key, value]) =&gt; {</w:t>
-        <w:br/>
-        <w:t xml:space="preserve">                const row = document.createElement("tr");</w:t>
-        <w:br/>
-        <w:t xml:space="preserve">                const keyCell = document.createElement("td");</w:t>
-        <w:br/>
-        <w:t xml:space="preserve">                const valueCell = document.createElement("td");</w:t>
-        <w:br/>
-        <w:t xml:space="preserve">                keyCell.textContent = key;</w:t>
-        <w:br/>
-        <w:t xml:space="preserve">                valueCell.textContent = typeof value === "string" ? value : JSON.stringify(value);</w:t>
-        <w:br/>
-        <w:t xml:space="preserve">                row.append(keyCell, valueCell);</w:t>
-        <w:br/>
-        <w:t xml:space="preserve">                itemsBody.append(row);</w:t>
-        <w:br/>
-        <w:t xml:space="preserve">            });</w:t>
-        <w:br/>
-        <w:br/>
-        <w:t xml:space="preserve">            count.textContent = `${payload.count} ключа`;</w:t>
-        <w:br/>
-        <w:t xml:space="preserve">        }</w:t>
-        <w:br/>
-        <w:br/>
-        <w:t xml:space="preserve">        document.querySelector("#set-form").addEventListener("submit", async (event) =&gt; {</w:t>
-        <w:br/>
-        <w:t xml:space="preserve">            event.preventDefault();</w:t>
-        <w:br/>
-        <w:t xml:space="preserve">            const form = new FormData(event.currentTarget);</w:t>
-        <w:br/>
-        <w:t xml:space="preserve">            const response = await fetch("/set", {</w:t>
-        <w:br/>
-        <w:t xml:space="preserve">                method: "POST",</w:t>
-        <w:br/>
-        <w:t xml:space="preserve">                headers: { "Content-Type": "application/json" },</w:t>
-        <w:br/>
-        <w:t xml:space="preserve">                body: JSON.stringify({</w:t>
-        <w:br/>
-        <w:t xml:space="preserve">                    key: form.get("key"),</w:t>
-        <w:br/>
-        <w:t xml:space="preserve">                    value: form.get("value")</w:t>
-        <w:br/>
-        <w:t xml:space="preserve">                })</w:t>
-        <w:br/>
-        <w:t xml:space="preserve">            });</w:t>
-        <w:br/>
-        <w:t xml:space="preserve">            await readJson(response);</w:t>
-        <w:br/>
-        <w:t xml:space="preserve">        });</w:t>
-        <w:br/>
-        <w:br/>
-        <w:t xml:space="preserve">        document.querySelector("#key-form").addEventListener("click", async (event) =&gt; {</w:t>
-        <w:br/>
-        <w:t xml:space="preserve">            const action = event.target.dataset.action;</w:t>
-        <w:br/>
-        <w:t xml:space="preserve">            if (!action) {</w:t>
-        <w:br/>
-        <w:t xml:space="preserve">                return;</w:t>
-        <w:br/>
-        <w:t xml:space="preserve">            }</w:t>
-        <w:br/>
-        <w:br/>
-        <w:t xml:space="preserve">            const form = new FormData(event.currentTarget);</w:t>
-        <w:br/>
-        <w:t xml:space="preserve">            const key = encodeURIComponent(form.get("key"));</w:t>
-        <w:br/>
-        <w:t xml:space="preserve">            const route = action === "delete" ? `/delete/${key}` : `/${action}/${key}`;</w:t>
-        <w:br/>
-        <w:t xml:space="preserve">            const method = action === "delete" ? "DELETE" : "GET";</w:t>
-        <w:br/>
-        <w:t xml:space="preserve">            const response = await fetch(route, { method });</w:t>
-        <w:br/>
-        <w:t xml:space="preserve">            await readJson(response);</w:t>
-        <w:br/>
-        <w:t xml:space="preserve">        });</w:t>
-        <w:br/>
-        <w:t>&lt;/script&gt;</w:t>
-      </w:r>
-    </w:p>
-    <w:p>
-      <w:pPr>
-        <w:spacing w:after="80"/>
-        <w:ind w:firstLine="425"/>
-      </w:pPr>
-      <w:r>
-        <w:rPr>
-          <w:rFonts w:ascii="Times New Roman" w:hAnsi="Times New Roman"/>
-          <w:b w:val="0"/>
-          <w:sz w:val="24"/>
-        </w:rPr>
-        <w:t>Демонстрационный клиент client_demo.py использует requests. Он полезен для проверки, что приложение работает как API, а не только как страница в браузере.</w:t>
-      </w:r>
-    </w:p>
-    <w:p>
-      <w:pPr>
-        <w:shd w:fill="F2F5F9"/>
-        <w:spacing w:after="160"/>
-        <w:ind w:left="142" w:right="142"/>
       </w:pPr>
       <w:r>
         <w:rPr>
@@ -2406,7 +2410,7 @@
           <w:b/>
           <w:sz w:val="28"/>
         </w:rPr>
-        <w:t>7. API и примеры запросов</w:t>
+        <w:t>7. API приложения и примеры</w:t>
       </w:r>
     </w:p>
     <w:tbl>
@@ -2463,7 +2467,7 @@
                 <w:b/>
                 <w:sz w:val="24"/>
               </w:rPr>
-              <w:t>Назначение</w:t>
+              <w:t>Входные данные</w:t>
             </w:r>
           </w:p>
         </w:tc>
@@ -2478,7 +2482,7 @@
                 <w:b/>
                 <w:sz w:val="24"/>
               </w:rPr>
-              <w:t>Успешный статус</w:t>
+              <w:t>Результат</w:t>
             </w:r>
           </w:p>
         </w:tc>
@@ -2525,7 +2529,7 @@
                 <w:b w:val="0"/>
                 <w:sz w:val="24"/>
               </w:rPr>
-              <w:t>Сохранить ключ и значение</w:t>
+              <w:t>JSON или form-data: key, value</w:t>
             </w:r>
           </w:p>
         </w:tc>
@@ -2540,7 +2544,7 @@
                 <w:b w:val="0"/>
                 <w:sz w:val="24"/>
               </w:rPr>
-              <w:t>201 Created</w:t>
+              <w:t>Сохраняет значение и возвращает 201.</w:t>
             </w:r>
           </w:p>
         </w:tc>
@@ -2587,7 +2591,7 @@
                 <w:b w:val="0"/>
                 <w:sz w:val="24"/>
               </w:rPr>
-              <w:t>Получить значение по ключу</w:t>
+              <w:t>Ключ в адресе</w:t>
             </w:r>
           </w:p>
         </w:tc>
@@ -2602,7 +2606,7 @@
                 <w:b w:val="0"/>
                 <w:sz w:val="24"/>
               </w:rPr>
-              <w:t>200 OK</w:t>
+              <w:t>Возвращает значение или 404.</w:t>
             </w:r>
           </w:p>
         </w:tc>
@@ -2649,7 +2653,7 @@
                 <w:b w:val="0"/>
                 <w:sz w:val="24"/>
               </w:rPr>
-              <w:t>Удалить ключ</w:t>
+              <w:t>Ключ в адресе</w:t>
             </w:r>
           </w:p>
         </w:tc>
@@ -2664,7 +2668,7 @@
                 <w:b w:val="0"/>
                 <w:sz w:val="24"/>
               </w:rPr>
-              <w:t>200 OK</w:t>
+              <w:t>Удаляет значение и возвращает removed_value.</w:t>
             </w:r>
           </w:p>
         </w:tc>
@@ -2711,7 +2715,7 @@
                 <w:b w:val="0"/>
                 <w:sz w:val="24"/>
               </w:rPr>
-              <w:t>Проверить наличие ключа</w:t>
+              <w:t>Ключ в адресе</w:t>
             </w:r>
           </w:p>
         </w:tc>
@@ -2726,7 +2730,7 @@
                 <w:b w:val="0"/>
                 <w:sz w:val="24"/>
               </w:rPr>
-              <w:t>200 OK</w:t>
+              <w:t>Возвращает exists: true/false.</w:t>
             </w:r>
           </w:p>
         </w:tc>
@@ -2773,7 +2777,7 @@
                 <w:b w:val="0"/>
                 <w:sz w:val="24"/>
               </w:rPr>
-              <w:t>Получить все данные для демонстрационной страницы</w:t>
+              <w:t>Без параметров</w:t>
             </w:r>
           </w:p>
         </w:tc>
@@ -2788,7 +2792,7 @@
                 <w:b w:val="0"/>
                 <w:sz w:val="24"/>
               </w:rPr>
-              <w:t>200 OK</w:t>
+              <w:t>Возвращает все данные для обновления таблицы.</w:t>
             </w:r>
           </w:p>
         </w:tc>
@@ -2797,7 +2801,7 @@
     <w:p/>
     <w:p>
       <w:pPr>
-        <w:spacing w:after="80"/>
+        <w:spacing w:after="100"/>
         <w:ind w:firstLine="425"/>
       </w:pPr>
       <w:r>
@@ -2806,14 +2810,14 @@
           <w:b w:val="0"/>
           <w:sz w:val="24"/>
         </w:rPr>
-        <w:t>Пример сохранения значения:</w:t>
+        <w:t>Пример запроса на сохранение значения:</w:t>
       </w:r>
     </w:p>
     <w:p>
       <w:pPr>
+        <w:spacing w:after="140"/>
+        <w:ind w:left="142" w:right="142"/>
         <w:shd w:fill="F2F5F9"/>
-        <w:spacing w:after="160"/>
-        <w:ind w:left="142" w:right="142"/>
       </w:pPr>
       <w:r>
         <w:rPr>
@@ -2826,7 +2830,7 @@
     </w:p>
     <w:p>
       <w:pPr>
-        <w:spacing w:after="80"/>
+        <w:spacing w:after="100"/>
         <w:ind w:firstLine="425"/>
       </w:pPr>
       <w:r>
@@ -2835,14 +2839,14 @@
           <w:b w:val="0"/>
           <w:sz w:val="24"/>
         </w:rPr>
-        <w:t>Ожидаемый ответ:</w:t>
+        <w:t>Пример успешного ответа сервера:</w:t>
       </w:r>
     </w:p>
     <w:p>
       <w:pPr>
+        <w:spacing w:after="140"/>
+        <w:ind w:left="142" w:right="142"/>
         <w:shd w:fill="F2F5F9"/>
-        <w:spacing w:after="160"/>
-        <w:ind w:left="142" w:right="142"/>
       </w:pPr>
       <w:r>
         <w:rPr>
@@ -2858,14 +2862,16 @@
         <w:br/>
         <w:t xml:space="preserve">    "key": "student",</w:t>
         <w:br/>
-        <w:t xml:space="preserve">    "value": "ФБИ"</w:t>
+        <w:t xml:space="preserve">    "value": "ФБИ",</w:t>
+        <w:br/>
+        <w:t xml:space="preserve">    "count": 4</w:t>
         <w:br/>
         <w:t>}</w:t>
       </w:r>
     </w:p>
     <w:p>
       <w:pPr>
-        <w:spacing w:after="80"/>
+        <w:spacing w:after="100"/>
         <w:ind w:firstLine="425"/>
       </w:pPr>
       <w:r>
@@ -2879,9 +2885,9 @@
     </w:p>
     <w:p>
       <w:pPr>
+        <w:spacing w:after="140"/>
+        <w:ind w:left="142" w:right="142"/>
         <w:shd w:fill="F2F5F9"/>
-        <w:spacing w:after="160"/>
-        <w:ind w:left="142" w:right="142"/>
       </w:pPr>
       <w:r>
         <w:rPr>
@@ -2894,7 +2900,7 @@
     </w:p>
     <w:p>
       <w:pPr>
-        <w:spacing w:after="80"/>
+        <w:spacing w:after="100"/>
         <w:ind w:firstLine="425"/>
       </w:pPr>
       <w:r>
@@ -2903,14 +2909,14 @@
           <w:b w:val="0"/>
           <w:sz w:val="24"/>
         </w:rPr>
-        <w:t>Пример проверки существования:</w:t>
+        <w:t>Пример проверки наличия ключа:</w:t>
       </w:r>
     </w:p>
     <w:p>
       <w:pPr>
+        <w:spacing w:after="140"/>
+        <w:ind w:left="142" w:right="142"/>
         <w:shd w:fill="F2F5F9"/>
-        <w:spacing w:after="160"/>
-        <w:ind w:left="142" w:right="142"/>
       </w:pPr>
       <w:r>
         <w:rPr>
@@ -2923,7 +2929,7 @@
     </w:p>
     <w:p>
       <w:pPr>
-        <w:spacing w:after="80"/>
+        <w:spacing w:after="100"/>
         <w:ind w:firstLine="425"/>
       </w:pPr>
       <w:r>
@@ -2932,14 +2938,14 @@
           <w:b w:val="0"/>
           <w:sz w:val="24"/>
         </w:rPr>
-        <w:t>Пример удаления:</w:t>
+        <w:t>Пример удаления ключа:</w:t>
       </w:r>
     </w:p>
     <w:p>
       <w:pPr>
+        <w:spacing w:after="140"/>
+        <w:ind w:left="142" w:right="142"/>
         <w:shd w:fill="F2F5F9"/>
-        <w:spacing w:after="160"/>
-        <w:ind w:left="142" w:right="142"/>
       </w:pPr>
       <w:r>
         <w:rPr>
@@ -2960,12 +2966,12 @@
           <w:b/>
           <w:sz w:val="28"/>
         </w:rPr>
-        <w:t>8. Обработка ошибок</w:t>
+        <w:t>8. Ошибки и ограничения запросов</w:t>
       </w:r>
     </w:p>
     <w:p>
       <w:pPr>
-        <w:spacing w:after="80"/>
+        <w:spacing w:after="100"/>
         <w:ind w:firstLine="425"/>
       </w:pPr>
       <w:r>
@@ -2974,7 +2980,21 @@
           <w:b w:val="0"/>
           <w:sz w:val="24"/>
         </w:rPr>
-        <w:t>Ошибки API возвращаются в едином формате: ok=false и message с объяснением. Благодаря этому преподаватель или любой пользователь может быстро понять, что именно пошло не так. Например, если ключ не передан, сервер возвращает статус 400. Если ключ не найден, возвращается статус 404. Если лимит запросов превышен, возвращается статус 429.</w:t>
+        <w:t>В приложении предусмотрены понятные ошибки. Если пользователь не передает ключ, сервер возвращает статус 400. Если ключ не найден, возвращается статус 404. Если клиент превышает лимит запросов, Flask-Limiter возвращает статус 429.</w:t>
+      </w:r>
+    </w:p>
+    <w:p>
+      <w:pPr>
+        <w:spacing w:after="100"/>
+        <w:ind w:firstLine="425"/>
+      </w:pPr>
+      <w:r>
+        <w:rPr>
+          <w:rFonts w:ascii="Times New Roman" w:hAnsi="Times New Roman"/>
+          <w:b w:val="0"/>
+          <w:sz w:val="24"/>
+        </w:rPr>
+        <w:t>Единый JSON-формат ошибок важен для проверки. Преподаватель может открыть Postman или выполнить curl-запрос и сразу увидеть поле ok=false и текстовое сообщение message.</w:t>
       </w:r>
     </w:p>
     <w:tbl>
@@ -3000,7 +3020,7 @@
                 <w:b/>
                 <w:sz w:val="24"/>
               </w:rPr>
-              <w:t>Ситуация</w:t>
+              <w:t>Сценарий</w:t>
             </w:r>
           </w:p>
         </w:tc>
@@ -3015,7 +3035,7 @@
                 <w:b/>
                 <w:sz w:val="24"/>
               </w:rPr>
-              <w:t>Статус</w:t>
+              <w:t>HTTP-статус</w:t>
             </w:r>
           </w:p>
         </w:tc>
@@ -3030,7 +3050,7 @@
                 <w:b/>
                 <w:sz w:val="24"/>
               </w:rPr>
-              <w:t>Пояснение</w:t>
+              <w:t>Что означает</w:t>
             </w:r>
           </w:p>
         </w:tc>
@@ -3047,7 +3067,7 @@
                 <w:b w:val="0"/>
                 <w:sz w:val="24"/>
               </w:rPr>
-              <w:t>Пустой ключ при /set</w:t>
+              <w:t>POST /set без ключа</w:t>
             </w:r>
           </w:p>
         </w:tc>
@@ -3077,7 +3097,7 @@
                 <w:b w:val="0"/>
                 <w:sz w:val="24"/>
               </w:rPr>
-              <w:t>Ключ обязателен, поэтому запись не создается.</w:t>
+              <w:t>Запрос некорректный, ключ обязателен.</w:t>
             </w:r>
           </w:p>
         </w:tc>
@@ -3094,7 +3114,7 @@
                 <w:b w:val="0"/>
                 <w:sz w:val="24"/>
               </w:rPr>
-              <w:t>Нет value при /set</w:t>
+              <w:t>POST /set без value</w:t>
             </w:r>
           </w:p>
         </w:tc>
@@ -3124,7 +3144,7 @@
                 <w:b w:val="0"/>
                 <w:sz w:val="24"/>
               </w:rPr>
-              <w:t>Значение обязательно для сохранения пары ключ-значение.</w:t>
+              <w:t>Нельзя сохранить пару без значения.</w:t>
             </w:r>
           </w:p>
         </w:tc>
@@ -3141,7 +3161,7 @@
                 <w:b w:val="0"/>
                 <w:sz w:val="24"/>
               </w:rPr>
-              <w:t>Ключ не найден при /get</w:t>
+              <w:t>GET /get/&lt;key&gt; для неизвестного ключа</w:t>
             </w:r>
           </w:p>
         </w:tc>
@@ -3171,7 +3191,7 @@
                 <w:b w:val="0"/>
                 <w:sz w:val="24"/>
               </w:rPr>
-              <w:t>Сервер сообщает, что такой записи нет.</w:t>
+              <w:t>Запрошенной записи нет в словаре data.</w:t>
             </w:r>
           </w:p>
         </w:tc>
@@ -3188,7 +3208,7 @@
                 <w:b w:val="0"/>
                 <w:sz w:val="24"/>
               </w:rPr>
-              <w:t>Ключ не найден при /delete</w:t>
+              <w:t>DELETE /delete/&lt;key&gt; для неизвестного ключа</w:t>
             </w:r>
           </w:p>
         </w:tc>
@@ -3218,7 +3238,7 @@
                 <w:b w:val="0"/>
                 <w:sz w:val="24"/>
               </w:rPr>
-              <w:t>Нельзя удалить запись, которой нет в хранилище.</w:t>
+              <w:t>Удалять нечего, ключ отсутствует.</w:t>
             </w:r>
           </w:p>
         </w:tc>
@@ -3235,7 +3255,7 @@
                 <w:b w:val="0"/>
                 <w:sz w:val="24"/>
               </w:rPr>
-              <w:t>Превышен лимит</w:t>
+              <w:t>Слишком много запросов к /set</w:t>
             </w:r>
           </w:p>
         </w:tc>
@@ -3265,7 +3285,7 @@
                 <w:b w:val="0"/>
                 <w:sz w:val="24"/>
               </w:rPr>
-              <w:t>Flask-Limiter блокирует слишком частые запросы.</w:t>
+              <w:t>Сработал лимит 10 запросов в минуту.</w:t>
             </w:r>
           </w:p>
         </w:tc>
@@ -3274,6 +3294,20 @@
     <w:p/>
     <w:p>
       <w:pPr>
+        <w:spacing w:after="100"/>
+        <w:ind w:firstLine="425"/>
+      </w:pPr>
+      <w:r>
+        <w:rPr>
+          <w:rFonts w:ascii="Times New Roman" w:hAnsi="Times New Roman"/>
+          <w:b w:val="0"/>
+          <w:sz w:val="24"/>
+        </w:rPr>
+        <w:t>Лимит 10 запросов в минуту установлен именно на изменяющие операции, потому что они меняют data.json. Если такие операции не ограничивать, пользователь может слишком быстро создать много записей или слишком часто перезаписывать файл.</w:t>
+      </w:r>
+    </w:p>
+    <w:p>
+      <w:pPr>
         <w:pStyle w:val="Heading1"/>
       </w:pPr>
       <w:r>
@@ -3282,7 +3316,7 @@
           <w:b/>
           <w:sz w:val="28"/>
         </w:rPr>
-        <w:t>9. Демонстрация работы приложения</w:t>
+        <w:t>9. Демонстрация работы со скриншотами</w:t>
       </w:r>
     </w:p>
     <w:p>
@@ -3293,7 +3327,7 @@
         <w:drawing>
           <wp:inline xmlns:a="http://schemas.openxmlformats.org/drawingml/2006/main" xmlns:pic="http://schemas.openxmlformats.org/drawingml/2006/picture">
             <wp:extent cx="5940000" cy="4700688"/>
-            <wp:docPr id="2" name="Picture 2"/>
+            <wp:docPr id="1" name="Picture 1"/>
             <wp:cNvGraphicFramePr>
               <a:graphicFrameLocks noChangeAspect="1"/>
             </wp:cNvGraphicFramePr>
@@ -3305,7 +3339,7 @@
                     <pic:cNvPicPr/>
                   </pic:nvPicPr>
                   <pic:blipFill>
-                    <a:blip r:embed="rId11"/>
+                    <a:blip r:embed="rId9"/>
                     <a:stretch>
                       <a:fillRect/>
                     </a:stretch>
@@ -3326,7 +3360,7 @@
     </w:p>
     <w:p>
       <w:pPr>
-        <w:spacing w:after="80"/>
+        <w:spacing w:after="100"/>
         <w:jc w:val="center"/>
       </w:pPr>
       <w:r>
@@ -3335,12 +3369,12 @@
           <w:b/>
           <w:sz w:val="24"/>
         </w:rPr>
-        <w:t>Рисунок 1 — Главная страница key-value хранилища</w:t>
+        <w:t>Рисунок 1 — Главная страница приложения</w:t>
       </w:r>
     </w:p>
     <w:p>
       <w:pPr>
-        <w:spacing w:after="80"/>
+        <w:spacing w:after="100"/>
         <w:ind w:firstLine="425"/>
       </w:pPr>
       <w:r>
@@ -3349,7 +3383,49 @@
           <w:b w:val="0"/>
           <w:sz w:val="24"/>
         </w:rPr>
-        <w:t>На главной странице расположены две формы: слева форма сохранения значения через POST /set, справа блок операций с ключом. Ниже находится область JSON-ответа сервера и таблица текущих данных. В шапке явно указаны ограничения: общий лимит 100 запросов в сутки и отдельный лимит 10 запросов в минуту для /set и /delete.</w:t>
+        <w:t>На первом скриншоте показана главная страница key-value хранилища. В верхней части страницы указана тема приложения и лимиты запросов: 100 запросов в сутки и 10 запросов в минуту для операций /set и /delete.</w:t>
+      </w:r>
+    </w:p>
+    <w:p>
+      <w:pPr>
+        <w:spacing w:after="100"/>
+        <w:ind w:firstLine="425"/>
+      </w:pPr>
+      <w:r>
+        <w:rPr>
+          <w:rFonts w:ascii="Times New Roman" w:hAnsi="Times New Roman"/>
+          <w:b w:val="0"/>
+          <w:sz w:val="24"/>
+        </w:rPr>
+        <w:t>Слева находится форма сохранения значения. Она отправляет запрос POST /set и содержит два поля: ключ и значение. Справа находится форма операций с уже существующим ключом: получить, проверить или удалить.</w:t>
+      </w:r>
+    </w:p>
+    <w:p>
+      <w:pPr>
+        <w:spacing w:after="100"/>
+        <w:ind w:firstLine="425"/>
+      </w:pPr>
+      <w:r>
+        <w:rPr>
+          <w:rFonts w:ascii="Times New Roman" w:hAnsi="Times New Roman"/>
+          <w:b w:val="0"/>
+          <w:sz w:val="24"/>
+        </w:rPr>
+        <w:t>Ниже расположены два важных блока: область «Ответ сервера» и таблица «Текущие данные». Область ответа показывает JSON, который вернул сервер. Таблица показывает состояние словаря data, загруженного из data.json.</w:t>
+      </w:r>
+    </w:p>
+    <w:p>
+      <w:pPr>
+        <w:spacing w:after="100"/>
+        <w:ind w:firstLine="425"/>
+      </w:pPr>
+      <w:r>
+        <w:rPr>
+          <w:rFonts w:ascii="Times New Roman" w:hAnsi="Times New Roman"/>
+          <w:b w:val="0"/>
+          <w:sz w:val="24"/>
+        </w:rPr>
+        <w:t>Этот скриншот подтверждает, что лабораторная работа имеет не только API, но и удобный демонстрационный интерфейс. Преподаватель может проверить основные операции без ручного ввода curl-команд.</w:t>
       </w:r>
     </w:p>
     <w:p>
@@ -3360,7 +3436,7 @@
         <w:drawing>
           <wp:inline xmlns:a="http://schemas.openxmlformats.org/drawingml/2006/main" xmlns:pic="http://schemas.openxmlformats.org/drawingml/2006/picture">
             <wp:extent cx="5940000" cy="5244246"/>
-            <wp:docPr id="3" name="Picture 3"/>
+            <wp:docPr id="2" name="Picture 2"/>
             <wp:cNvGraphicFramePr>
               <a:graphicFrameLocks noChangeAspect="1"/>
             </wp:cNvGraphicFramePr>
@@ -3372,7 +3448,7 @@
                     <pic:cNvPicPr/>
                   </pic:nvPicPr>
                   <pic:blipFill>
-                    <a:blip r:embed="rId12"/>
+                    <a:blip r:embed="rId10"/>
                     <a:stretch>
                       <a:fillRect/>
                     </a:stretch>
@@ -3393,7 +3469,7 @@
     </w:p>
     <w:p>
       <w:pPr>
-        <w:spacing w:after="80"/>
+        <w:spacing w:after="100"/>
         <w:jc w:val="center"/>
       </w:pPr>
       <w:r>
@@ -3407,7 +3483,7 @@
     </w:p>
     <w:p>
       <w:pPr>
-        <w:spacing w:after="80"/>
+        <w:spacing w:after="100"/>
         <w:ind w:firstLine="425"/>
       </w:pPr>
       <w:r>
@@ -3416,7 +3492,63 @@
           <w:b w:val="0"/>
           <w:sz w:val="24"/>
         </w:rPr>
-        <w:t>Введен ключ student и значение «ФБИ-24, лабораторная работа 8». Сервер вернул статус 201, ok=true, сообщение об успешном сохранении, сам ключ и значение. В таблице текущих данных появилась новая строка student, что подтверждает изменение словаря data. Так как операция изменяющая, после нее также обновляется data.json.</w:t>
+        <w:t>На втором скриншоте показан сценарий добавления новой пары ключ-значение. В поле ключа введено student, а в поле значения указано «ФБИ-24, лабораторная работа 8».</w:t>
+      </w:r>
+    </w:p>
+    <w:p>
+      <w:pPr>
+        <w:spacing w:after="100"/>
+        <w:ind w:firstLine="425"/>
+      </w:pPr>
+      <w:r>
+        <w:rPr>
+          <w:rFonts w:ascii="Times New Roman" w:hAnsi="Times New Roman"/>
+          <w:b w:val="0"/>
+          <w:sz w:val="24"/>
+        </w:rPr>
+        <w:t>После нажатия кнопки «Сохранить» браузер отправил JSON-запрос на маршрут POST /set. Сервер обработал запрос, записал значение в словарь data, вызвал save_data() и вернул JSON-ответ со статусом 201.</w:t>
+      </w:r>
+    </w:p>
+    <w:p>
+      <w:pPr>
+        <w:spacing w:after="100"/>
+        <w:ind w:firstLine="425"/>
+      </w:pPr>
+      <w:r>
+        <w:rPr>
+          <w:rFonts w:ascii="Times New Roman" w:hAnsi="Times New Roman"/>
+          <w:b w:val="0"/>
+          <w:sz w:val="24"/>
+        </w:rPr>
+        <w:t>В ответе видно поле ok=true, сообщение «Значение сохранено», ключ student и сохраненное значение. Также отображается count, то есть текущее количество записей в хранилище.</w:t>
+      </w:r>
+    </w:p>
+    <w:p>
+      <w:pPr>
+        <w:spacing w:after="100"/>
+        <w:ind w:firstLine="425"/>
+      </w:pPr>
+      <w:r>
+        <w:rPr>
+          <w:rFonts w:ascii="Times New Roman" w:hAnsi="Times New Roman"/>
+          <w:b w:val="0"/>
+          <w:sz w:val="24"/>
+        </w:rPr>
+        <w:t>В таблице текущих данных появилась строка student. Это важно, потому что скриншот показывает не только текст успешного ответа, но и фактическое обновление состояния хранилища на странице.</w:t>
+      </w:r>
+    </w:p>
+    <w:p>
+      <w:pPr>
+        <w:spacing w:after="100"/>
+        <w:ind w:firstLine="425"/>
+      </w:pPr>
+      <w:r>
+        <w:rPr>
+          <w:rFonts w:ascii="Times New Roman" w:hAnsi="Times New Roman"/>
+          <w:b w:val="0"/>
+          <w:sz w:val="24"/>
+        </w:rPr>
+        <w:t>Этим скриншотом закрывается требование POST /set — сохранить ключ-значение. Дополнительно демонстрируется, что после изменения интерфейс получает обновленное состояние данных.</w:t>
       </w:r>
     </w:p>
     <w:p>
@@ -3427,7 +3559,7 @@
         <w:drawing>
           <wp:inline xmlns:a="http://schemas.openxmlformats.org/drawingml/2006/main" xmlns:pic="http://schemas.openxmlformats.org/drawingml/2006/picture">
             <wp:extent cx="5940000" cy="5057262"/>
-            <wp:docPr id="4" name="Picture 4"/>
+            <wp:docPr id="3" name="Picture 3"/>
             <wp:cNvGraphicFramePr>
               <a:graphicFrameLocks noChangeAspect="1"/>
             </wp:cNvGraphicFramePr>
@@ -3439,7 +3571,7 @@
                     <pic:cNvPicPr/>
                   </pic:nvPicPr>
                   <pic:blipFill>
-                    <a:blip r:embed="rId13"/>
+                    <a:blip r:embed="rId11"/>
                     <a:stretch>
                       <a:fillRect/>
                     </a:stretch>
@@ -3460,7 +3592,7 @@
     </w:p>
     <w:p>
       <w:pPr>
-        <w:spacing w:after="80"/>
+        <w:spacing w:after="100"/>
         <w:jc w:val="center"/>
       </w:pPr>
       <w:r>
@@ -3474,7 +3606,7 @@
     </w:p>
     <w:p>
       <w:pPr>
-        <w:spacing w:after="80"/>
+        <w:spacing w:after="100"/>
         <w:ind w:firstLine="425"/>
       </w:pPr>
       <w:r>
@@ -3483,7 +3615,63 @@
           <w:b w:val="0"/>
           <w:sz w:val="24"/>
         </w:rPr>
-        <w:t>Запрос GET /get/student возвращает значение, которое ранее было сохранено. Это показывает, что данные находятся в хранилище и доступны по ключу. Маршрут не изменяет файл, а только читает текущее состояние словаря data.</w:t>
+        <w:t>На третьем скриншоте показана операция чтения данных. После сохранения ключа student выполняется запрос GET /get/student.</w:t>
+      </w:r>
+    </w:p>
+    <w:p>
+      <w:pPr>
+        <w:spacing w:after="100"/>
+        <w:ind w:firstLine="425"/>
+      </w:pPr>
+      <w:r>
+        <w:rPr>
+          <w:rFonts w:ascii="Times New Roman" w:hAnsi="Times New Roman"/>
+          <w:b w:val="0"/>
+          <w:sz w:val="24"/>
+        </w:rPr>
+        <w:t>Сервер ищет ключ student в словаре data. Так как ключ существует, приложение возвращает JSON-ответ со статусом 200, полем ok=true, ключом и соответствующим значением.</w:t>
+      </w:r>
+    </w:p>
+    <w:p>
+      <w:pPr>
+        <w:spacing w:after="100"/>
+        <w:ind w:firstLine="425"/>
+      </w:pPr>
+      <w:r>
+        <w:rPr>
+          <w:rFonts w:ascii="Times New Roman" w:hAnsi="Times New Roman"/>
+          <w:b w:val="0"/>
+          <w:sz w:val="24"/>
+        </w:rPr>
+        <w:t>Эта операция не изменяет data.json, потому что получение значения является операцией чтения. Она только показывает, что ранее сохраненные данные доступны по ключу.</w:t>
+      </w:r>
+    </w:p>
+    <w:p>
+      <w:pPr>
+        <w:spacing w:after="100"/>
+        <w:ind w:firstLine="425"/>
+      </w:pPr>
+      <w:r>
+        <w:rPr>
+          <w:rFonts w:ascii="Times New Roman" w:hAnsi="Times New Roman"/>
+          <w:b w:val="0"/>
+          <w:sz w:val="24"/>
+        </w:rPr>
+        <w:t>С практической точки зрения такой маршрут нужен любому клиенту, который хочет получить конкретное значение, не загружая все хранилище целиком.</w:t>
+      </w:r>
+    </w:p>
+    <w:p>
+      <w:pPr>
+        <w:spacing w:after="100"/>
+        <w:ind w:firstLine="425"/>
+      </w:pPr>
+      <w:r>
+        <w:rPr>
+          <w:rFonts w:ascii="Times New Roman" w:hAnsi="Times New Roman"/>
+          <w:b w:val="0"/>
+          <w:sz w:val="24"/>
+        </w:rPr>
+        <w:t>Скриншот подтверждает выполнение требования GET /get/&lt;key&gt; — получить значение по ключу.</w:t>
       </w:r>
     </w:p>
     <w:p>
@@ -3494,7 +3682,7 @@
         <w:drawing>
           <wp:inline xmlns:a="http://schemas.openxmlformats.org/drawingml/2006/main" xmlns:pic="http://schemas.openxmlformats.org/drawingml/2006/picture">
             <wp:extent cx="5940000" cy="5057262"/>
-            <wp:docPr id="5" name="Picture 5"/>
+            <wp:docPr id="4" name="Picture 4"/>
             <wp:cNvGraphicFramePr>
               <a:graphicFrameLocks noChangeAspect="1"/>
             </wp:cNvGraphicFramePr>
@@ -3506,7 +3694,7 @@
                     <pic:cNvPicPr/>
                   </pic:nvPicPr>
                   <pic:blipFill>
-                    <a:blip r:embed="rId14"/>
+                    <a:blip r:embed="rId12"/>
                     <a:stretch>
                       <a:fillRect/>
                     </a:stretch>
@@ -3527,7 +3715,7 @@
     </w:p>
     <w:p>
       <w:pPr>
-        <w:spacing w:after="80"/>
+        <w:spacing w:after="100"/>
         <w:jc w:val="center"/>
       </w:pPr>
       <w:r>
@@ -3536,12 +3724,12 @@
           <w:b/>
           <w:sz w:val="24"/>
         </w:rPr>
-        <w:t>Рисунок 4 — Проверка существования ключа через GET /exists/student</w:t>
+        <w:t>Рисунок 4 — Проверка наличия ключа через GET /exists/student</w:t>
       </w:r>
     </w:p>
     <w:p>
       <w:pPr>
-        <w:spacing w:after="80"/>
+        <w:spacing w:after="100"/>
         <w:ind w:firstLine="425"/>
       </w:pPr>
       <w:r>
@@ -3550,7 +3738,63 @@
           <w:b w:val="0"/>
           <w:sz w:val="24"/>
         </w:rPr>
-        <w:t>Ответ contains exists=true. Такой маршрут нужен, когда клиенту достаточно узнать факт наличия ключа. Это менее избыточно, чем получать само значение, особенно если значение большое.</w:t>
+        <w:t>На четвертом скриншоте показана проверка существования ключа. Запрос отправляется на маршрут GET /exists/student.</w:t>
+      </w:r>
+    </w:p>
+    <w:p>
+      <w:pPr>
+        <w:spacing w:after="100"/>
+        <w:ind w:firstLine="425"/>
+      </w:pPr>
+      <w:r>
+        <w:rPr>
+          <w:rFonts w:ascii="Times New Roman" w:hAnsi="Times New Roman"/>
+          <w:b w:val="0"/>
+          <w:sz w:val="24"/>
+        </w:rPr>
+        <w:t>В JSON-ответе сервер возвращает exists=true. Это означает, что ключ student есть в словаре data. При этом само значение не обязательно передавать клиенту.</w:t>
+      </w:r>
+    </w:p>
+    <w:p>
+      <w:pPr>
+        <w:spacing w:after="100"/>
+        <w:ind w:firstLine="425"/>
+      </w:pPr>
+      <w:r>
+        <w:rPr>
+          <w:rFonts w:ascii="Times New Roman" w:hAnsi="Times New Roman"/>
+          <w:b w:val="0"/>
+          <w:sz w:val="24"/>
+        </w:rPr>
+        <w:t>Такой маршрут полезен, когда клиенту важно только узнать, существует ли запись. Например, перед созданием новой записи можно проверить, не занят ли ключ.</w:t>
+      </w:r>
+    </w:p>
+    <w:p>
+      <w:pPr>
+        <w:spacing w:after="100"/>
+        <w:ind w:firstLine="425"/>
+      </w:pPr>
+      <w:r>
+        <w:rPr>
+          <w:rFonts w:ascii="Times New Roman" w:hAnsi="Times New Roman"/>
+          <w:b w:val="0"/>
+          <w:sz w:val="24"/>
+        </w:rPr>
+        <w:t>Отдельная проверка существования делает API более полным. Оно умеет не только читать и изменять данные, но и отвечать на вопрос о наличии записи.</w:t>
+      </w:r>
+    </w:p>
+    <w:p>
+      <w:pPr>
+        <w:spacing w:after="100"/>
+        <w:ind w:firstLine="425"/>
+      </w:pPr>
+      <w:r>
+        <w:rPr>
+          <w:rFonts w:ascii="Times New Roman" w:hAnsi="Times New Roman"/>
+          <w:b w:val="0"/>
+          <w:sz w:val="24"/>
+        </w:rPr>
+        <w:t>Скриншот подтверждает выполнение требования GET /exists/&lt;key&gt; — проверить наличие ключа.</w:t>
       </w:r>
     </w:p>
     <w:p>
@@ -3561,7 +3805,7 @@
         <w:drawing>
           <wp:inline xmlns:a="http://schemas.openxmlformats.org/drawingml/2006/main" xmlns:pic="http://schemas.openxmlformats.org/drawingml/2006/picture">
             <wp:extent cx="5940000" cy="5052914"/>
-            <wp:docPr id="6" name="Picture 6"/>
+            <wp:docPr id="5" name="Picture 5"/>
             <wp:cNvGraphicFramePr>
               <a:graphicFrameLocks noChangeAspect="1"/>
             </wp:cNvGraphicFramePr>
@@ -3573,7 +3817,7 @@
                     <pic:cNvPicPr/>
                   </pic:nvPicPr>
                   <pic:blipFill>
-                    <a:blip r:embed="rId15"/>
+                    <a:blip r:embed="rId13"/>
                     <a:stretch>
                       <a:fillRect/>
                     </a:stretch>
@@ -3594,7 +3838,7 @@
     </w:p>
     <w:p>
       <w:pPr>
-        <w:spacing w:after="80"/>
+        <w:spacing w:after="100"/>
         <w:jc w:val="center"/>
       </w:pPr>
       <w:r>
@@ -3608,7 +3852,7 @@
     </w:p>
     <w:p>
       <w:pPr>
-        <w:spacing w:after="80"/>
+        <w:spacing w:after="100"/>
         <w:ind w:firstLine="425"/>
       </w:pPr>
       <w:r>
@@ -3617,7 +3861,63 @@
           <w:b w:val="0"/>
           <w:sz w:val="24"/>
         </w:rPr>
-        <w:t>После удаления сервер возвращает статус 200, имя удаленного ключа и removed_value. В таблице строка student исчезает. Это подтверждает, что удаление выполнено не только визуально, но и в серверном состоянии.</w:t>
+        <w:t>На пятом скриншоте показано удаление записи. Пользователь нажимает кнопку «Удалить», после чего браузер отправляет DELETE-запрос на маршрут /delete/student.</w:t>
+      </w:r>
+    </w:p>
+    <w:p>
+      <w:pPr>
+        <w:spacing w:after="100"/>
+        <w:ind w:firstLine="425"/>
+      </w:pPr>
+      <w:r>
+        <w:rPr>
+          <w:rFonts w:ascii="Times New Roman" w:hAnsi="Times New Roman"/>
+          <w:b w:val="0"/>
+          <w:sz w:val="24"/>
+        </w:rPr>
+        <w:t>Сервер проверяет, что ключ существует, удаляет его из словаря data, вызывает save_data() и сохраняет новое состояние в data.json. Поэтому после удаления запись не должна появиться при следующем запуске приложения.</w:t>
+      </w:r>
+    </w:p>
+    <w:p>
+      <w:pPr>
+        <w:spacing w:after="100"/>
+        <w:ind w:firstLine="425"/>
+      </w:pPr>
+      <w:r>
+        <w:rPr>
+          <w:rFonts w:ascii="Times New Roman" w:hAnsi="Times New Roman"/>
+          <w:b w:val="0"/>
+          <w:sz w:val="24"/>
+        </w:rPr>
+        <w:t>В JSON-ответе видно поле removed_value. Оно показывает значение, которое было удалено. Это удобно для проверки: можно убедиться, что удалена именно та запись, которую ожидали удалить.</w:t>
+      </w:r>
+    </w:p>
+    <w:p>
+      <w:pPr>
+        <w:spacing w:after="100"/>
+        <w:ind w:firstLine="425"/>
+      </w:pPr>
+      <w:r>
+        <w:rPr>
+          <w:rFonts w:ascii="Times New Roman" w:hAnsi="Times New Roman"/>
+          <w:b w:val="0"/>
+          <w:sz w:val="24"/>
+        </w:rPr>
+        <w:t>В таблице текущих данных строка student исчезает. Это подтверждает, что удаление произошло не только в ответе сервера, но и в отображаемом состоянии приложения.</w:t>
+      </w:r>
+    </w:p>
+    <w:p>
+      <w:pPr>
+        <w:spacing w:after="100"/>
+        <w:ind w:firstLine="425"/>
+      </w:pPr>
+      <w:r>
+        <w:rPr>
+          <w:rFonts w:ascii="Times New Roman" w:hAnsi="Times New Roman"/>
+          <w:b w:val="0"/>
+          <w:sz w:val="24"/>
+        </w:rPr>
+        <w:t>Скриншот закрывает требование DELETE /delete/&lt;key&gt; — удалить ключ.</w:t>
       </w:r>
     </w:p>
     <w:p>
@@ -3628,7 +3928,7 @@
         <w:drawing>
           <wp:inline xmlns:a="http://schemas.openxmlformats.org/drawingml/2006/main" xmlns:pic="http://schemas.openxmlformats.org/drawingml/2006/picture">
             <wp:extent cx="5940000" cy="7622855"/>
-            <wp:docPr id="7" name="Picture 7"/>
+            <wp:docPr id="6" name="Picture 6"/>
             <wp:cNvGraphicFramePr>
               <a:graphicFrameLocks noChangeAspect="1"/>
             </wp:cNvGraphicFramePr>
@@ -3640,7 +3940,7 @@
                     <pic:cNvPicPr/>
                   </pic:nvPicPr>
                   <pic:blipFill>
-                    <a:blip r:embed="rId16"/>
+                    <a:blip r:embed="rId14"/>
                     <a:stretch>
                       <a:fillRect/>
                     </a:stretch>
@@ -3661,7 +3961,7 @@
     </w:p>
     <w:p>
       <w:pPr>
-        <w:spacing w:after="80"/>
+        <w:spacing w:after="100"/>
         <w:jc w:val="center"/>
       </w:pPr>
       <w:r>
@@ -3670,12 +3970,12 @@
           <w:b/>
           <w:sz w:val="24"/>
         </w:rPr>
-        <w:t>Рисунок 6 — Срабатывание Flask-Limiter</w:t>
+        <w:t>Рисунок 6 — Проверка ограничения запросов Flask-Limiter</w:t>
       </w:r>
     </w:p>
     <w:p>
       <w:pPr>
-        <w:spacing w:after="80"/>
+        <w:spacing w:after="100"/>
         <w:ind w:firstLine="425"/>
       </w:pPr>
       <w:r>
@@ -3684,7 +3984,63 @@
           <w:b w:val="0"/>
           <w:sz w:val="24"/>
         </w:rPr>
-        <w:t>Для проверки лимита была выполнена серия запросов к /set. Первые запросы получают статус 201, затем сервер возвращает 429 Too Many Requests. Это доказывает, что отдельный лимит 10 запросов в минуту для изменяющих операций действительно работает.</w:t>
+        <w:t>На шестом скриншоте показано срабатывание ограничения запросов. Для проверки была выполнена серия запросов к маршруту POST /set.</w:t>
+      </w:r>
+    </w:p>
+    <w:p>
+      <w:pPr>
+        <w:spacing w:after="100"/>
+        <w:ind w:firstLine="425"/>
+      </w:pPr>
+      <w:r>
+        <w:rPr>
+          <w:rFonts w:ascii="Times New Roman" w:hAnsi="Times New Roman"/>
+          <w:b w:val="0"/>
+          <w:sz w:val="24"/>
+        </w:rPr>
+        <w:t>Первые запросы получают статус 201, потому что они укладываются в допустимый лимит. После превышения установленного количества запросов сервер начинает возвращать статус 429.</w:t>
+      </w:r>
+    </w:p>
+    <w:p>
+      <w:pPr>
+        <w:spacing w:after="100"/>
+        <w:ind w:firstLine="425"/>
+      </w:pPr>
+      <w:r>
+        <w:rPr>
+          <w:rFonts w:ascii="Times New Roman" w:hAnsi="Times New Roman"/>
+          <w:b w:val="0"/>
+          <w:sz w:val="24"/>
+        </w:rPr>
+        <w:t>Статус 429 означает Too Many Requests, то есть клиент отправил слишком много запросов за короткий промежуток времени. В ответе также выводится сообщение о превышении лимита.</w:t>
+      </w:r>
+    </w:p>
+    <w:p>
+      <w:pPr>
+        <w:spacing w:after="100"/>
+        <w:ind w:firstLine="425"/>
+      </w:pPr>
+      <w:r>
+        <w:rPr>
+          <w:rFonts w:ascii="Times New Roman" w:hAnsi="Times New Roman"/>
+          <w:b w:val="0"/>
+          <w:sz w:val="24"/>
+        </w:rPr>
+        <w:t>Именно эта часть демонстрирует работу Flask-Limiter. В задании требовалось установить общее ограничение и отдельное ограничение для /set и /delete, и скриншот показывает, что отдельный лимит действительно срабатывает.</w:t>
+      </w:r>
+    </w:p>
+    <w:p>
+      <w:pPr>
+        <w:spacing w:after="100"/>
+        <w:ind w:firstLine="425"/>
+      </w:pPr>
+      <w:r>
+        <w:rPr>
+          <w:rFonts w:ascii="Times New Roman" w:hAnsi="Times New Roman"/>
+          <w:b w:val="0"/>
+          <w:sz w:val="24"/>
+        </w:rPr>
+        <w:t>Такой механизм полезен даже в небольшой лабораторной работе: он показывает, что серверная часть может не только выполнять команды, но и контролировать нагрузку.</w:t>
       </w:r>
     </w:p>
     <w:p>
@@ -3711,7 +4067,7 @@
           <w:b w:val="0"/>
           <w:sz w:val="24"/>
         </w:rPr>
-        <w:t>Приложение запускается локально и открывается в браузере.</w:t>
+        <w:t>Хранилище реализовано как словарь data.</w:t>
       </w:r>
     </w:p>
     <w:p>
@@ -3725,7 +4081,7 @@
           <w:b w:val="0"/>
           <w:sz w:val="24"/>
         </w:rPr>
-        <w:t>Файл data.json загружается автоматически при старте.</w:t>
+        <w:t>Данные автоматически загружаются из data.json при старте приложения.</w:t>
       </w:r>
     </w:p>
     <w:p>
@@ -3739,7 +4095,7 @@
           <w:b w:val="0"/>
           <w:sz w:val="24"/>
         </w:rPr>
-        <w:t>Словарь data является основным хранилищем во время работы приложения.</w:t>
+        <w:t>Изменения сохраняются в файл после операций /set и /delete.</w:t>
       </w:r>
     </w:p>
     <w:p>
@@ -3753,7 +4109,7 @@
           <w:b w:val="0"/>
           <w:sz w:val="24"/>
         </w:rPr>
-        <w:t>POST /set сохраняет значение и возвращает JSON-ответ.</w:t>
+        <w:t>POST /set сохраняет ключ и значение.</w:t>
       </w:r>
     </w:p>
     <w:p>
@@ -3781,7 +4137,7 @@
           <w:b w:val="0"/>
           <w:sz w:val="24"/>
         </w:rPr>
-        <w:t>DELETE /delete/&lt;key&gt; удаляет ключ и сохраняет результат в data.json.</w:t>
+        <w:t>DELETE /delete/&lt;key&gt; удаляет ключ.</w:t>
       </w:r>
     </w:p>
     <w:p>
@@ -3795,7 +4151,7 @@
           <w:b w:val="0"/>
           <w:sz w:val="24"/>
         </w:rPr>
-        <w:t>GET /exists/&lt;key&gt; возвращает true или false.</w:t>
+        <w:t>GET /exists/&lt;key&gt; проверяет наличие ключа.</w:t>
       </w:r>
     </w:p>
     <w:p>
@@ -3809,7 +4165,7 @@
           <w:b w:val="0"/>
           <w:sz w:val="24"/>
         </w:rPr>
-        <w:t>После /set и /delete файл data.json реально меняется.</w:t>
+        <w:t>Для всех маршрутов установлен общий лимит 100 запросов в сутки.</w:t>
       </w:r>
     </w:p>
     <w:p>
@@ -3823,7 +4179,7 @@
           <w:b w:val="0"/>
           <w:sz w:val="24"/>
         </w:rPr>
-        <w:t>Общий лимит 100 запросов в сутки указан в Limiter.</w:t>
+        <w:t>Для /set и /delete установлен отдельный лимит 10 запросов в минуту.</w:t>
       </w:r>
     </w:p>
     <w:p>
@@ -3837,7 +4193,7 @@
           <w:b w:val="0"/>
           <w:sz w:val="24"/>
         </w:rPr>
-        <w:t>Отдельный лимит 10 запросов в минуту установлен для /set и /delete.</w:t>
+        <w:t>Ошибки возвращаются в JSON-формате.</w:t>
       </w:r>
     </w:p>
     <w:p>
@@ -3851,7 +4207,7 @@
           <w:b w:val="0"/>
           <w:sz w:val="24"/>
         </w:rPr>
-        <w:t>При ошибках сервер возвращает понятный JSON-ответ.</w:t>
+        <w:t>Есть проверка через браузер и через requests.</w:t>
       </w:r>
     </w:p>
     <w:p>
@@ -3865,13 +4221,13 @@
           <w:b w:val="0"/>
           <w:sz w:val="24"/>
         </w:rPr>
-        <w:t>Есть демонстрационная страница и отдельный клиент на requests.</w:t>
+        <w:t>В отчете приведены скриншоты и пояснения к ним.</w:t>
       </w:r>
     </w:p>
     <w:p>
       <w:pPr>
-        <w:pStyle w:val="ListBullet"/>
-        <w:spacing w:after="60"/>
+        <w:spacing w:after="100"/>
+        <w:ind w:firstLine="425"/>
       </w:pPr>
       <w:r>
         <w:rPr>
@@ -3879,28 +4235,14 @@
           <w:b w:val="0"/>
           <w:sz w:val="24"/>
         </w:rPr>
-        <w:t>Код снабжен комментариями по разделам лабораторной работы.</w:t>
+        <w:t>Команды проверки, которые использовались при выполнении:</w:t>
       </w:r>
     </w:p>
     <w:p>
       <w:pPr>
-        <w:spacing w:after="80"/>
-        <w:ind w:firstLine="425"/>
-      </w:pPr>
-      <w:r>
-        <w:rPr>
-          <w:rFonts w:ascii="Times New Roman" w:hAnsi="Times New Roman"/>
-          <w:b w:val="0"/>
-          <w:sz w:val="24"/>
-        </w:rPr>
-        <w:t>Финальные команды проверки:</w:t>
-      </w:r>
-    </w:p>
-    <w:p>
-      <w:pPr>
+        <w:spacing w:after="140"/>
+        <w:ind w:left="142" w:right="142"/>
         <w:shd w:fill="F2F5F9"/>
-        <w:spacing w:after="160"/>
-        <w:ind w:left="142" w:right="142"/>
       </w:pPr>
       <w:r>
         <w:rPr>
@@ -3915,7 +4257,7 @@
     </w:p>
     <w:p>
       <w:pPr>
-        <w:spacing w:after="80"/>
+        <w:spacing w:after="100"/>
         <w:ind w:firstLine="425"/>
       </w:pPr>
       <w:r>
@@ -3924,7 +4266,7 @@
           <w:b w:val="0"/>
           <w:sz w:val="24"/>
         </w:rPr>
-        <w:t>Также была выполнена автоматическая проверка через Flask test_client: загрузка из файла, /set, /get, /exists, /delete, сохранение после изменения, валидация пустого ключа и получение статуса 429 при превышении лимита.</w:t>
+        <w:t>Дополнительно была выполнена автоматическая проверка через Flask test_client: загрузка из data.json, сохранение, получение, проверка существования, удаление, обновление файла и срабатывание лимита 429.</w:t>
       </w:r>
     </w:p>
     <w:p>
@@ -3937,12 +4279,12 @@
           <w:b/>
           <w:sz w:val="28"/>
         </w:rPr>
-        <w:t>11. Запуск приложения</w:t>
+        <w:t>11. Запуск и ручная проверка</w:t>
       </w:r>
     </w:p>
     <w:p>
       <w:pPr>
-        <w:spacing w:after="80"/>
+        <w:spacing w:after="100"/>
         <w:ind w:firstLine="425"/>
       </w:pPr>
       <w:r>
@@ -3951,14 +4293,14 @@
           <w:b w:val="0"/>
           <w:sz w:val="24"/>
         </w:rPr>
-        <w:t>Локальный запуск через Python:</w:t>
+        <w:t>Для локального запуска через Python необходимо выполнить следующие команды:</w:t>
       </w:r>
     </w:p>
     <w:p>
       <w:pPr>
+        <w:spacing w:after="140"/>
+        <w:ind w:left="142" w:right="142"/>
         <w:shd w:fill="F2F5F9"/>
-        <w:spacing w:after="160"/>
-        <w:ind w:left="142" w:right="142"/>
       </w:pPr>
       <w:r>
         <w:rPr>
@@ -3977,7 +4319,7 @@
     </w:p>
     <w:p>
       <w:pPr>
-        <w:spacing w:after="80"/>
+        <w:spacing w:after="100"/>
         <w:ind w:firstLine="425"/>
       </w:pPr>
       <w:r>
@@ -3986,27 +4328,12 @@
           <w:b w:val="0"/>
           <w:sz w:val="24"/>
         </w:rPr>
-        <w:t>После запуска приложение доступно по адресу:</w:t>
+        <w:t>После запуска приложение открывается по адресу http://127.0.0.1:5000. Если порт занят, можно указать другой порт через переменную окружения FLASK_PORT.</w:t>
       </w:r>
     </w:p>
     <w:p>
       <w:pPr>
-        <w:shd w:fill="F2F5F9"/>
-        <w:spacing w:after="160"/>
-        <w:ind w:left="142" w:right="142"/>
-      </w:pPr>
-      <w:r>
-        <w:rPr>
-          <w:rFonts w:ascii="Courier New" w:hAnsi="Courier New"/>
-          <w:b w:val="0"/>
-          <w:sz w:val="17"/>
-        </w:rPr>
-        <w:t>http://127.0.0.1:5000</w:t>
-      </w:r>
-    </w:p>
-    <w:p>
-      <w:pPr>
-        <w:spacing w:after="80"/>
+        <w:spacing w:after="100"/>
         <w:ind w:firstLine="425"/>
       </w:pPr>
       <w:r>
@@ -4015,14 +4342,14 @@
           <w:b w:val="0"/>
           <w:sz w:val="24"/>
         </w:rPr>
-        <w:t>Запуск через Docker Compose:</w:t>
+        <w:t>Для запуска через Docker Compose можно использовать команду:</w:t>
       </w:r>
     </w:p>
     <w:p>
       <w:pPr>
+        <w:spacing w:after="140"/>
+        <w:ind w:left="142" w:right="142"/>
         <w:shd w:fill="F2F5F9"/>
-        <w:spacing w:after="160"/>
-        <w:ind w:left="142" w:right="142"/>
       </w:pPr>
       <w:r>
         <w:rPr>
@@ -4035,7 +4362,7 @@
     </w:p>
     <w:p>
       <w:pPr>
-        <w:spacing w:after="80"/>
+        <w:spacing w:after="100"/>
         <w:ind w:firstLine="425"/>
       </w:pPr>
       <w:r>
@@ -4044,7 +4371,7 @@
           <w:b w:val="0"/>
           <w:sz w:val="24"/>
         </w:rPr>
-        <w:t>В docker-compose.yml файл проекта подключается в контейнер как volume. Это удобно для лабораторной работы: data.json остается на компьютере, и после перезапуска контейнера сохраненные ключи не исчезают.</w:t>
+        <w:t>Проверка через curl или Postman выполняется теми же маршрутами: /set для сохранения, /get/&lt;key&gt; для чтения, /exists/&lt;key&gt; для проверки и /delete/&lt;key&gt; для удаления.</w:t>
       </w:r>
     </w:p>
     <w:p>
@@ -4062,7 +4389,7 @@
     </w:p>
     <w:p>
       <w:pPr>
-        <w:spacing w:after="80"/>
+        <w:spacing w:after="100"/>
         <w:ind w:firstLine="425"/>
       </w:pPr>
       <w:r>
@@ -4076,7 +4403,7 @@
     </w:p>
     <w:p>
       <w:pPr>
-        <w:spacing w:after="80"/>
+        <w:spacing w:after="100"/>
         <w:ind w:firstLine="425"/>
       </w:pPr>
       <w:r>
@@ -4085,12 +4412,12 @@
           <w:b w:val="0"/>
           <w:sz w:val="24"/>
         </w:rPr>
-        <w:t>Это способ хранения данных, при котором каждая запись состоит из ключа и значения. По ключу можно быстро получить, изменить или удалить значение.</w:t>
+        <w:t>Это хранилище, где каждая запись состоит из ключа и значения. Ключ используется для поиска, изменения или удаления значения.</w:t>
       </w:r>
     </w:p>
     <w:p>
       <w:pPr>
-        <w:spacing w:after="80"/>
+        <w:spacing w:after="100"/>
         <w:ind w:firstLine="425"/>
       </w:pPr>
       <w:r>
@@ -4099,12 +4426,12 @@
           <w:b/>
           <w:sz w:val="24"/>
         </w:rPr>
-        <w:t>Почему в работе используется словарь data?</w:t>
+        <w:t>Почему словарь Python подходит для этой работы?</w:t>
       </w:r>
     </w:p>
     <w:p>
       <w:pPr>
-        <w:spacing w:after="80"/>
+        <w:spacing w:after="100"/>
         <w:ind w:firstLine="425"/>
       </w:pPr>
       <w:r>
@@ -4113,12 +4440,12 @@
           <w:b w:val="0"/>
           <w:sz w:val="24"/>
         </w:rPr>
-        <w:t>Словарь Python уже реализует идею key-value: обращение к значению идет по ключу, добавление и удаление выполняются простыми операциями.</w:t>
+        <w:t>Словарь уже реализует принцип key-value: ключи уникальны, а доступ к значению выполняется по имени ключа.</w:t>
       </w:r>
     </w:p>
     <w:p>
       <w:pPr>
-        <w:spacing w:after="80"/>
+        <w:spacing w:after="100"/>
         <w:ind w:firstLine="425"/>
       </w:pPr>
       <w:r>
@@ -4127,12 +4454,12 @@
           <w:b/>
           <w:sz w:val="24"/>
         </w:rPr>
-        <w:t>Зачем нужен data.json?</w:t>
+        <w:t>Зачем нужен файл data.json?</w:t>
       </w:r>
     </w:p>
     <w:p>
       <w:pPr>
-        <w:spacing w:after="80"/>
+        <w:spacing w:after="100"/>
         <w:ind w:firstLine="425"/>
       </w:pPr>
       <w:r>
@@ -4141,12 +4468,12 @@
           <w:b w:val="0"/>
           <w:sz w:val="24"/>
         </w:rPr>
-        <w:t>Словарь data хранится в памяти и пропадет после остановки программы. Файл data.json сохраняет состояние между запусками.</w:t>
+        <w:t>Он сохраняет данные между запусками приложения. Без файла словарь data очищался бы после остановки сервера.</w:t>
       </w:r>
     </w:p>
     <w:p>
       <w:pPr>
-        <w:spacing w:after="80"/>
+        <w:spacing w:after="100"/>
         <w:ind w:firstLine="425"/>
       </w:pPr>
       <w:r>
@@ -4155,12 +4482,12 @@
           <w:b/>
           <w:sz w:val="24"/>
         </w:rPr>
-        <w:t>Почему сохранение выполняется после каждой операции?</w:t>
+        <w:t>Почему изменения сохраняются после каждой операции?</w:t>
       </w:r>
     </w:p>
     <w:p>
       <w:pPr>
-        <w:spacing w:after="80"/>
+        <w:spacing w:after="100"/>
         <w:ind w:firstLine="425"/>
       </w:pPr>
       <w:r>
@@ -4169,12 +4496,12 @@
           <w:b w:val="0"/>
           <w:sz w:val="24"/>
         </w:rPr>
-        <w:t>Так уменьшается риск потери данных. Если сервер остановится после изменения, запись уже будет находиться в файле.</w:t>
+        <w:t>Так уменьшается риск потери данных. Если сервер остановится после /set или /delete, актуальное состояние уже будет в файле.</w:t>
       </w:r>
     </w:p>
     <w:p>
       <w:pPr>
-        <w:spacing w:after="80"/>
+        <w:spacing w:after="100"/>
         <w:ind w:firstLine="425"/>
       </w:pPr>
       <w:r>
@@ -4183,12 +4510,12 @@
           <w:b/>
           <w:sz w:val="24"/>
         </w:rPr>
-        <w:t>Почему /set использует POST?</w:t>
+        <w:t>Почему используется JSON?</w:t>
       </w:r>
     </w:p>
     <w:p>
       <w:pPr>
-        <w:spacing w:after="80"/>
+        <w:spacing w:after="100"/>
         <w:ind w:firstLine="425"/>
       </w:pPr>
       <w:r>
@@ -4197,12 +4524,12 @@
           <w:b w:val="0"/>
           <w:sz w:val="24"/>
         </w:rPr>
-        <w:t>POST применяется для создания или изменения данных. В данном случае он сохраняет пару ключ-значение.</w:t>
+        <w:t>JSON является распространенным форматом обмена данными в веб-приложениях. Его можно читать человеку, отправлять через HTTP и обрабатывать в Python.</w:t>
       </w:r>
     </w:p>
     <w:p>
       <w:pPr>
-        <w:spacing w:after="80"/>
+        <w:spacing w:after="100"/>
         <w:ind w:firstLine="425"/>
       </w:pPr>
       <w:r>
@@ -4211,12 +4538,12 @@
           <w:b/>
           <w:sz w:val="24"/>
         </w:rPr>
-        <w:t>Почему /delete использует DELETE?</w:t>
+        <w:t>Что делает Flask?</w:t>
       </w:r>
     </w:p>
     <w:p>
       <w:pPr>
-        <w:spacing w:after="80"/>
+        <w:spacing w:after="100"/>
         <w:ind w:firstLine="425"/>
       </w:pPr>
       <w:r>
@@ -4225,12 +4552,12 @@
           <w:b w:val="0"/>
           <w:sz w:val="24"/>
         </w:rPr>
-        <w:t>HTTP-метод DELETE явно обозначает удаление ресурса. В приложении ресурсом является ключ.</w:t>
+        <w:t>Flask принимает HTTP-запросы, сопоставляет их с маршрутами и возвращает ответы клиенту.</w:t>
       </w:r>
     </w:p>
     <w:p>
       <w:pPr>
-        <w:spacing w:after="80"/>
+        <w:spacing w:after="100"/>
         <w:ind w:firstLine="425"/>
       </w:pPr>
       <w:r>
@@ -4244,7 +4571,7 @@
     </w:p>
     <w:p>
       <w:pPr>
-        <w:spacing w:after="80"/>
+        <w:spacing w:after="100"/>
         <w:ind w:firstLine="425"/>
       </w:pPr>
       <w:r>
@@ -4253,12 +4580,12 @@
           <w:b w:val="0"/>
           <w:sz w:val="24"/>
         </w:rPr>
-        <w:t>Он считает запросы и блокирует новые обращения, если пользователь превысил установленный лимит.</w:t>
+        <w:t>Он считает запросы клиента и блокирует обращения, которые превышают заданный лимит.</w:t>
       </w:r>
     </w:p>
     <w:p>
       <w:pPr>
-        <w:spacing w:after="80"/>
+        <w:spacing w:after="100"/>
         <w:ind w:firstLine="425"/>
       </w:pPr>
       <w:r>
@@ -4267,12 +4594,12 @@
           <w:b/>
           <w:sz w:val="24"/>
         </w:rPr>
-        <w:t>Что означает HTTP 429?</w:t>
+        <w:t>Что означает статус 429?</w:t>
       </w:r>
     </w:p>
     <w:p>
       <w:pPr>
-        <w:spacing w:after="80"/>
+        <w:spacing w:after="100"/>
         <w:ind w:firstLine="425"/>
       </w:pPr>
       <w:r>
@@ -4281,12 +4608,12 @@
           <w:b w:val="0"/>
           <w:sz w:val="24"/>
         </w:rPr>
-        <w:t>Это статус Too Many Requests. Он сообщает, что клиент отправил слишком много запросов за заданный период.</w:t>
+        <w:t>Это Too Many Requests. Сервер сообщает, что клиент отправил слишком много запросов.</w:t>
       </w:r>
     </w:p>
     <w:p>
       <w:pPr>
-        <w:spacing w:after="80"/>
+        <w:spacing w:after="100"/>
         <w:ind w:firstLine="425"/>
       </w:pPr>
       <w:r>
@@ -4300,7 +4627,7 @@
     </w:p>
     <w:p>
       <w:pPr>
-        <w:spacing w:after="80"/>
+        <w:spacing w:after="100"/>
         <w:ind w:firstLine="425"/>
       </w:pPr>
       <w:r>
@@ -4309,12 +4636,12 @@
           <w:b w:val="0"/>
           <w:sz w:val="24"/>
         </w:rPr>
-        <w:t>API удобнее проверять в Postman, curl и requests, когда и успешные ответы, и ошибки имеют единый JSON-формат.</w:t>
+        <w:t>Так API удобно проверять через Postman, curl и requests. Формат успешных и ошибочных ответов остается единым.</w:t>
       </w:r>
     </w:p>
     <w:p>
       <w:pPr>
-        <w:spacing w:after="80"/>
+        <w:spacing w:after="100"/>
         <w:ind w:firstLine="425"/>
       </w:pPr>
       <w:r>
@@ -4323,12 +4650,12 @@
           <w:b/>
           <w:sz w:val="24"/>
         </w:rPr>
-        <w:t>Для чего нужен client_demo.py?</w:t>
+        <w:t>Зачем нужен client_demo.py?</w:t>
       </w:r>
     </w:p>
     <w:p>
       <w:pPr>
-        <w:spacing w:after="80"/>
+        <w:spacing w:after="100"/>
         <w:ind w:firstLine="425"/>
       </w:pPr>
       <w:r>
@@ -4337,7 +4664,7 @@
           <w:b w:val="0"/>
           <w:sz w:val="24"/>
         </w:rPr>
-        <w:t>Он показывает, что API можно использовать программно из Python, а не только через браузерный интерфейс.</w:t>
+        <w:t>Он показывает работу API из отдельной Python-программы и подтверждает, что сервер не зависит от браузерной страницы.</w:t>
       </w:r>
     </w:p>
     <w:p>
@@ -4355,7 +4682,7 @@
     </w:p>
     <w:p>
       <w:pPr>
-        <w:spacing w:after="80"/>
+        <w:spacing w:after="100"/>
         <w:ind w:firstLine="425"/>
       </w:pPr>
       <w:r>
@@ -4364,12 +4691,12 @@
           <w:b w:val="0"/>
           <w:sz w:val="24"/>
         </w:rPr>
-        <w:t>В результате выполнения лабораторной работы было разработано полноценное учебное key-value хранилище на Flask. Работа включает не только минимальные маршруты, но и дополнительные элементы, которые делают приложение удобным для проверки: HTML-интерфейс, единый формат JSON-ответов, обработку ошибок, демонстрационный клиент и подробную инструкцию по запуску.</w:t>
+        <w:t>В ходе выполнения лабораторной работы было разработано key-value хранилище на Flask. Приложение реализует полный цикл работы с данными: загрузку из файла, хранение в словаре, изменение через HTTP API и сохранение обратно в data.json.</w:t>
       </w:r>
     </w:p>
     <w:p>
       <w:pPr>
-        <w:spacing w:after="80"/>
+        <w:spacing w:after="100"/>
         <w:ind w:firstLine="425"/>
       </w:pPr>
       <w:r>
@@ -4378,12 +4705,12 @@
           <w:b w:val="0"/>
           <w:sz w:val="24"/>
         </w:rPr>
-        <w:t>Основной принцип key-value хранения показан на практике: данные представлены словарем data, где каждому ключу соответствует значение. При запуске приложение читает data.json, а после добавления или удаления ключа сохраняет новое состояние обратно в файл. Таким образом, реализована связь между оперативной памятью приложения и постоянным файловым хранением.</w:t>
+        <w:t>Работа показала, как простая структура данных Python может использоваться как основа серверного приложения. Словарь data выступает временным хранилищем во время работы сервера, а JSON-файл обеспечивает сохранность между запусками.</w:t>
       </w:r>
     </w:p>
     <w:p>
       <w:pPr>
-        <w:spacing w:after="80"/>
+        <w:spacing w:after="100"/>
         <w:ind w:firstLine="425"/>
       </w:pPr>
       <w:r>
@@ -4392,12 +4719,12 @@
           <w:b w:val="0"/>
           <w:sz w:val="24"/>
         </w:rPr>
-        <w:t>Особое внимание уделено надежности и проверяемости. В коде есть валидация ключей, проверка сериализуемости значений, блокировка RLock для операций с общими данными, аккуратная запись через временный файл и единая обработка ошибок. Это делает решение более устойчивым, чем простой пример со словарем без проверок.</w:t>
+        <w:t>Особое внимание уделено API. Были реализованы все маршруты из задания: POST /set, GET /get/&lt;key&gt;, DELETE /delete/&lt;key&gt; и GET /exists/&lt;key&gt;. Каждый маршрут возвращает JSON-ответ, поэтому приложение удобно проверять не только через браузер, но и через Postman, curl или requests.</w:t>
       </w:r>
     </w:p>
     <w:p>
       <w:pPr>
-        <w:spacing w:after="80"/>
+        <w:spacing w:after="100"/>
         <w:ind w:firstLine="425"/>
       </w:pPr>
       <w:r>
@@ -4406,12 +4733,12 @@
           <w:b w:val="0"/>
           <w:sz w:val="24"/>
         </w:rPr>
-        <w:t>Flask-Limiter показывает, как в веб-приложении ограничивать частоту запросов. Общий лимит защищает все маршруты, а отдельный лимит для /set и /delete защищает операции, которые изменяют состояние хранилища и файл data.json. На скриншоте со статусом 429 видно, что ограничение реально срабатывает.</w:t>
+        <w:t>Важной частью работы стала обработка ошибок. Приложение проверяет пустые ключи, отсутствие значения, неизвестные ключи и превышение лимита запросов. Ошибки не приводят к падению сервера, а возвращаются клиенту в понятном формате.</w:t>
       </w:r>
     </w:p>
     <w:p>
       <w:pPr>
-        <w:spacing w:after="80"/>
+        <w:spacing w:after="100"/>
         <w:ind w:firstLine="425"/>
       </w:pPr>
       <w:r>
@@ -4420,12 +4747,12 @@
           <w:b w:val="0"/>
           <w:sz w:val="24"/>
         </w:rPr>
-        <w:t>Также была проверена работа приложения разными способами: через браузер, через Python-клиент requests и через автоматические HTTP-проверки. Это подтверждает, что лабораторная работа не привязана к одному интерфейсу и может быть проверена преподавателем удобным способом.</w:t>
+        <w:t>Flask-Limiter позволил реализовать ограничение запросов без написания собственного счетчика. Общий лимит применяется ко всему приложению, а отдельный лимит защищает операции, которые изменяют состояние файла. На скриншоте видно, что при превышении лимита сервер возвращает статус 429.</w:t>
       </w:r>
     </w:p>
     <w:p>
       <w:pPr>
-        <w:spacing w:after="80"/>
+        <w:spacing w:after="100"/>
         <w:ind w:firstLine="425"/>
       </w:pPr>
       <w:r>
@@ -4434,7 +4761,35 @@
           <w:b w:val="0"/>
           <w:sz w:val="24"/>
         </w:rPr>
-        <w:t>Итоговый проект соответствует заданию лабораторной работы №8: реализовано key-value хранилище, загрузка из data.json, сохранение после изменений, API-маршруты /set, /get, /delete, /exists и ограничения запросов через Flask-Limiter. Подготовленный отчет содержит теорию, описание библиотек, фрагменты кода, примеры запросов, скриншоты и подробные пояснения, поэтому работу можно проверять без устной защиты.</w:t>
+        <w:t>Дополнительно был создан демонстрационный интерфейс. Он делает проверку работы наглядной: можно сохранить ключ, получить значение, проверить существование и удалить запись. JSON-ответ отображается прямо на странице, а таблица показывает текущее состояние хранилища.</w:t>
+      </w:r>
+    </w:p>
+    <w:p>
+      <w:pPr>
+        <w:spacing w:after="100"/>
+        <w:ind w:firstLine="425"/>
+      </w:pPr>
+      <w:r>
+        <w:rPr>
+          <w:rFonts w:ascii="Times New Roman" w:hAnsi="Times New Roman"/>
+          <w:b w:val="0"/>
+          <w:sz w:val="24"/>
+        </w:rPr>
+        <w:t>Также был подготовлен клиент client_demo.py на requests. Он подтверждает, что приложение действительно является API, а не только веб-страницей. Сторонняя программа может отправлять запросы и получать результаты.</w:t>
+      </w:r>
+    </w:p>
+    <w:p>
+      <w:pPr>
+        <w:spacing w:after="100"/>
+        <w:ind w:firstLine="425"/>
+      </w:pPr>
+      <w:r>
+        <w:rPr>
+          <w:rFonts w:ascii="Times New Roman" w:hAnsi="Times New Roman"/>
+          <w:b w:val="0"/>
+          <w:sz w:val="24"/>
+        </w:rPr>
+        <w:t>Итоговый проект соответствует требованиям лабораторной работы №8. Он содержит код приложения, файл данных, зависимости, Docker-файлы, инструкцию README, скриншоты и подробный отчет. Благодаря расширенному описанию работу можно проверить без устной защиты.</w:t>
       </w:r>
     </w:p>
     <w:p>
@@ -4521,7 +4876,6 @@
       </w:r>
     </w:p>
     <w:sectPr>
-      <w:headerReference w:type="default" r:id="rId10"/>
       <w:pgSz w:w="12240" w:h="15840"/>
       <w:pgMar w:top="1134" w:right="850" w:bottom="1134" w:left="1417" w:header="720" w:footer="720" w:gutter="0"/>
       <w:cols w:space="720"/>
@@ -4529,51 +4883,6 @@
     </w:sectPr>
   </w:body>
 </w:document>
-</file>
-
-<file path=word/header1.xml><?xml version="1.0" encoding="utf-8"?>
-<w:hdr xmlns:m="http://schemas.openxmlformats.org/officeDocument/2006/math" xmlns:mc="http://schemas.openxmlformats.org/markup-compatibility/2006" xmlns:mo="http://schemas.microsoft.com/office/mac/office/2008/main" xmlns:mv="urn:schemas-microsoft-com:mac:vml" xmlns:o="urn:schemas-microsoft-com:office:office" xmlns:r="http://schemas.openxmlformats.org/officeDocument/2006/relationships" xmlns:v="urn:schemas-microsoft-com:vml" xmlns:w10="urn:schemas-microsoft-com:office:word" xmlns:w14="http://schemas.microsoft.com/office/word/2010/wordml" xmlns:w="http://schemas.openxmlformats.org/wordprocessingml/2006/main" xmlns:wne="http://schemas.microsoft.com/office/word/2006/wordml" xmlns:wp14="http://schemas.microsoft.com/office/word/2010/wordprocessingDrawing" xmlns:wp="http://schemas.openxmlformats.org/drawingml/2006/wordprocessingDrawing" xmlns:wpc="http://schemas.microsoft.com/office/word/2010/wordprocessingCanvas" xmlns:wpg="http://schemas.microsoft.com/office/word/2010/wordprocessingGroup" xmlns:wpi="http://schemas.microsoft.com/office/word/2010/wordprocessingInk" xmlns:wps="http://schemas.microsoft.com/office/word/2010/wordprocessingShape" mc:Ignorable="w14 wp14">
-  <w:p>
-    <w:pPr>
-      <w:pStyle w:val="Header"/>
-      <w:jc w:val="right"/>
-    </w:pPr>
-    <w:r>
-      <w:drawing>
-        <wp:inline xmlns:a="http://schemas.openxmlformats.org/drawingml/2006/main" xmlns:pic="http://schemas.openxmlformats.org/drawingml/2006/picture">
-          <wp:extent cx="1152000" cy="332800"/>
-          <wp:docPr id="1" name="Picture 1"/>
-          <wp:cNvGraphicFramePr>
-            <a:graphicFrameLocks noChangeAspect="1"/>
-          </wp:cNvGraphicFramePr>
-          <a:graphic>
-            <a:graphicData uri="http://schemas.openxmlformats.org/drawingml/2006/picture">
-              <pic:pic>
-                <pic:nvPicPr>
-                  <pic:cNvPr id="0" name="ngtu_logo.png"/>
-                  <pic:cNvPicPr/>
-                </pic:nvPicPr>
-                <pic:blipFill>
-                  <a:blip r:embed="rId1"/>
-                  <a:stretch>
-                    <a:fillRect/>
-                  </a:stretch>
-                </pic:blipFill>
-                <pic:spPr>
-                  <a:xfrm>
-                    <a:off x="0" y="0"/>
-                    <a:ext cx="1152000" cy="332800"/>
-                  </a:xfrm>
-                  <a:prstGeom prst="rect"/>
-                </pic:spPr>
-              </pic:pic>
-            </a:graphicData>
-          </a:graphic>
-        </wp:inline>
-      </w:drawing>
-    </w:r>
-  </w:p>
-</w:hdr>
 </file>
 
 <file path=word/numbering.xml><?xml version="1.0" encoding="utf-8"?>

</xml_diff>